<commit_message>
feat: Cesta pokladu replaces Cesta zlata, unify half-elf willpower rule
- Cesta zlata was removed from the rules; static talent data, cart
  bargaining and toasts now use Cesta pokladu (kupec-cesta-pokladu) and
  existing characters are migrated on load.
- Half-elf Duševní síla follows Průvodce hráče everywhere: only the first
  spent willpower point counts as two (bargaining, talent actions).
- Synced the latest talents DOCX from Google Drive.

Co-Authored-By: Claude Opus 5.5 <noreply@anthropic.com>
</commit_message>
<xml_diff>
--- a/zz-denik/import_files/UpdatedGeneralTalentFormatted (2).docx
+++ b/zz-denik/import_files/UpdatedGeneralTalentFormatted (2).docx
@@ -67,6 +67,7 @@
         <w:rPr>
           <w:rFonts w:ascii="Calibri" w:cs="Calibri" w:eastAsia="Calibri" w:hAnsi="Calibri"/>
           <w:i w:val="1"/>
+          <w:iCs w:val="1"/>
           <w:sz w:val="20"/>
           <w:szCs w:val="20"/>
           <w:rtl w:val="0"/>
@@ -186,6 +187,7 @@
         <w:rPr>
           <w:rFonts w:ascii="Calibri" w:cs="Calibri" w:eastAsia="Calibri" w:hAnsi="Calibri"/>
           <w:i w:val="1"/>
+          <w:iCs w:val="1"/>
           <w:sz w:val="20"/>
           <w:szCs w:val="20"/>
           <w:rtl w:val="0"/>
@@ -205,6 +207,7 @@
         <w:rPr>
           <w:rFonts w:ascii="Calibri" w:cs="Calibri" w:eastAsia="Calibri" w:hAnsi="Calibri"/>
           <w:i w:val="1"/>
+          <w:iCs w:val="1"/>
           <w:sz w:val="20"/>
           <w:szCs w:val="20"/>
           <w:rtl w:val="0"/>
@@ -302,6 +305,7 @@
       <w:r>
         <w:rPr>
           <w:i w:val="1"/>
+          <w:iCs w:val="1"/>
           <w:sz w:val="20"/>
           <w:szCs w:val="20"/>
           <w:rtl w:val="0"/>
@@ -319,6 +323,7 @@
       <w:r>
         <w:rPr>
           <w:i w:val="1"/>
+          <w:iCs w:val="1"/>
           <w:sz w:val="20"/>
           <w:szCs w:val="20"/>
           <w:rtl w:val="0"/>
@@ -358,6 +363,7 @@
       <w:r>
         <w:rPr>
           <w:i w:val="1"/>
+          <w:iCs w:val="1"/>
           <w:sz w:val="20"/>
           <w:szCs w:val="20"/>
           <w:rtl w:val="0"/>
@@ -479,6 +485,7 @@
       <w:r>
         <w:rPr>
           <w:i w:val="1"/>
+          <w:iCs w:val="1"/>
           <w:sz w:val="20"/>
           <w:szCs w:val="20"/>
           <w:highlight w:val="yellow"/>
@@ -498,6 +505,7 @@
       <w:r>
         <w:rPr>
           <w:i w:val="1"/>
+          <w:iCs w:val="1"/>
           <w:sz w:val="20"/>
           <w:szCs w:val="20"/>
           <w:highlight w:val="yellow"/>
@@ -646,7 +654,7 @@
       <w:pPr>
         <w:numPr>
           <w:ilvl w:val="0"/>
-          <w:numId w:val="93"/>
+          <w:numId w:val="92"/>
         </w:numPr>
         <w:pBdr>
           <w:top w:space="0" w:sz="0" w:val="nil"/>
@@ -679,7 +687,7 @@
       <w:pPr>
         <w:numPr>
           <w:ilvl w:val="0"/>
-          <w:numId w:val="93"/>
+          <w:numId w:val="92"/>
         </w:numPr>
         <w:pBdr>
           <w:top w:space="0" w:sz="0" w:val="nil"/>
@@ -712,7 +720,7 @@
       <w:pPr>
         <w:numPr>
           <w:ilvl w:val="0"/>
-          <w:numId w:val="93"/>
+          <w:numId w:val="92"/>
         </w:numPr>
         <w:pBdr>
           <w:top w:space="0" w:sz="0" w:val="nil"/>
@@ -744,6 +752,7 @@
         <w:rPr>
           <w:rFonts w:ascii="Calibri" w:cs="Calibri" w:eastAsia="Calibri" w:hAnsi="Calibri"/>
           <w:i w:val="1"/>
+          <w:iCs w:val="1"/>
           <w:color w:val="000000"/>
           <w:sz w:val="20"/>
           <w:szCs w:val="20"/>
@@ -766,7 +775,7 @@
       <w:pPr>
         <w:numPr>
           <w:ilvl w:val="0"/>
-          <w:numId w:val="93"/>
+          <w:numId w:val="92"/>
         </w:numPr>
         <w:pBdr>
           <w:top w:space="0" w:sz="0" w:val="nil"/>
@@ -787,6 +796,7 @@
         <w:rPr>
           <w:rFonts w:ascii="Calibri" w:cs="Calibri" w:eastAsia="Calibri" w:hAnsi="Calibri"/>
           <w:i w:val="1"/>
+          <w:iCs w:val="1"/>
           <w:color w:val="000000"/>
           <w:sz w:val="20"/>
           <w:szCs w:val="20"/>
@@ -878,6 +888,7 @@
         <w:rPr>
           <w:rFonts w:ascii="Calibri" w:cs="Calibri" w:eastAsia="Calibri" w:hAnsi="Calibri"/>
           <w:i w:val="1"/>
+          <w:iCs w:val="1"/>
           <w:color w:val="000000"/>
           <w:sz w:val="20"/>
           <w:szCs w:val="20"/>
@@ -899,6 +910,7 @@
         <w:rPr>
           <w:rFonts w:ascii="Calibri" w:cs="Calibri" w:eastAsia="Calibri" w:hAnsi="Calibri"/>
           <w:i w:val="1"/>
+          <w:iCs w:val="1"/>
           <w:color w:val="000000"/>
           <w:sz w:val="20"/>
           <w:szCs w:val="20"/>
@@ -953,6 +965,7 @@
         <w:rPr>
           <w:rFonts w:ascii="Calibri" w:cs="Calibri" w:eastAsia="Calibri" w:hAnsi="Calibri"/>
           <w:i w:val="1"/>
+          <w:iCs w:val="1"/>
           <w:color w:val="000000"/>
           <w:sz w:val="20"/>
           <w:szCs w:val="20"/>
@@ -974,6 +987,7 @@
         <w:rPr>
           <w:rFonts w:ascii="Calibri" w:cs="Calibri" w:eastAsia="Calibri" w:hAnsi="Calibri"/>
           <w:i w:val="1"/>
+          <w:iCs w:val="1"/>
           <w:color w:val="000000"/>
           <w:sz w:val="20"/>
           <w:szCs w:val="20"/>
@@ -1022,6 +1036,7 @@
         <w:rPr>
           <w:rFonts w:ascii="Calibri" w:cs="Calibri" w:eastAsia="Calibri" w:hAnsi="Calibri"/>
           <w:i w:val="1"/>
+          <w:iCs w:val="1"/>
           <w:color w:val="000000"/>
           <w:sz w:val="20"/>
           <w:szCs w:val="20"/>
@@ -1113,6 +1128,7 @@
         <w:rPr>
           <w:rFonts w:ascii="Calibri" w:cs="Calibri" w:eastAsia="Calibri" w:hAnsi="Calibri"/>
           <w:i w:val="1"/>
+          <w:iCs w:val="1"/>
           <w:color w:val="000000"/>
           <w:sz w:val="20"/>
           <w:szCs w:val="20"/>
@@ -1134,6 +1150,7 @@
         <w:rPr>
           <w:rFonts w:ascii="Calibri" w:cs="Calibri" w:eastAsia="Calibri" w:hAnsi="Calibri"/>
           <w:i w:val="1"/>
+          <w:iCs w:val="1"/>
           <w:color w:val="000000"/>
           <w:sz w:val="20"/>
           <w:szCs w:val="20"/>
@@ -1188,6 +1205,7 @@
         <w:rPr>
           <w:rFonts w:ascii="Calibri" w:cs="Calibri" w:eastAsia="Calibri" w:hAnsi="Calibri"/>
           <w:i w:val="1"/>
+          <w:iCs w:val="1"/>
           <w:color w:val="000000"/>
           <w:sz w:val="20"/>
           <w:szCs w:val="20"/>
@@ -1521,6 +1539,30 @@
     </w:p>
     <w:p>
       <w:pPr>
+        <w:pBdr>
+          <w:top w:space="0" w:sz="0" w:val="nil"/>
+          <w:left w:space="0" w:sz="0" w:val="nil"/>
+          <w:bottom w:space="0" w:sz="0" w:val="nil"/>
+          <w:right w:space="0" w:sz="0" w:val="nil"/>
+          <w:between w:space="0" w:sz="0" w:val="nil"/>
+        </w:pBdr>
+        <w:jc w:val="center"/>
+        <w:rPr>
+          <w:sz w:val="20"/>
+          <w:szCs w:val="20"/>
+        </w:rPr>
+      </w:pPr>
+      <w:r>
+        <w:rPr>
+          <w:sz w:val="20"/>
+          <w:szCs w:val="20"/>
+          <w:rtl w:val="0"/>
+        </w:rPr>
+        <w:t xml:space="preserve">Dungeon delver</w:t>
+      </w:r>
+    </w:p>
+    <w:p>
+      <w:pPr>
         <w:ind w:left="360" w:firstLine="0"/>
         <w:jc w:val="center"/>
         <w:rPr>
@@ -1616,6 +1658,7 @@
         <w:rPr>
           <w:rFonts w:ascii="Calibri" w:cs="Calibri" w:eastAsia="Calibri" w:hAnsi="Calibri"/>
           <w:i w:val="1"/>
+          <w:iCs w:val="1"/>
           <w:color w:val="000000"/>
           <w:sz w:val="20"/>
           <w:szCs w:val="20"/>
@@ -1754,6 +1797,7 @@
         <w:rPr>
           <w:rFonts w:ascii="Calibri" w:cs="Calibri" w:eastAsia="Calibri" w:hAnsi="Calibri"/>
           <w:i w:val="1"/>
+          <w:iCs w:val="1"/>
           <w:sz w:val="20"/>
           <w:szCs w:val="20"/>
           <w:rtl w:val="0"/>
@@ -1865,6 +1909,7 @@
         <w:rPr>
           <w:rFonts w:ascii="Calibri" w:cs="Calibri" w:eastAsia="Calibri" w:hAnsi="Calibri"/>
           <w:i w:val="1"/>
+          <w:iCs w:val="1"/>
           <w:color w:val="000000"/>
           <w:sz w:val="20"/>
           <w:szCs w:val="20"/>
@@ -1919,6 +1964,7 @@
         <w:rPr>
           <w:rFonts w:ascii="Calibri" w:cs="Calibri" w:eastAsia="Calibri" w:hAnsi="Calibri"/>
           <w:i w:val="1"/>
+          <w:iCs w:val="1"/>
           <w:color w:val="000000"/>
           <w:sz w:val="20"/>
           <w:szCs w:val="20"/>
@@ -1972,6 +2018,7 @@
         <w:rPr>
           <w:rFonts w:ascii="Calibri" w:cs="Calibri" w:eastAsia="Calibri" w:hAnsi="Calibri"/>
           <w:i w:val="1"/>
+          <w:iCs w:val="1"/>
           <w:color w:val="000000"/>
           <w:sz w:val="20"/>
           <w:szCs w:val="20"/>
@@ -2065,6 +2112,7 @@
         <w:rPr>
           <w:rFonts w:ascii="Calibri" w:cs="Calibri" w:eastAsia="Calibri" w:hAnsi="Calibri"/>
           <w:i w:val="1"/>
+          <w:iCs w:val="1"/>
           <w:color w:val="000000"/>
           <w:sz w:val="20"/>
           <w:szCs w:val="20"/>
@@ -2152,6 +2200,7 @@
         <w:rPr>
           <w:rFonts w:ascii="Calibri" w:cs="Calibri" w:eastAsia="Calibri" w:hAnsi="Calibri"/>
           <w:i w:val="1"/>
+          <w:iCs w:val="1"/>
           <w:color w:val="000000"/>
           <w:sz w:val="20"/>
           <w:szCs w:val="20"/>
@@ -2206,6 +2255,7 @@
         <w:rPr>
           <w:rFonts w:ascii="Calibri" w:cs="Calibri" w:eastAsia="Calibri" w:hAnsi="Calibri"/>
           <w:i w:val="1"/>
+          <w:iCs w:val="1"/>
           <w:color w:val="000000"/>
           <w:sz w:val="20"/>
           <w:szCs w:val="20"/>
@@ -2227,6 +2277,7 @@
         <w:rPr>
           <w:rFonts w:ascii="Calibri" w:cs="Calibri" w:eastAsia="Calibri" w:hAnsi="Calibri"/>
           <w:i w:val="1"/>
+          <w:iCs w:val="1"/>
           <w:color w:val="000000"/>
           <w:sz w:val="20"/>
           <w:szCs w:val="20"/>
@@ -2248,6 +2299,7 @@
         <w:rPr>
           <w:rFonts w:ascii="Calibri" w:cs="Calibri" w:eastAsia="Calibri" w:hAnsi="Calibri"/>
           <w:i w:val="1"/>
+          <w:iCs w:val="1"/>
           <w:color w:val="000000"/>
           <w:sz w:val="20"/>
           <w:szCs w:val="20"/>
@@ -2335,7 +2387,9 @@
         <w:rPr>
           <w:rFonts w:ascii="Calibri" w:cs="Calibri" w:eastAsia="Calibri" w:hAnsi="Calibri"/>
           <w:b w:val="0"/>
+          <w:bCs w:val="0"/>
           <w:i w:val="0"/>
+          <w:iCs w:val="0"/>
           <w:smallCaps w:val="0"/>
           <w:strike w:val="0"/>
           <w:color w:val="000000"/>
@@ -2350,7 +2404,9 @@
         <w:rPr>
           <w:rFonts w:ascii="Calibri" w:cs="Calibri" w:eastAsia="Calibri" w:hAnsi="Calibri"/>
           <w:b w:val="0"/>
+          <w:bCs w:val="0"/>
           <w:i w:val="0"/>
+          <w:iCs w:val="0"/>
           <w:smallCaps w:val="0"/>
           <w:strike w:val="0"/>
           <w:color w:val="000000"/>
@@ -2367,7 +2423,9 @@
         <w:rPr>
           <w:rFonts w:ascii="Quattrocento Sans" w:cs="Quattrocento Sans" w:eastAsia="Quattrocento Sans" w:hAnsi="Quattrocento Sans"/>
           <w:b w:val="0"/>
+          <w:bCs w:val="0"/>
           <w:i w:val="0"/>
+          <w:iCs w:val="0"/>
           <w:smallCaps w:val="0"/>
           <w:strike w:val="0"/>
           <w:color w:val="000000"/>
@@ -2384,7 +2442,9 @@
         <w:rPr>
           <w:rFonts w:ascii="Calibri" w:cs="Calibri" w:eastAsia="Calibri" w:hAnsi="Calibri"/>
           <w:b w:val="0"/>
+          <w:bCs w:val="0"/>
           <w:i w:val="0"/>
+          <w:iCs w:val="0"/>
           <w:smallCaps w:val="0"/>
           <w:strike w:val="0"/>
           <w:color w:val="000000"/>
@@ -2422,7 +2482,9 @@
         <w:rPr>
           <w:rFonts w:ascii="Calibri" w:cs="Calibri" w:eastAsia="Calibri" w:hAnsi="Calibri"/>
           <w:b w:val="0"/>
+          <w:bCs w:val="0"/>
           <w:i w:val="0"/>
+          <w:iCs w:val="0"/>
           <w:smallCaps w:val="0"/>
           <w:strike w:val="0"/>
           <w:color w:val="000000"/>
@@ -2437,7 +2499,9 @@
         <w:rPr>
           <w:rFonts w:ascii="Calibri" w:cs="Calibri" w:eastAsia="Calibri" w:hAnsi="Calibri"/>
           <w:b w:val="0"/>
+          <w:bCs w:val="0"/>
           <w:i w:val="0"/>
+          <w:iCs w:val="0"/>
           <w:smallCaps w:val="0"/>
           <w:strike w:val="0"/>
           <w:color w:val="000000"/>
@@ -2475,7 +2539,9 @@
         <w:rPr>
           <w:rFonts w:ascii="Calibri" w:cs="Calibri" w:eastAsia="Calibri" w:hAnsi="Calibri"/>
           <w:b w:val="0"/>
+          <w:bCs w:val="0"/>
           <w:i w:val="0"/>
+          <w:iCs w:val="0"/>
           <w:smallCaps w:val="0"/>
           <w:strike w:val="0"/>
           <w:color w:val="000000"/>
@@ -2490,7 +2556,9 @@
         <w:rPr>
           <w:rFonts w:ascii="Calibri" w:cs="Calibri" w:eastAsia="Calibri" w:hAnsi="Calibri"/>
           <w:b w:val="0"/>
+          <w:bCs w:val="0"/>
           <w:i w:val="0"/>
+          <w:iCs w:val="0"/>
           <w:smallCaps w:val="0"/>
           <w:strike w:val="0"/>
           <w:color w:val="000000"/>
@@ -2563,7 +2631,9 @@
         <w:rPr>
           <w:rFonts w:ascii="Calibri" w:cs="Calibri" w:eastAsia="Calibri" w:hAnsi="Calibri"/>
           <w:b w:val="0"/>
+          <w:bCs w:val="0"/>
           <w:i w:val="0"/>
+          <w:iCs w:val="0"/>
           <w:smallCaps w:val="0"/>
           <w:strike w:val="0"/>
           <w:color w:val="000000"/>
@@ -2578,7 +2648,9 @@
         <w:rPr>
           <w:rFonts w:ascii="Calibri" w:cs="Calibri" w:eastAsia="Calibri" w:hAnsi="Calibri"/>
           <w:b w:val="0"/>
+          <w:bCs w:val="0"/>
           <w:i w:val="0"/>
+          <w:iCs w:val="0"/>
           <w:smallCaps w:val="0"/>
           <w:strike w:val="0"/>
           <w:color w:val="000000"/>
@@ -2594,6 +2666,7 @@
       <w:r>
         <w:rPr>
           <w:i w:val="1"/>
+          <w:iCs w:val="1"/>
           <w:sz w:val="20"/>
           <w:szCs w:val="20"/>
           <w:rtl w:val="0"/>
@@ -2604,7 +2677,9 @@
         <w:rPr>
           <w:rFonts w:ascii="Calibri" w:cs="Calibri" w:eastAsia="Calibri" w:hAnsi="Calibri"/>
           <w:b w:val="0"/>
+          <w:bCs w:val="0"/>
           <w:i w:val="0"/>
+          <w:iCs w:val="0"/>
           <w:smallCaps w:val="0"/>
           <w:strike w:val="0"/>
           <w:color w:val="000000"/>
@@ -2642,7 +2717,9 @@
         <w:rPr>
           <w:rFonts w:ascii="Calibri" w:cs="Calibri" w:eastAsia="Calibri" w:hAnsi="Calibri"/>
           <w:b w:val="0"/>
+          <w:bCs w:val="0"/>
           <w:i w:val="0"/>
+          <w:iCs w:val="0"/>
           <w:smallCaps w:val="0"/>
           <w:strike w:val="0"/>
           <w:color w:val="000000"/>
@@ -2657,7 +2734,9 @@
         <w:rPr>
           <w:rFonts w:ascii="Calibri" w:cs="Calibri" w:eastAsia="Calibri" w:hAnsi="Calibri"/>
           <w:b w:val="0"/>
+          <w:bCs w:val="0"/>
           <w:i w:val="0"/>
+          <w:iCs w:val="0"/>
           <w:smallCaps w:val="0"/>
           <w:strike w:val="0"/>
           <w:color w:val="000000"/>
@@ -2695,7 +2774,9 @@
         <w:rPr>
           <w:rFonts w:ascii="Calibri" w:cs="Calibri" w:eastAsia="Calibri" w:hAnsi="Calibri"/>
           <w:b w:val="0"/>
+          <w:bCs w:val="0"/>
           <w:i w:val="0"/>
+          <w:iCs w:val="0"/>
           <w:smallCaps w:val="0"/>
           <w:strike w:val="0"/>
           <w:color w:val="000000"/>
@@ -2710,7 +2791,9 @@
         <w:rPr>
           <w:rFonts w:ascii="Calibri" w:cs="Calibri" w:eastAsia="Calibri" w:hAnsi="Calibri"/>
           <w:b w:val="0"/>
+          <w:bCs w:val="0"/>
           <w:i w:val="0"/>
+          <w:iCs w:val="0"/>
           <w:smallCaps w:val="0"/>
           <w:strike w:val="0"/>
           <w:color w:val="000000"/>
@@ -2766,6 +2849,7 @@
         <w:rPr>
           <w:rFonts w:ascii="Calibri" w:cs="Calibri" w:eastAsia="Calibri" w:hAnsi="Calibri"/>
           <w:i w:val="1"/>
+          <w:iCs w:val="1"/>
           <w:sz w:val="20"/>
           <w:szCs w:val="20"/>
           <w:rtl w:val="0"/>
@@ -3045,6 +3129,7 @@
         <w:rPr>
           <w:rFonts w:ascii="Calibri" w:cs="Calibri" w:eastAsia="Calibri" w:hAnsi="Calibri"/>
           <w:i w:val="1"/>
+          <w:iCs w:val="1"/>
           <w:color w:val="000000"/>
           <w:sz w:val="20"/>
           <w:szCs w:val="20"/>
@@ -3066,6 +3151,7 @@
         <w:rPr>
           <w:rFonts w:ascii="Calibri" w:cs="Calibri" w:eastAsia="Calibri" w:hAnsi="Calibri"/>
           <w:i w:val="1"/>
+          <w:iCs w:val="1"/>
           <w:color w:val="000000"/>
           <w:sz w:val="20"/>
           <w:szCs w:val="20"/>
@@ -3152,6 +3238,7 @@
         <w:rPr>
           <w:rFonts w:ascii="Calibri" w:cs="Calibri" w:eastAsia="Calibri" w:hAnsi="Calibri"/>
           <w:i w:val="1"/>
+          <w:iCs w:val="1"/>
           <w:color w:val="000000"/>
           <w:sz w:val="20"/>
           <w:szCs w:val="20"/>
@@ -3410,7 +3497,9 @@
         <w:rPr>
           <w:rFonts w:ascii="Calibri" w:cs="Calibri" w:eastAsia="Calibri" w:hAnsi="Calibri"/>
           <w:b w:val="0"/>
+          <w:bCs w:val="0"/>
           <w:i w:val="0"/>
+          <w:iCs w:val="0"/>
           <w:smallCaps w:val="0"/>
           <w:strike w:val="0"/>
           <w:color w:val="000000"/>
@@ -3425,7 +3514,9 @@
         <w:rPr>
           <w:rFonts w:ascii="Calibri" w:cs="Calibri" w:eastAsia="Calibri" w:hAnsi="Calibri"/>
           <w:b w:val="0"/>
+          <w:bCs w:val="0"/>
           <w:i w:val="0"/>
+          <w:iCs w:val="0"/>
           <w:smallCaps w:val="0"/>
           <w:strike w:val="0"/>
           <w:color w:val="000000"/>
@@ -3514,6 +3605,7 @@
         <w:rPr>
           <w:rFonts w:ascii="Calibri" w:cs="Calibri" w:eastAsia="Calibri" w:hAnsi="Calibri"/>
           <w:i w:val="1"/>
+          <w:iCs w:val="1"/>
           <w:color w:val="000000"/>
           <w:sz w:val="20"/>
           <w:szCs w:val="20"/>
@@ -3535,6 +3627,7 @@
         <w:rPr>
           <w:rFonts w:ascii="Calibri" w:cs="Calibri" w:eastAsia="Calibri" w:hAnsi="Calibri"/>
           <w:i w:val="1"/>
+          <w:iCs w:val="1"/>
           <w:color w:val="000000"/>
           <w:sz w:val="20"/>
           <w:szCs w:val="20"/>
@@ -3584,6 +3677,7 @@
         <w:rPr>
           <w:rFonts w:ascii="Calibri" w:cs="Calibri" w:eastAsia="Calibri" w:hAnsi="Calibri"/>
           <w:i w:val="1"/>
+          <w:iCs w:val="1"/>
           <w:color w:val="000000"/>
           <w:sz w:val="20"/>
           <w:szCs w:val="20"/>
@@ -3637,6 +3731,7 @@
         <w:rPr>
           <w:rFonts w:ascii="Calibri" w:cs="Calibri" w:eastAsia="Calibri" w:hAnsi="Calibri"/>
           <w:i w:val="1"/>
+          <w:iCs w:val="1"/>
           <w:color w:val="000000"/>
           <w:sz w:val="20"/>
           <w:szCs w:val="20"/>
@@ -3728,6 +3823,7 @@
         <w:rPr>
           <w:rFonts w:ascii="Calibri" w:cs="Calibri" w:eastAsia="Calibri" w:hAnsi="Calibri"/>
           <w:i w:val="1"/>
+          <w:iCs w:val="1"/>
           <w:color w:val="000000"/>
           <w:sz w:val="20"/>
           <w:szCs w:val="20"/>
@@ -3957,6 +4053,7 @@
         <w:rPr>
           <w:rFonts w:ascii="Calibri" w:cs="Calibri" w:eastAsia="Calibri" w:hAnsi="Calibri"/>
           <w:i w:val="1"/>
+          <w:iCs w:val="1"/>
           <w:color w:val="000000"/>
           <w:sz w:val="20"/>
           <w:szCs w:val="20"/>
@@ -4106,6 +4203,7 @@
         <w:rPr>
           <w:rFonts w:ascii="Calibri" w:cs="Calibri" w:eastAsia="Calibri" w:hAnsi="Calibri"/>
           <w:b w:val="1"/>
+          <w:bCs w:val="1"/>
           <w:color w:val="000000"/>
           <w:sz w:val="20"/>
           <w:szCs w:val="20"/>
@@ -4197,6 +4295,7 @@
         <w:rPr>
           <w:rFonts w:ascii="Calibri" w:cs="Calibri" w:eastAsia="Calibri" w:hAnsi="Calibri"/>
           <w:i w:val="1"/>
+          <w:iCs w:val="1"/>
           <w:color w:val="000000"/>
           <w:sz w:val="20"/>
           <w:szCs w:val="20"/>
@@ -4251,6 +4350,7 @@
         <w:rPr>
           <w:rFonts w:ascii="Calibri" w:cs="Calibri" w:eastAsia="Calibri" w:hAnsi="Calibri"/>
           <w:i w:val="1"/>
+          <w:iCs w:val="1"/>
           <w:color w:val="000000"/>
           <w:sz w:val="20"/>
           <w:szCs w:val="20"/>
@@ -4304,6 +4404,7 @@
         <w:rPr>
           <w:rFonts w:ascii="Calibri" w:cs="Calibri" w:eastAsia="Calibri" w:hAnsi="Calibri"/>
           <w:i w:val="1"/>
+          <w:iCs w:val="1"/>
           <w:color w:val="000000"/>
           <w:sz w:val="20"/>
           <w:szCs w:val="20"/>
@@ -4395,6 +4496,7 @@
         <w:rPr>
           <w:rFonts w:ascii="Calibri" w:cs="Calibri" w:eastAsia="Calibri" w:hAnsi="Calibri"/>
           <w:b w:val="1"/>
+          <w:bCs w:val="1"/>
           <w:color w:val="000000"/>
           <w:sz w:val="20"/>
           <w:szCs w:val="20"/>
@@ -4555,6 +4657,7 @@
         <w:rPr>
           <w:rFonts w:ascii="Calibri" w:cs="Calibri" w:eastAsia="Calibri" w:hAnsi="Calibri"/>
           <w:i w:val="1"/>
+          <w:iCs w:val="1"/>
           <w:color w:val="000000"/>
           <w:sz w:val="20"/>
           <w:szCs w:val="20"/>
@@ -4609,6 +4712,7 @@
         <w:rPr>
           <w:rFonts w:ascii="Calibri" w:cs="Calibri" w:eastAsia="Calibri" w:hAnsi="Calibri"/>
           <w:i w:val="1"/>
+          <w:iCs w:val="1"/>
           <w:color w:val="000000"/>
           <w:sz w:val="20"/>
           <w:szCs w:val="20"/>
@@ -4630,6 +4734,7 @@
         <w:rPr>
           <w:rFonts w:ascii="Calibri" w:cs="Calibri" w:eastAsia="Calibri" w:hAnsi="Calibri"/>
           <w:i w:val="1"/>
+          <w:iCs w:val="1"/>
           <w:color w:val="000000"/>
           <w:sz w:val="20"/>
           <w:szCs w:val="20"/>
@@ -4720,6 +4825,7 @@
         <w:rPr>
           <w:rFonts w:ascii="Calibri" w:cs="Calibri" w:eastAsia="Calibri" w:hAnsi="Calibri"/>
           <w:i w:val="1"/>
+          <w:iCs w:val="1"/>
           <w:sz w:val="20"/>
           <w:szCs w:val="20"/>
           <w:rtl w:val="0"/>
@@ -4772,6 +4878,7 @@
         <w:rPr>
           <w:rFonts w:ascii="Calibri" w:cs="Calibri" w:eastAsia="Calibri" w:hAnsi="Calibri"/>
           <w:i w:val="1"/>
+          <w:iCs w:val="1"/>
           <w:color w:val="000000"/>
           <w:sz w:val="20"/>
           <w:szCs w:val="20"/>
@@ -4846,6 +4953,7 @@
         <w:rPr>
           <w:rFonts w:ascii="Calibri" w:cs="Calibri" w:eastAsia="Calibri" w:hAnsi="Calibri"/>
           <w:i w:val="1"/>
+          <w:iCs w:val="1"/>
           <w:color w:val="000000"/>
           <w:sz w:val="20"/>
           <w:szCs w:val="20"/>
@@ -4964,6 +5072,7 @@
         <w:rPr>
           <w:rFonts w:ascii="Calibri" w:cs="Calibri" w:eastAsia="Calibri" w:hAnsi="Calibri"/>
           <w:i w:val="1"/>
+          <w:iCs w:val="1"/>
           <w:color w:val="000000"/>
           <w:sz w:val="20"/>
           <w:szCs w:val="20"/>
@@ -4985,6 +5094,7 @@
         <w:rPr>
           <w:rFonts w:ascii="Calibri" w:cs="Calibri" w:eastAsia="Calibri" w:hAnsi="Calibri"/>
           <w:i w:val="1"/>
+          <w:iCs w:val="1"/>
           <w:color w:val="000000"/>
           <w:sz w:val="20"/>
           <w:szCs w:val="20"/>
@@ -5006,6 +5116,7 @@
         <w:rPr>
           <w:rFonts w:ascii="Calibri" w:cs="Calibri" w:eastAsia="Calibri" w:hAnsi="Calibri"/>
           <w:i w:val="1"/>
+          <w:iCs w:val="1"/>
           <w:color w:val="000000"/>
           <w:sz w:val="20"/>
           <w:szCs w:val="20"/>
@@ -5129,6 +5240,7 @@
         <w:rPr>
           <w:rFonts w:ascii="Calibri" w:cs="Calibri" w:eastAsia="Calibri" w:hAnsi="Calibri"/>
           <w:i w:val="1"/>
+          <w:iCs w:val="1"/>
           <w:sz w:val="20"/>
           <w:szCs w:val="20"/>
           <w:rtl w:val="0"/>
@@ -5181,6 +5293,7 @@
         <w:rPr>
           <w:rFonts w:ascii="Calibri" w:cs="Calibri" w:eastAsia="Calibri" w:hAnsi="Calibri"/>
           <w:i w:val="1"/>
+          <w:iCs w:val="1"/>
           <w:color w:val="000000"/>
           <w:sz w:val="20"/>
           <w:szCs w:val="20"/>
@@ -5250,6 +5363,7 @@
         <w:rPr>
           <w:rFonts w:ascii="Calibri" w:cs="Calibri" w:eastAsia="Calibri" w:hAnsi="Calibri"/>
           <w:i w:val="1"/>
+          <w:iCs w:val="1"/>
           <w:color w:val="000000"/>
           <w:sz w:val="20"/>
           <w:szCs w:val="20"/>
@@ -5823,6 +5937,7 @@
       <w:r>
         <w:rPr>
           <w:i w:val="1"/>
+          <w:iCs w:val="1"/>
           <w:sz w:val="20"/>
           <w:szCs w:val="20"/>
           <w:rtl w:val="0"/>
@@ -5868,6 +5983,7 @@
       <w:r>
         <w:rPr>
           <w:i w:val="1"/>
+          <w:iCs w:val="1"/>
           <w:sz w:val="20"/>
           <w:szCs w:val="20"/>
           <w:rtl w:val="0"/>
@@ -5953,6 +6069,7 @@
         <w:rPr>
           <w:rFonts w:ascii="Calibri" w:cs="Calibri" w:eastAsia="Calibri" w:hAnsi="Calibri"/>
           <w:i w:val="1"/>
+          <w:iCs w:val="1"/>
           <w:color w:val="000000"/>
           <w:sz w:val="20"/>
           <w:szCs w:val="20"/>
@@ -5974,6 +6091,7 @@
         <w:rPr>
           <w:rFonts w:ascii="Calibri" w:cs="Calibri" w:eastAsia="Calibri" w:hAnsi="Calibri"/>
           <w:i w:val="1"/>
+          <w:iCs w:val="1"/>
           <w:color w:val="000000"/>
           <w:sz w:val="20"/>
           <w:szCs w:val="20"/>
@@ -6028,6 +6146,7 @@
         <w:rPr>
           <w:rFonts w:ascii="Calibri" w:cs="Calibri" w:eastAsia="Calibri" w:hAnsi="Calibri"/>
           <w:i w:val="1"/>
+          <w:iCs w:val="1"/>
           <w:color w:val="000000"/>
           <w:sz w:val="20"/>
           <w:szCs w:val="20"/>
@@ -6049,6 +6168,7 @@
         <w:rPr>
           <w:rFonts w:ascii="Calibri" w:cs="Calibri" w:eastAsia="Calibri" w:hAnsi="Calibri"/>
           <w:i w:val="1"/>
+          <w:iCs w:val="1"/>
           <w:color w:val="000000"/>
           <w:sz w:val="20"/>
           <w:szCs w:val="20"/>
@@ -6097,6 +6217,7 @@
         <w:rPr>
           <w:rFonts w:ascii="Calibri" w:cs="Calibri" w:eastAsia="Calibri" w:hAnsi="Calibri"/>
           <w:i w:val="1"/>
+          <w:iCs w:val="1"/>
           <w:color w:val="000000"/>
           <w:sz w:val="20"/>
           <w:szCs w:val="20"/>
@@ -6328,6 +6449,7 @@
         <w:rPr>
           <w:rFonts w:ascii="Calibri" w:cs="Calibri" w:eastAsia="Calibri" w:hAnsi="Calibri"/>
           <w:i w:val="1"/>
+          <w:iCs w:val="1"/>
           <w:color w:val="000000"/>
           <w:sz w:val="20"/>
           <w:szCs w:val="20"/>
@@ -6382,6 +6504,7 @@
         <w:rPr>
           <w:rFonts w:ascii="Calibri" w:cs="Calibri" w:eastAsia="Calibri" w:hAnsi="Calibri"/>
           <w:i w:val="1"/>
+          <w:iCs w:val="1"/>
           <w:color w:val="000000"/>
           <w:sz w:val="20"/>
           <w:szCs w:val="20"/>
@@ -6424,6 +6547,7 @@
         <w:rPr>
           <w:rFonts w:ascii="Calibri" w:cs="Calibri" w:eastAsia="Calibri" w:hAnsi="Calibri"/>
           <w:i w:val="1"/>
+          <w:iCs w:val="1"/>
           <w:color w:val="000000"/>
           <w:sz w:val="20"/>
           <w:szCs w:val="20"/>
@@ -6553,6 +6677,7 @@
         <w:rPr>
           <w:rFonts w:ascii="Calibri" w:cs="Calibri" w:eastAsia="Calibri" w:hAnsi="Calibri"/>
           <w:i w:val="1"/>
+          <w:iCs w:val="1"/>
           <w:color w:val="000000"/>
           <w:sz w:val="20"/>
           <w:szCs w:val="20"/>
@@ -6602,6 +6727,7 @@
         <w:rPr>
           <w:rFonts w:ascii="Calibri" w:cs="Calibri" w:eastAsia="Calibri" w:hAnsi="Calibri"/>
           <w:i w:val="1"/>
+          <w:iCs w:val="1"/>
           <w:color w:val="000000"/>
           <w:sz w:val="20"/>
           <w:szCs w:val="20"/>
@@ -6650,6 +6776,7 @@
         <w:rPr>
           <w:rFonts w:ascii="Calibri" w:cs="Calibri" w:eastAsia="Calibri" w:hAnsi="Calibri"/>
           <w:i w:val="1"/>
+          <w:iCs w:val="1"/>
           <w:color w:val="000000"/>
           <w:sz w:val="20"/>
           <w:szCs w:val="20"/>
@@ -6904,6 +7031,7 @@
         <w:rPr>
           <w:rFonts w:ascii="Calibri" w:cs="Calibri" w:eastAsia="Calibri" w:hAnsi="Calibri"/>
           <w:i w:val="1"/>
+          <w:iCs w:val="1"/>
           <w:color w:val="000000"/>
           <w:sz w:val="20"/>
           <w:szCs w:val="20"/>
@@ -6925,6 +7053,7 @@
         <w:rPr>
           <w:rFonts w:ascii="Calibri" w:cs="Calibri" w:eastAsia="Calibri" w:hAnsi="Calibri"/>
           <w:i w:val="1"/>
+          <w:iCs w:val="1"/>
           <w:color w:val="000000"/>
           <w:sz w:val="20"/>
           <w:szCs w:val="20"/>
@@ -6979,6 +7108,7 @@
         <w:rPr>
           <w:rFonts w:ascii="Calibri" w:cs="Calibri" w:eastAsia="Calibri" w:hAnsi="Calibri"/>
           <w:i w:val="1"/>
+          <w:iCs w:val="1"/>
           <w:color w:val="000000"/>
           <w:sz w:val="20"/>
           <w:szCs w:val="20"/>
@@ -7000,6 +7130,7 @@
         <w:rPr>
           <w:rFonts w:ascii="Calibri" w:cs="Calibri" w:eastAsia="Calibri" w:hAnsi="Calibri"/>
           <w:i w:val="1"/>
+          <w:iCs w:val="1"/>
           <w:color w:val="000000"/>
           <w:sz w:val="20"/>
           <w:szCs w:val="20"/>
@@ -7038,6 +7169,7 @@
         <w:rPr>
           <w:rFonts w:ascii="Calibri" w:cs="Calibri" w:eastAsia="Calibri" w:hAnsi="Calibri"/>
           <w:i w:val="1"/>
+          <w:iCs w:val="1"/>
           <w:color w:val="000000"/>
           <w:sz w:val="20"/>
           <w:szCs w:val="20"/>
@@ -7557,6 +7689,7 @@
         <w:rPr>
           <w:rFonts w:ascii="Calibri" w:cs="Calibri" w:eastAsia="Calibri" w:hAnsi="Calibri"/>
           <w:i w:val="1"/>
+          <w:iCs w:val="1"/>
           <w:color w:val="000000"/>
           <w:sz w:val="20"/>
           <w:szCs w:val="20"/>
@@ -7578,6 +7711,7 @@
         <w:rPr>
           <w:rFonts w:ascii="Calibri" w:cs="Calibri" w:eastAsia="Calibri" w:hAnsi="Calibri"/>
           <w:i w:val="1"/>
+          <w:iCs w:val="1"/>
           <w:color w:val="000000"/>
           <w:sz w:val="20"/>
           <w:szCs w:val="20"/>
@@ -7632,6 +7766,7 @@
         <w:rPr>
           <w:rFonts w:ascii="Calibri" w:cs="Calibri" w:eastAsia="Calibri" w:hAnsi="Calibri"/>
           <w:i w:val="1"/>
+          <w:iCs w:val="1"/>
           <w:color w:val="000000"/>
           <w:sz w:val="20"/>
           <w:szCs w:val="20"/>
@@ -7681,6 +7816,7 @@
         <w:rPr>
           <w:rFonts w:ascii="Calibri" w:cs="Calibri" w:eastAsia="Calibri" w:hAnsi="Calibri"/>
           <w:i w:val="1"/>
+          <w:iCs w:val="1"/>
           <w:color w:val="000000"/>
           <w:sz w:val="20"/>
           <w:szCs w:val="20"/>
@@ -7804,6 +7940,7 @@
         <w:rPr>
           <w:rFonts w:ascii="Calibri" w:cs="Calibri" w:eastAsia="Calibri" w:hAnsi="Calibri"/>
           <w:i w:val="1"/>
+          <w:iCs w:val="1"/>
           <w:color w:val="000000"/>
           <w:sz w:val="20"/>
           <w:szCs w:val="20"/>
@@ -7825,6 +7962,7 @@
         <w:rPr>
           <w:rFonts w:ascii="Calibri" w:cs="Calibri" w:eastAsia="Calibri" w:hAnsi="Calibri"/>
           <w:i w:val="1"/>
+          <w:iCs w:val="1"/>
           <w:color w:val="000000"/>
           <w:sz w:val="20"/>
           <w:szCs w:val="20"/>
@@ -7911,6 +8049,7 @@
         <w:rPr>
           <w:rFonts w:ascii="Calibri" w:cs="Calibri" w:eastAsia="Calibri" w:hAnsi="Calibri"/>
           <w:i w:val="1"/>
+          <w:iCs w:val="1"/>
           <w:color w:val="000000"/>
           <w:sz w:val="20"/>
           <w:szCs w:val="20"/>
@@ -7932,6 +8071,7 @@
         <w:rPr>
           <w:rFonts w:ascii="Calibri" w:cs="Calibri" w:eastAsia="Calibri" w:hAnsi="Calibri"/>
           <w:i w:val="1"/>
+          <w:iCs w:val="1"/>
           <w:color w:val="000000"/>
           <w:sz w:val="20"/>
           <w:szCs w:val="20"/>
@@ -8023,6 +8163,7 @@
         <w:rPr>
           <w:rFonts w:ascii="Calibri" w:cs="Calibri" w:eastAsia="Calibri" w:hAnsi="Calibri"/>
           <w:i w:val="1"/>
+          <w:iCs w:val="1"/>
           <w:color w:val="000000"/>
           <w:sz w:val="20"/>
           <w:szCs w:val="20"/>
@@ -8077,6 +8218,7 @@
         <w:rPr>
           <w:rFonts w:ascii="Calibri" w:cs="Calibri" w:eastAsia="Calibri" w:hAnsi="Calibri"/>
           <w:i w:val="1"/>
+          <w:iCs w:val="1"/>
           <w:color w:val="000000"/>
           <w:sz w:val="20"/>
           <w:szCs w:val="20"/>
@@ -8127,6 +8269,7 @@
       <w:r>
         <w:rPr>
           <w:i w:val="1"/>
+          <w:iCs w:val="1"/>
           <w:sz w:val="20"/>
           <w:szCs w:val="20"/>
           <w:rtl w:val="0"/>
@@ -8431,6 +8574,7 @@
         <w:rPr>
           <w:rFonts w:ascii="Calibri" w:cs="Calibri" w:eastAsia="Calibri" w:hAnsi="Calibri"/>
           <w:i w:val="1"/>
+          <w:iCs w:val="1"/>
           <w:color w:val="000000"/>
           <w:sz w:val="20"/>
           <w:szCs w:val="20"/>
@@ -8512,6 +8656,7 @@
         <w:rPr>
           <w:rFonts w:ascii="Calibri" w:cs="Calibri" w:eastAsia="Calibri" w:hAnsi="Calibri"/>
           <w:i w:val="1"/>
+          <w:iCs w:val="1"/>
           <w:color w:val="000000"/>
           <w:sz w:val="20"/>
           <w:szCs w:val="20"/>
@@ -8570,6 +8715,7 @@
       <w:r>
         <w:rPr>
           <w:i w:val="1"/>
+          <w:iCs w:val="1"/>
           <w:sz w:val="20"/>
           <w:szCs w:val="20"/>
           <w:highlight w:val="yellow"/>
@@ -8618,6 +8764,7 @@
       <w:r>
         <w:rPr>
           <w:i w:val="1"/>
+          <w:iCs w:val="1"/>
           <w:sz w:val="20"/>
           <w:szCs w:val="20"/>
           <w:highlight w:val="yellow"/>
@@ -8661,6 +8808,7 @@
       <w:r>
         <w:rPr>
           <w:i w:val="1"/>
+          <w:iCs w:val="1"/>
           <w:sz w:val="20"/>
           <w:szCs w:val="20"/>
           <w:highlight w:val="yellow"/>
@@ -8759,6 +8907,7 @@
         <w:rPr>
           <w:rFonts w:ascii="Calibri" w:cs="Calibri" w:eastAsia="Calibri" w:hAnsi="Calibri"/>
           <w:i w:val="1"/>
+          <w:iCs w:val="1"/>
           <w:color w:val="000000"/>
           <w:sz w:val="20"/>
           <w:szCs w:val="20"/>
@@ -8780,6 +8929,7 @@
         <w:rPr>
           <w:rFonts w:ascii="Calibri" w:cs="Calibri" w:eastAsia="Calibri" w:hAnsi="Calibri"/>
           <w:i w:val="1"/>
+          <w:iCs w:val="1"/>
           <w:color w:val="000000"/>
           <w:sz w:val="20"/>
           <w:szCs w:val="20"/>
@@ -9006,6 +9156,7 @@
         <w:rPr>
           <w:rFonts w:ascii="Calibri" w:cs="Calibri" w:eastAsia="Calibri" w:hAnsi="Calibri"/>
           <w:i w:val="1"/>
+          <w:iCs w:val="1"/>
           <w:color w:val="000000"/>
           <w:sz w:val="20"/>
           <w:szCs w:val="20"/>
@@ -9117,7 +9268,9 @@
         <w:rPr>
           <w:rFonts w:ascii="Calibri" w:cs="Calibri" w:eastAsia="Calibri" w:hAnsi="Calibri"/>
           <w:b w:val="0"/>
+          <w:bCs w:val="0"/>
           <w:i w:val="0"/>
+          <w:iCs w:val="0"/>
           <w:smallCaps w:val="0"/>
           <w:strike w:val="0"/>
           <w:color w:val="000000"/>
@@ -9132,7 +9285,9 @@
         <w:rPr>
           <w:rFonts w:ascii="Calibri" w:cs="Calibri" w:eastAsia="Calibri" w:hAnsi="Calibri"/>
           <w:b w:val="0"/>
+          <w:bCs w:val="0"/>
           <w:i w:val="0"/>
+          <w:iCs w:val="0"/>
           <w:smallCaps w:val="0"/>
           <w:strike w:val="0"/>
           <w:color w:val="000000"/>
@@ -9149,7 +9304,9 @@
         <w:rPr>
           <w:rFonts w:ascii="Calibri" w:cs="Calibri" w:eastAsia="Calibri" w:hAnsi="Calibri"/>
           <w:b w:val="0"/>
+          <w:bCs w:val="0"/>
           <w:i w:val="1"/>
+          <w:iCs w:val="1"/>
           <w:smallCaps w:val="0"/>
           <w:strike w:val="0"/>
           <w:color w:val="000000"/>
@@ -9166,7 +9323,9 @@
         <w:rPr>
           <w:rFonts w:ascii="Calibri" w:cs="Calibri" w:eastAsia="Calibri" w:hAnsi="Calibri"/>
           <w:b w:val="0"/>
+          <w:bCs w:val="0"/>
           <w:i w:val="0"/>
+          <w:iCs w:val="0"/>
           <w:smallCaps w:val="0"/>
           <w:strike w:val="0"/>
           <w:color w:val="000000"/>
@@ -9204,7 +9363,9 @@
         <w:rPr>
           <w:rFonts w:ascii="Calibri" w:cs="Calibri" w:eastAsia="Calibri" w:hAnsi="Calibri"/>
           <w:b w:val="0"/>
+          <w:bCs w:val="0"/>
           <w:i w:val="0"/>
+          <w:iCs w:val="0"/>
           <w:smallCaps w:val="0"/>
           <w:strike w:val="0"/>
           <w:color w:val="000000"/>
@@ -9219,7 +9380,9 @@
         <w:rPr>
           <w:rFonts w:ascii="Calibri" w:cs="Calibri" w:eastAsia="Calibri" w:hAnsi="Calibri"/>
           <w:b w:val="0"/>
+          <w:bCs w:val="0"/>
           <w:i w:val="0"/>
+          <w:iCs w:val="0"/>
           <w:smallCaps w:val="0"/>
           <w:strike w:val="0"/>
           <w:color w:val="000000"/>
@@ -9236,7 +9399,9 @@
         <w:rPr>
           <w:rFonts w:ascii="Calibri" w:cs="Calibri" w:eastAsia="Calibri" w:hAnsi="Calibri"/>
           <w:b w:val="0"/>
+          <w:bCs w:val="0"/>
           <w:i w:val="1"/>
+          <w:iCs w:val="1"/>
           <w:smallCaps w:val="0"/>
           <w:strike w:val="0"/>
           <w:color w:val="000000"/>
@@ -9253,7 +9418,9 @@
         <w:rPr>
           <w:rFonts w:ascii="Calibri" w:cs="Calibri" w:eastAsia="Calibri" w:hAnsi="Calibri"/>
           <w:b w:val="0"/>
+          <w:bCs w:val="0"/>
           <w:i w:val="0"/>
+          <w:iCs w:val="0"/>
           <w:smallCaps w:val="0"/>
           <w:strike w:val="0"/>
           <w:color w:val="000000"/>
@@ -9270,7 +9437,9 @@
         <w:rPr>
           <w:rFonts w:ascii="Calibri" w:cs="Calibri" w:eastAsia="Calibri" w:hAnsi="Calibri"/>
           <w:b w:val="0"/>
+          <w:bCs w:val="0"/>
           <w:i w:val="1"/>
+          <w:iCs w:val="1"/>
           <w:smallCaps w:val="0"/>
           <w:strike w:val="0"/>
           <w:color w:val="000000"/>
@@ -9287,7 +9456,9 @@
         <w:rPr>
           <w:rFonts w:ascii="Calibri" w:cs="Calibri" w:eastAsia="Calibri" w:hAnsi="Calibri"/>
           <w:b w:val="0"/>
+          <w:bCs w:val="0"/>
           <w:i w:val="0"/>
+          <w:iCs w:val="0"/>
           <w:smallCaps w:val="0"/>
           <w:strike w:val="0"/>
           <w:color w:val="000000"/>
@@ -9330,7 +9501,9 @@
         <w:rPr>
           <w:rFonts w:ascii="Calibri" w:cs="Calibri" w:eastAsia="Calibri" w:hAnsi="Calibri"/>
           <w:b w:val="0"/>
+          <w:bCs w:val="0"/>
           <w:i w:val="0"/>
+          <w:iCs w:val="0"/>
           <w:smallCaps w:val="0"/>
           <w:strike w:val="0"/>
           <w:color w:val="000000"/>
@@ -9345,7 +9518,9 @@
         <w:rPr>
           <w:rFonts w:ascii="Calibri" w:cs="Calibri" w:eastAsia="Calibri" w:hAnsi="Calibri"/>
           <w:b w:val="0"/>
+          <w:bCs w:val="0"/>
           <w:i w:val="0"/>
+          <w:iCs w:val="0"/>
           <w:smallCaps w:val="0"/>
           <w:strike w:val="0"/>
           <w:color w:val="000000"/>
@@ -9399,6 +9574,7 @@
         <w:rPr>
           <w:rFonts w:ascii="Calibri" w:cs="Calibri" w:eastAsia="Calibri" w:hAnsi="Calibri"/>
           <w:i w:val="1"/>
+          <w:iCs w:val="1"/>
           <w:sz w:val="20"/>
           <w:szCs w:val="20"/>
           <w:rtl w:val="0"/>
@@ -9451,6 +9627,7 @@
         <w:rPr>
           <w:rFonts w:ascii="Calibri" w:cs="Calibri" w:eastAsia="Calibri" w:hAnsi="Calibri"/>
           <w:i w:val="1"/>
+          <w:iCs w:val="1"/>
           <w:color w:val="000000"/>
           <w:sz w:val="20"/>
           <w:szCs w:val="20"/>
@@ -9472,6 +9649,7 @@
         <w:rPr>
           <w:rFonts w:ascii="Calibri" w:cs="Calibri" w:eastAsia="Calibri" w:hAnsi="Calibri"/>
           <w:i w:val="1"/>
+          <w:iCs w:val="1"/>
           <w:color w:val="000000"/>
           <w:sz w:val="20"/>
           <w:szCs w:val="20"/>
@@ -9521,6 +9699,7 @@
         <w:rPr>
           <w:rFonts w:ascii="Calibri" w:cs="Calibri" w:eastAsia="Calibri" w:hAnsi="Calibri"/>
           <w:i w:val="1"/>
+          <w:iCs w:val="1"/>
           <w:color w:val="000000"/>
           <w:sz w:val="20"/>
           <w:szCs w:val="20"/>
@@ -9575,6 +9754,7 @@
         <w:rPr>
           <w:rFonts w:ascii="Calibri" w:cs="Calibri" w:eastAsia="Calibri" w:hAnsi="Calibri"/>
           <w:i w:val="1"/>
+          <w:iCs w:val="1"/>
           <w:color w:val="000000"/>
           <w:sz w:val="20"/>
           <w:szCs w:val="20"/>
@@ -9628,6 +9808,7 @@
         <w:rPr>
           <w:rFonts w:ascii="Calibri" w:cs="Calibri" w:eastAsia="Calibri" w:hAnsi="Calibri"/>
           <w:i w:val="1"/>
+          <w:iCs w:val="1"/>
           <w:color w:val="000000"/>
           <w:sz w:val="20"/>
           <w:szCs w:val="20"/>
@@ -9714,6 +9895,7 @@
         <w:rPr>
           <w:rFonts w:ascii="Calibri" w:cs="Calibri" w:eastAsia="Calibri" w:hAnsi="Calibri"/>
           <w:i w:val="1"/>
+          <w:iCs w:val="1"/>
           <w:color w:val="000000"/>
           <w:sz w:val="20"/>
           <w:szCs w:val="20"/>
@@ -9768,6 +9950,7 @@
         <w:rPr>
           <w:rFonts w:ascii="Calibri" w:cs="Calibri" w:eastAsia="Calibri" w:hAnsi="Calibri"/>
           <w:i w:val="1"/>
+          <w:iCs w:val="1"/>
           <w:color w:val="000000"/>
           <w:sz w:val="20"/>
           <w:szCs w:val="20"/>
@@ -9821,6 +10004,7 @@
         <w:rPr>
           <w:rFonts w:ascii="Calibri" w:cs="Calibri" w:eastAsia="Calibri" w:hAnsi="Calibri"/>
           <w:i w:val="1"/>
+          <w:iCs w:val="1"/>
           <w:color w:val="000000"/>
           <w:sz w:val="20"/>
           <w:szCs w:val="20"/>
@@ -9874,6 +10058,7 @@
         <w:rPr>
           <w:rFonts w:ascii="Calibri" w:cs="Calibri" w:eastAsia="Calibri" w:hAnsi="Calibri"/>
           <w:i w:val="1"/>
+          <w:iCs w:val="1"/>
           <w:sz w:val="20"/>
           <w:szCs w:val="20"/>
           <w:rtl w:val="0"/>
@@ -9922,6 +10107,7 @@
         <w:rPr>
           <w:rFonts w:ascii="Calibri" w:cs="Calibri" w:eastAsia="Calibri" w:hAnsi="Calibri"/>
           <w:i w:val="1"/>
+          <w:iCs w:val="1"/>
           <w:color w:val="000000"/>
           <w:sz w:val="20"/>
           <w:szCs w:val="20"/>
@@ -9976,6 +10162,7 @@
         <w:rPr>
           <w:rFonts w:ascii="Calibri" w:cs="Calibri" w:eastAsia="Calibri" w:hAnsi="Calibri"/>
           <w:i w:val="1"/>
+          <w:iCs w:val="1"/>
           <w:color w:val="000000"/>
           <w:sz w:val="20"/>
           <w:szCs w:val="20"/>
@@ -10069,7 +10256,9 @@
         <w:rPr>
           <w:rFonts w:ascii="Calibri" w:cs="Calibri" w:eastAsia="Calibri" w:hAnsi="Calibri"/>
           <w:b w:val="0"/>
+          <w:bCs w:val="0"/>
           <w:i w:val="0"/>
+          <w:iCs w:val="0"/>
           <w:smallCaps w:val="0"/>
           <w:strike w:val="0"/>
           <w:color w:val="000000"/>
@@ -10084,7 +10273,9 @@
         <w:rPr>
           <w:rFonts w:ascii="Calibri" w:cs="Calibri" w:eastAsia="Calibri" w:hAnsi="Calibri"/>
           <w:b w:val="0"/>
+          <w:bCs w:val="0"/>
           <w:i w:val="0"/>
+          <w:iCs w:val="0"/>
           <w:smallCaps w:val="0"/>
           <w:strike w:val="0"/>
           <w:color w:val="000000"/>
@@ -10101,7 +10292,9 @@
         <w:rPr>
           <w:rFonts w:ascii="Calibri" w:cs="Calibri" w:eastAsia="Calibri" w:hAnsi="Calibri"/>
           <w:b w:val="0"/>
+          <w:bCs w:val="0"/>
           <w:i w:val="1"/>
+          <w:iCs w:val="1"/>
           <w:smallCaps w:val="0"/>
           <w:strike w:val="0"/>
           <w:color w:val="000000"/>
@@ -10118,7 +10311,9 @@
         <w:rPr>
           <w:rFonts w:ascii="Calibri" w:cs="Calibri" w:eastAsia="Calibri" w:hAnsi="Calibri"/>
           <w:b w:val="0"/>
+          <w:bCs w:val="0"/>
           <w:i w:val="0"/>
+          <w:iCs w:val="0"/>
           <w:smallCaps w:val="0"/>
           <w:strike w:val="0"/>
           <w:color w:val="000000"/>
@@ -10135,7 +10330,9 @@
         <w:rPr>
           <w:rFonts w:ascii="Calibri" w:cs="Calibri" w:eastAsia="Calibri" w:hAnsi="Calibri"/>
           <w:b w:val="0"/>
+          <w:bCs w:val="0"/>
           <w:i w:val="1"/>
+          <w:iCs w:val="1"/>
           <w:smallCaps w:val="0"/>
           <w:strike w:val="0"/>
           <w:color w:val="000000"/>
@@ -10152,7 +10349,9 @@
         <w:rPr>
           <w:rFonts w:ascii="Calibri" w:cs="Calibri" w:eastAsia="Calibri" w:hAnsi="Calibri"/>
           <w:b w:val="0"/>
+          <w:bCs w:val="0"/>
           <w:i w:val="0"/>
+          <w:iCs w:val="0"/>
           <w:smallCaps w:val="0"/>
           <w:strike w:val="0"/>
           <w:color w:val="000000"/>
@@ -10169,7 +10368,9 @@
         <w:rPr>
           <w:rFonts w:ascii="Calibri" w:cs="Calibri" w:eastAsia="Calibri" w:hAnsi="Calibri"/>
           <w:b w:val="0"/>
+          <w:bCs w:val="0"/>
           <w:i w:val="1"/>
+          <w:iCs w:val="1"/>
           <w:smallCaps w:val="0"/>
           <w:strike w:val="0"/>
           <w:color w:val="000000"/>
@@ -10186,7 +10387,9 @@
         <w:rPr>
           <w:rFonts w:ascii="Calibri" w:cs="Calibri" w:eastAsia="Calibri" w:hAnsi="Calibri"/>
           <w:b w:val="0"/>
+          <w:bCs w:val="0"/>
           <w:i w:val="0"/>
+          <w:iCs w:val="0"/>
           <w:smallCaps w:val="0"/>
           <w:strike w:val="0"/>
           <w:color w:val="000000"/>
@@ -10224,7 +10427,9 @@
         <w:rPr>
           <w:rFonts w:ascii="Calibri" w:cs="Calibri" w:eastAsia="Calibri" w:hAnsi="Calibri"/>
           <w:b w:val="0"/>
+          <w:bCs w:val="0"/>
           <w:i w:val="0"/>
+          <w:iCs w:val="0"/>
           <w:smallCaps w:val="0"/>
           <w:strike w:val="0"/>
           <w:color w:val="000000"/>
@@ -10239,7 +10444,9 @@
         <w:rPr>
           <w:rFonts w:ascii="Calibri" w:cs="Calibri" w:eastAsia="Calibri" w:hAnsi="Calibri"/>
           <w:b w:val="0"/>
+          <w:bCs w:val="0"/>
           <w:i w:val="0"/>
+          <w:iCs w:val="0"/>
           <w:smallCaps w:val="0"/>
           <w:strike w:val="0"/>
           <w:color w:val="000000"/>
@@ -10277,7 +10484,9 @@
         <w:rPr>
           <w:rFonts w:ascii="Calibri" w:cs="Calibri" w:eastAsia="Calibri" w:hAnsi="Calibri"/>
           <w:b w:val="0"/>
+          <w:bCs w:val="0"/>
           <w:i w:val="0"/>
+          <w:iCs w:val="0"/>
           <w:smallCaps w:val="0"/>
           <w:strike w:val="0"/>
           <w:color w:val="000000"/>
@@ -10292,7 +10501,9 @@
         <w:rPr>
           <w:rFonts w:ascii="Calibri" w:cs="Calibri" w:eastAsia="Calibri" w:hAnsi="Calibri"/>
           <w:b w:val="0"/>
+          <w:bCs w:val="0"/>
           <w:i w:val="0"/>
+          <w:iCs w:val="0"/>
           <w:smallCaps w:val="0"/>
           <w:strike w:val="0"/>
           <w:color w:val="000000"/>
@@ -10309,7 +10520,9 @@
         <w:rPr>
           <w:rFonts w:ascii="Calibri" w:cs="Calibri" w:eastAsia="Calibri" w:hAnsi="Calibri"/>
           <w:b w:val="0"/>
+          <w:bCs w:val="0"/>
           <w:i w:val="1"/>
+          <w:iCs w:val="1"/>
           <w:smallCaps w:val="0"/>
           <w:strike w:val="0"/>
           <w:color w:val="000000"/>
@@ -10326,7 +10539,9 @@
         <w:rPr>
           <w:rFonts w:ascii="Calibri" w:cs="Calibri" w:eastAsia="Calibri" w:hAnsi="Calibri"/>
           <w:b w:val="0"/>
+          <w:bCs w:val="0"/>
           <w:i w:val="0"/>
+          <w:iCs w:val="0"/>
           <w:smallCaps w:val="0"/>
           <w:strike w:val="0"/>
           <w:color w:val="000000"/>
@@ -10343,7 +10558,9 @@
         <w:rPr>
           <w:rFonts w:ascii="Calibri" w:cs="Calibri" w:eastAsia="Calibri" w:hAnsi="Calibri"/>
           <w:b w:val="0"/>
+          <w:bCs w:val="0"/>
           <w:i w:val="1"/>
+          <w:iCs w:val="1"/>
           <w:smallCaps w:val="0"/>
           <w:strike w:val="0"/>
           <w:color w:val="000000"/>
@@ -10360,7 +10577,9 @@
         <w:rPr>
           <w:rFonts w:ascii="Calibri" w:cs="Calibri" w:eastAsia="Calibri" w:hAnsi="Calibri"/>
           <w:b w:val="0"/>
+          <w:bCs w:val="0"/>
           <w:i w:val="0"/>
+          <w:iCs w:val="0"/>
           <w:smallCaps w:val="0"/>
           <w:strike w:val="0"/>
           <w:color w:val="000000"/>
@@ -10439,6 +10658,7 @@
         <w:rPr>
           <w:rFonts w:ascii="Calibri" w:cs="Calibri" w:eastAsia="Calibri" w:hAnsi="Calibri"/>
           <w:i w:val="1"/>
+          <w:iCs w:val="1"/>
           <w:color w:val="000000"/>
           <w:sz w:val="20"/>
           <w:szCs w:val="20"/>
@@ -10481,7 +10701,9 @@
         <w:rPr>
           <w:rFonts w:ascii="Calibri" w:cs="Calibri" w:eastAsia="Calibri" w:hAnsi="Calibri"/>
           <w:b w:val="0"/>
+          <w:bCs w:val="0"/>
           <w:i w:val="0"/>
+          <w:iCs w:val="0"/>
           <w:smallCaps w:val="0"/>
           <w:strike w:val="0"/>
           <w:color w:val="000000"/>
@@ -10496,7 +10718,9 @@
         <w:rPr>
           <w:rFonts w:ascii="Calibri" w:cs="Calibri" w:eastAsia="Calibri" w:hAnsi="Calibri"/>
           <w:b w:val="0"/>
+          <w:bCs w:val="0"/>
           <w:i w:val="0"/>
+          <w:iCs w:val="0"/>
           <w:smallCaps w:val="0"/>
           <w:strike w:val="0"/>
           <w:color w:val="000000"/>
@@ -10534,7 +10758,9 @@
         <w:rPr>
           <w:rFonts w:ascii="Calibri" w:cs="Calibri" w:eastAsia="Calibri" w:hAnsi="Calibri"/>
           <w:b w:val="0"/>
+          <w:bCs w:val="0"/>
           <w:i w:val="0"/>
+          <w:iCs w:val="0"/>
           <w:smallCaps w:val="0"/>
           <w:strike w:val="0"/>
           <w:color w:val="000000"/>
@@ -10549,7 +10775,9 @@
         <w:rPr>
           <w:rFonts w:ascii="Calibri" w:cs="Calibri" w:eastAsia="Calibri" w:hAnsi="Calibri"/>
           <w:b w:val="0"/>
+          <w:bCs w:val="0"/>
           <w:i w:val="0"/>
+          <w:iCs w:val="0"/>
           <w:smallCaps w:val="0"/>
           <w:strike w:val="0"/>
           <w:color w:val="000000"/>
@@ -10566,7 +10794,9 @@
         <w:rPr>
           <w:rFonts w:ascii="Calibri" w:cs="Calibri" w:eastAsia="Calibri" w:hAnsi="Calibri"/>
           <w:b w:val="0"/>
+          <w:bCs w:val="0"/>
           <w:i w:val="1"/>
+          <w:iCs w:val="1"/>
           <w:smallCaps w:val="0"/>
           <w:strike w:val="0"/>
           <w:color w:val="000000"/>
@@ -10583,7 +10813,9 @@
         <w:rPr>
           <w:rFonts w:ascii="Calibri" w:cs="Calibri" w:eastAsia="Calibri" w:hAnsi="Calibri"/>
           <w:b w:val="0"/>
+          <w:bCs w:val="0"/>
           <w:i w:val="0"/>
+          <w:iCs w:val="0"/>
           <w:smallCaps w:val="0"/>
           <w:strike w:val="0"/>
           <w:color w:val="000000"/>
@@ -10621,7 +10853,9 @@
         <w:rPr>
           <w:rFonts w:ascii="Calibri" w:cs="Calibri" w:eastAsia="Calibri" w:hAnsi="Calibri"/>
           <w:b w:val="0"/>
+          <w:bCs w:val="0"/>
           <w:i w:val="0"/>
+          <w:iCs w:val="0"/>
           <w:smallCaps w:val="0"/>
           <w:strike w:val="0"/>
           <w:color w:val="000000"/>
@@ -10636,7 +10870,9 @@
         <w:rPr>
           <w:rFonts w:ascii="Calibri" w:cs="Calibri" w:eastAsia="Calibri" w:hAnsi="Calibri"/>
           <w:b w:val="0"/>
+          <w:bCs w:val="0"/>
           <w:i w:val="0"/>
+          <w:iCs w:val="0"/>
           <w:smallCaps w:val="0"/>
           <w:strike w:val="0"/>
           <w:color w:val="000000"/>
@@ -10711,7 +10947,9 @@
         <w:rPr>
           <w:rFonts w:ascii="Calibri" w:cs="Calibri" w:eastAsia="Calibri" w:hAnsi="Calibri"/>
           <w:b w:val="0"/>
+          <w:bCs w:val="0"/>
           <w:i w:val="0"/>
+          <w:iCs w:val="0"/>
           <w:smallCaps w:val="0"/>
           <w:strike w:val="0"/>
           <w:color w:val="000000"/>
@@ -10726,7 +10964,9 @@
         <w:rPr>
           <w:rFonts w:ascii="Calibri" w:cs="Calibri" w:eastAsia="Calibri" w:hAnsi="Calibri"/>
           <w:b w:val="0"/>
+          <w:bCs w:val="0"/>
           <w:i w:val="0"/>
+          <w:iCs w:val="0"/>
           <w:smallCaps w:val="0"/>
           <w:strike w:val="0"/>
           <w:color w:val="000000"/>
@@ -10764,7 +11004,9 @@
         <w:rPr>
           <w:rFonts w:ascii="Calibri" w:cs="Calibri" w:eastAsia="Calibri" w:hAnsi="Calibri"/>
           <w:b w:val="0"/>
+          <w:bCs w:val="0"/>
           <w:i w:val="0"/>
+          <w:iCs w:val="0"/>
           <w:smallCaps w:val="0"/>
           <w:strike w:val="0"/>
           <w:color w:val="000000"/>
@@ -10779,7 +11021,9 @@
         <w:rPr>
           <w:rFonts w:ascii="Calibri" w:cs="Calibri" w:eastAsia="Calibri" w:hAnsi="Calibri"/>
           <w:b w:val="0"/>
+          <w:bCs w:val="0"/>
           <w:i w:val="0"/>
+          <w:iCs w:val="0"/>
           <w:smallCaps w:val="0"/>
           <w:strike w:val="0"/>
           <w:color w:val="000000"/>
@@ -10854,7 +11098,9 @@
         <w:rPr>
           <w:rFonts w:ascii="Calibri" w:cs="Calibri" w:eastAsia="Calibri" w:hAnsi="Calibri"/>
           <w:b w:val="0"/>
+          <w:bCs w:val="0"/>
           <w:i w:val="0"/>
+          <w:iCs w:val="0"/>
           <w:smallCaps w:val="0"/>
           <w:strike w:val="0"/>
           <w:color w:val="000000"/>
@@ -10869,7 +11115,9 @@
         <w:rPr>
           <w:rFonts w:ascii="Calibri" w:cs="Calibri" w:eastAsia="Calibri" w:hAnsi="Calibri"/>
           <w:b w:val="0"/>
+          <w:bCs w:val="0"/>
           <w:i w:val="0"/>
+          <w:iCs w:val="0"/>
           <w:smallCaps w:val="0"/>
           <w:strike w:val="0"/>
           <w:color w:val="000000"/>
@@ -10907,7 +11155,9 @@
         <w:rPr>
           <w:rFonts w:ascii="Calibri" w:cs="Calibri" w:eastAsia="Calibri" w:hAnsi="Calibri"/>
           <w:b w:val="0"/>
+          <w:bCs w:val="0"/>
           <w:i w:val="0"/>
+          <w:iCs w:val="0"/>
           <w:smallCaps w:val="0"/>
           <w:strike w:val="0"/>
           <w:color w:val="000000"/>
@@ -10922,7 +11172,9 @@
         <w:rPr>
           <w:rFonts w:ascii="Calibri" w:cs="Calibri" w:eastAsia="Calibri" w:hAnsi="Calibri"/>
           <w:b w:val="0"/>
+          <w:bCs w:val="0"/>
           <w:i w:val="0"/>
+          <w:iCs w:val="0"/>
           <w:smallCaps w:val="0"/>
           <w:strike w:val="0"/>
           <w:color w:val="000000"/>
@@ -10991,6 +11243,7 @@
         <w:rPr>
           <w:rFonts w:ascii="Calibri" w:cs="Calibri" w:eastAsia="Calibri" w:hAnsi="Calibri"/>
           <w:i w:val="1"/>
+          <w:iCs w:val="1"/>
           <w:color w:val="000000"/>
           <w:sz w:val="20"/>
           <w:szCs w:val="20"/>
@@ -11033,7 +11286,9 @@
         <w:rPr>
           <w:rFonts w:ascii="Calibri" w:cs="Calibri" w:eastAsia="Calibri" w:hAnsi="Calibri"/>
           <w:b w:val="0"/>
+          <w:bCs w:val="0"/>
           <w:i w:val="0"/>
+          <w:iCs w:val="0"/>
           <w:smallCaps w:val="0"/>
           <w:strike w:val="0"/>
           <w:color w:val="000000"/>
@@ -11048,7 +11303,9 @@
         <w:rPr>
           <w:rFonts w:ascii="Calibri" w:cs="Calibri" w:eastAsia="Calibri" w:hAnsi="Calibri"/>
           <w:b w:val="0"/>
+          <w:bCs w:val="0"/>
           <w:i w:val="0"/>
+          <w:iCs w:val="0"/>
           <w:smallCaps w:val="0"/>
           <w:strike w:val="0"/>
           <w:color w:val="000000"/>
@@ -11086,7 +11343,9 @@
         <w:rPr>
           <w:rFonts w:ascii="Calibri" w:cs="Calibri" w:eastAsia="Calibri" w:hAnsi="Calibri"/>
           <w:b w:val="0"/>
+          <w:bCs w:val="0"/>
           <w:i w:val="0"/>
+          <w:iCs w:val="0"/>
           <w:smallCaps w:val="0"/>
           <w:strike w:val="0"/>
           <w:color w:val="000000"/>
@@ -11101,7 +11360,9 @@
         <w:rPr>
           <w:rFonts w:ascii="Calibri" w:cs="Calibri" w:eastAsia="Calibri" w:hAnsi="Calibri"/>
           <w:b w:val="0"/>
+          <w:bCs w:val="0"/>
           <w:i w:val="0"/>
+          <w:iCs w:val="0"/>
           <w:smallCaps w:val="0"/>
           <w:strike w:val="0"/>
           <w:color w:val="000000"/>
@@ -11139,7 +11400,9 @@
         <w:rPr>
           <w:rFonts w:ascii="Calibri" w:cs="Calibri" w:eastAsia="Calibri" w:hAnsi="Calibri"/>
           <w:b w:val="0"/>
+          <w:bCs w:val="0"/>
           <w:i w:val="0"/>
+          <w:iCs w:val="0"/>
           <w:smallCaps w:val="0"/>
           <w:strike w:val="0"/>
           <w:color w:val="000000"/>
@@ -11154,7 +11417,9 @@
         <w:rPr>
           <w:rFonts w:ascii="Calibri" w:cs="Calibri" w:eastAsia="Calibri" w:hAnsi="Calibri"/>
           <w:b w:val="0"/>
+          <w:bCs w:val="0"/>
           <w:i w:val="0"/>
+          <w:iCs w:val="0"/>
           <w:smallCaps w:val="0"/>
           <w:strike w:val="0"/>
           <w:color w:val="000000"/>
@@ -11171,7 +11436,9 @@
         <w:rPr>
           <w:rFonts w:ascii="Calibri" w:cs="Calibri" w:eastAsia="Calibri" w:hAnsi="Calibri"/>
           <w:b w:val="0"/>
+          <w:bCs w:val="0"/>
           <w:i w:val="1"/>
+          <w:iCs w:val="1"/>
           <w:smallCaps w:val="0"/>
           <w:strike w:val="0"/>
           <w:color w:val="000000"/>
@@ -11251,7 +11518,9 @@
         <w:rPr>
           <w:rFonts w:ascii="Calibri" w:cs="Calibri" w:eastAsia="Calibri" w:hAnsi="Calibri"/>
           <w:b w:val="0"/>
+          <w:bCs w:val="0"/>
           <w:i w:val="0"/>
+          <w:iCs w:val="0"/>
           <w:smallCaps w:val="0"/>
           <w:strike w:val="0"/>
           <w:color w:val="000000"/>
@@ -11266,7 +11535,9 @@
         <w:rPr>
           <w:rFonts w:ascii="Calibri" w:cs="Calibri" w:eastAsia="Calibri" w:hAnsi="Calibri"/>
           <w:b w:val="0"/>
+          <w:bCs w:val="0"/>
           <w:i w:val="0"/>
+          <w:iCs w:val="0"/>
           <w:smallCaps w:val="0"/>
           <w:strike w:val="0"/>
           <w:color w:val="000000"/>
@@ -11304,7 +11575,9 @@
         <w:rPr>
           <w:rFonts w:ascii="Calibri" w:cs="Calibri" w:eastAsia="Calibri" w:hAnsi="Calibri"/>
           <w:b w:val="0"/>
+          <w:bCs w:val="0"/>
           <w:i w:val="0"/>
+          <w:iCs w:val="0"/>
           <w:smallCaps w:val="0"/>
           <w:strike w:val="0"/>
           <w:color w:val="000000"/>
@@ -11319,7 +11592,9 @@
         <w:rPr>
           <w:rFonts w:ascii="Calibri" w:cs="Calibri" w:eastAsia="Calibri" w:hAnsi="Calibri"/>
           <w:b w:val="0"/>
+          <w:bCs w:val="0"/>
           <w:i w:val="0"/>
+          <w:iCs w:val="0"/>
           <w:smallCaps w:val="0"/>
           <w:strike w:val="0"/>
           <w:color w:val="000000"/>
@@ -11394,7 +11669,9 @@
         <w:rPr>
           <w:rFonts w:ascii="Calibri" w:cs="Calibri" w:eastAsia="Calibri" w:hAnsi="Calibri"/>
           <w:b w:val="0"/>
+          <w:bCs w:val="0"/>
           <w:i w:val="0"/>
+          <w:iCs w:val="0"/>
           <w:smallCaps w:val="0"/>
           <w:strike w:val="0"/>
           <w:color w:val="000000"/>
@@ -11409,7 +11686,9 @@
         <w:rPr>
           <w:rFonts w:ascii="Calibri" w:cs="Calibri" w:eastAsia="Calibri" w:hAnsi="Calibri"/>
           <w:b w:val="0"/>
+          <w:bCs w:val="0"/>
           <w:i w:val="0"/>
+          <w:iCs w:val="0"/>
           <w:smallCaps w:val="0"/>
           <w:strike w:val="0"/>
           <w:color w:val="000000"/>
@@ -11447,7 +11726,9 @@
         <w:rPr>
           <w:rFonts w:ascii="Calibri" w:cs="Calibri" w:eastAsia="Calibri" w:hAnsi="Calibri"/>
           <w:b w:val="0"/>
+          <w:bCs w:val="0"/>
           <w:i w:val="0"/>
+          <w:iCs w:val="0"/>
           <w:smallCaps w:val="0"/>
           <w:strike w:val="0"/>
           <w:color w:val="000000"/>
@@ -11462,7 +11743,9 @@
         <w:rPr>
           <w:rFonts w:ascii="Calibri" w:cs="Calibri" w:eastAsia="Calibri" w:hAnsi="Calibri"/>
           <w:b w:val="0"/>
+          <w:bCs w:val="0"/>
           <w:i w:val="0"/>
+          <w:iCs w:val="0"/>
           <w:smallCaps w:val="0"/>
           <w:strike w:val="0"/>
           <w:color w:val="000000"/>
@@ -11500,7 +11783,9 @@
         <w:rPr>
           <w:rFonts w:ascii="Calibri" w:cs="Calibri" w:eastAsia="Calibri" w:hAnsi="Calibri"/>
           <w:b w:val="0"/>
+          <w:bCs w:val="0"/>
           <w:i w:val="0"/>
+          <w:iCs w:val="0"/>
           <w:smallCaps w:val="0"/>
           <w:strike w:val="0"/>
           <w:color w:val="000000"/>
@@ -11515,7 +11800,9 @@
         <w:rPr>
           <w:rFonts w:ascii="Calibri" w:cs="Calibri" w:eastAsia="Calibri" w:hAnsi="Calibri"/>
           <w:b w:val="0"/>
+          <w:bCs w:val="0"/>
           <w:i w:val="0"/>
+          <w:iCs w:val="0"/>
           <w:smallCaps w:val="0"/>
           <w:strike w:val="0"/>
           <w:color w:val="000000"/>
@@ -11532,7 +11819,9 @@
         <w:rPr>
           <w:rFonts w:ascii="Calibri" w:cs="Calibri" w:eastAsia="Calibri" w:hAnsi="Calibri"/>
           <w:b w:val="0"/>
+          <w:bCs w:val="0"/>
           <w:i w:val="1"/>
+          <w:iCs w:val="1"/>
           <w:smallCaps w:val="0"/>
           <w:strike w:val="0"/>
           <w:color w:val="000000"/>
@@ -11549,7 +11838,9 @@
         <w:rPr>
           <w:rFonts w:ascii="Calibri" w:cs="Calibri" w:eastAsia="Calibri" w:hAnsi="Calibri"/>
           <w:b w:val="0"/>
+          <w:bCs w:val="0"/>
           <w:i w:val="0"/>
+          <w:iCs w:val="0"/>
           <w:smallCaps w:val="0"/>
           <w:strike w:val="0"/>
           <w:color w:val="000000"/>
@@ -11618,6 +11909,7 @@
         <w:rPr>
           <w:rFonts w:ascii="Calibri" w:cs="Calibri" w:eastAsia="Calibri" w:hAnsi="Calibri"/>
           <w:i w:val="1"/>
+          <w:iCs w:val="1"/>
           <w:color w:val="000000"/>
           <w:sz w:val="20"/>
           <w:szCs w:val="20"/>
@@ -11660,7 +11952,9 @@
         <w:rPr>
           <w:rFonts w:ascii="Calibri" w:cs="Calibri" w:eastAsia="Calibri" w:hAnsi="Calibri"/>
           <w:b w:val="0"/>
+          <w:bCs w:val="0"/>
           <w:i w:val="0"/>
+          <w:iCs w:val="0"/>
           <w:smallCaps w:val="0"/>
           <w:strike w:val="0"/>
           <w:color w:val="000000"/>
@@ -11675,7 +11969,9 @@
         <w:rPr>
           <w:rFonts w:ascii="Calibri" w:cs="Calibri" w:eastAsia="Calibri" w:hAnsi="Calibri"/>
           <w:b w:val="0"/>
+          <w:bCs w:val="0"/>
           <w:i w:val="0"/>
+          <w:iCs w:val="0"/>
           <w:smallCaps w:val="0"/>
           <w:strike w:val="0"/>
           <w:color w:val="000000"/>
@@ -11746,7 +12042,9 @@
         <w:rPr>
           <w:rFonts w:ascii="Calibri" w:cs="Calibri" w:eastAsia="Calibri" w:hAnsi="Calibri"/>
           <w:b w:val="0"/>
+          <w:bCs w:val="0"/>
           <w:i w:val="0"/>
+          <w:iCs w:val="0"/>
           <w:smallCaps w:val="0"/>
           <w:strike w:val="0"/>
           <w:color w:val="000000"/>
@@ -11761,7 +12059,9 @@
         <w:rPr>
           <w:rFonts w:ascii="Calibri" w:cs="Calibri" w:eastAsia="Calibri" w:hAnsi="Calibri"/>
           <w:b w:val="0"/>
+          <w:bCs w:val="0"/>
           <w:i w:val="0"/>
+          <w:iCs w:val="0"/>
           <w:smallCaps w:val="0"/>
           <w:strike w:val="0"/>
           <w:color w:val="000000"/>
@@ -11799,7 +12099,9 @@
         <w:rPr>
           <w:rFonts w:ascii="Calibri" w:cs="Calibri" w:eastAsia="Calibri" w:hAnsi="Calibri"/>
           <w:b w:val="0"/>
+          <w:bCs w:val="0"/>
           <w:i w:val="0"/>
+          <w:iCs w:val="0"/>
           <w:smallCaps w:val="0"/>
           <w:strike w:val="0"/>
           <w:color w:val="000000"/>
@@ -11814,7 +12116,9 @@
         <w:rPr>
           <w:rFonts w:ascii="Calibri" w:cs="Calibri" w:eastAsia="Calibri" w:hAnsi="Calibri"/>
           <w:b w:val="0"/>
+          <w:bCs w:val="0"/>
           <w:i w:val="0"/>
+          <w:iCs w:val="0"/>
           <w:smallCaps w:val="0"/>
           <w:strike w:val="0"/>
           <w:color w:val="000000"/>
@@ -11852,7 +12156,9 @@
         <w:rPr>
           <w:rFonts w:ascii="Calibri" w:cs="Calibri" w:eastAsia="Calibri" w:hAnsi="Calibri"/>
           <w:b w:val="0"/>
+          <w:bCs w:val="0"/>
           <w:i w:val="0"/>
+          <w:iCs w:val="0"/>
           <w:smallCaps w:val="0"/>
           <w:strike w:val="0"/>
           <w:color w:val="000000"/>
@@ -11867,7 +12173,9 @@
         <w:rPr>
           <w:rFonts w:ascii="Calibri" w:cs="Calibri" w:eastAsia="Calibri" w:hAnsi="Calibri"/>
           <w:b w:val="0"/>
+          <w:bCs w:val="0"/>
           <w:i w:val="0"/>
+          <w:iCs w:val="0"/>
           <w:smallCaps w:val="0"/>
           <w:strike w:val="0"/>
           <w:color w:val="000000"/>
@@ -11905,7 +12213,9 @@
         <w:rPr>
           <w:rFonts w:ascii="Calibri" w:cs="Calibri" w:eastAsia="Calibri" w:hAnsi="Calibri"/>
           <w:b w:val="0"/>
+          <w:bCs w:val="0"/>
           <w:i w:val="0"/>
+          <w:iCs w:val="0"/>
           <w:smallCaps w:val="0"/>
           <w:strike w:val="0"/>
           <w:color w:val="000000"/>
@@ -11920,7 +12230,9 @@
         <w:rPr>
           <w:rFonts w:ascii="Calibri" w:cs="Calibri" w:eastAsia="Calibri" w:hAnsi="Calibri"/>
           <w:b w:val="0"/>
+          <w:bCs w:val="0"/>
           <w:i w:val="0"/>
+          <w:iCs w:val="0"/>
           <w:smallCaps w:val="0"/>
           <w:strike w:val="0"/>
           <w:color w:val="000000"/>
@@ -11958,7 +12270,9 @@
         <w:rPr>
           <w:rFonts w:ascii="Calibri" w:cs="Calibri" w:eastAsia="Calibri" w:hAnsi="Calibri"/>
           <w:b w:val="0"/>
+          <w:bCs w:val="0"/>
           <w:i w:val="0"/>
+          <w:iCs w:val="0"/>
           <w:smallCaps w:val="0"/>
           <w:strike w:val="0"/>
           <w:color w:val="000000"/>
@@ -11973,7 +12287,9 @@
         <w:rPr>
           <w:rFonts w:ascii="Calibri" w:cs="Calibri" w:eastAsia="Calibri" w:hAnsi="Calibri"/>
           <w:b w:val="0"/>
+          <w:bCs w:val="0"/>
           <w:i w:val="0"/>
+          <w:iCs w:val="0"/>
           <w:smallCaps w:val="0"/>
           <w:strike w:val="0"/>
           <w:color w:val="000000"/>
@@ -12044,7 +12360,9 @@
         <w:rPr>
           <w:rFonts w:ascii="Calibri" w:cs="Calibri" w:eastAsia="Calibri" w:hAnsi="Calibri"/>
           <w:b w:val="0"/>
+          <w:bCs w:val="0"/>
           <w:i w:val="0"/>
+          <w:iCs w:val="0"/>
           <w:smallCaps w:val="0"/>
           <w:strike w:val="0"/>
           <w:color w:val="000000"/>
@@ -12059,7 +12377,9 @@
         <w:rPr>
           <w:rFonts w:ascii="Calibri" w:cs="Calibri" w:eastAsia="Calibri" w:hAnsi="Calibri"/>
           <w:b w:val="0"/>
+          <w:bCs w:val="0"/>
           <w:i w:val="0"/>
+          <w:iCs w:val="0"/>
           <w:smallCaps w:val="0"/>
           <w:strike w:val="0"/>
           <w:color w:val="000000"/>
@@ -12097,7 +12417,9 @@
         <w:rPr>
           <w:rFonts w:ascii="Calibri" w:cs="Calibri" w:eastAsia="Calibri" w:hAnsi="Calibri"/>
           <w:b w:val="0"/>
+          <w:bCs w:val="0"/>
           <w:i w:val="0"/>
+          <w:iCs w:val="0"/>
           <w:smallCaps w:val="0"/>
           <w:strike w:val="0"/>
           <w:color w:val="000000"/>
@@ -12112,7 +12434,9 @@
         <w:rPr>
           <w:rFonts w:ascii="Calibri" w:cs="Calibri" w:eastAsia="Calibri" w:hAnsi="Calibri"/>
           <w:b w:val="0"/>
+          <w:bCs w:val="0"/>
           <w:i w:val="0"/>
+          <w:iCs w:val="0"/>
           <w:smallCaps w:val="0"/>
           <w:strike w:val="0"/>
           <w:color w:val="000000"/>
@@ -12150,7 +12474,9 @@
         <w:rPr>
           <w:rFonts w:ascii="Calibri" w:cs="Calibri" w:eastAsia="Calibri" w:hAnsi="Calibri"/>
           <w:b w:val="0"/>
+          <w:bCs w:val="0"/>
           <w:i w:val="0"/>
+          <w:iCs w:val="0"/>
           <w:smallCaps w:val="0"/>
           <w:strike w:val="0"/>
           <w:color w:val="000000"/>
@@ -12165,7 +12491,9 @@
         <w:rPr>
           <w:rFonts w:ascii="Calibri" w:cs="Calibri" w:eastAsia="Calibri" w:hAnsi="Calibri"/>
           <w:b w:val="0"/>
+          <w:bCs w:val="0"/>
           <w:i w:val="0"/>
+          <w:iCs w:val="0"/>
           <w:smallCaps w:val="0"/>
           <w:strike w:val="0"/>
           <w:color w:val="000000"/>
@@ -12203,7 +12531,9 @@
         <w:rPr>
           <w:rFonts w:ascii="Calibri" w:cs="Calibri" w:eastAsia="Calibri" w:hAnsi="Calibri"/>
           <w:b w:val="0"/>
+          <w:bCs w:val="0"/>
           <w:i w:val="0"/>
+          <w:iCs w:val="0"/>
           <w:smallCaps w:val="0"/>
           <w:strike w:val="0"/>
           <w:color w:val="000000"/>
@@ -12218,7 +12548,9 @@
         <w:rPr>
           <w:rFonts w:ascii="Calibri" w:cs="Calibri" w:eastAsia="Calibri" w:hAnsi="Calibri"/>
           <w:b w:val="0"/>
+          <w:bCs w:val="0"/>
           <w:i w:val="0"/>
+          <w:iCs w:val="0"/>
           <w:smallCaps w:val="0"/>
           <w:strike w:val="0"/>
           <w:color w:val="000000"/>
@@ -12256,7 +12588,9 @@
         <w:rPr>
           <w:rFonts w:ascii="Calibri" w:cs="Calibri" w:eastAsia="Calibri" w:hAnsi="Calibri"/>
           <w:b w:val="0"/>
+          <w:bCs w:val="0"/>
           <w:i w:val="0"/>
+          <w:iCs w:val="0"/>
           <w:smallCaps w:val="0"/>
           <w:strike w:val="0"/>
           <w:color w:val="000000"/>
@@ -12271,7 +12605,9 @@
         <w:rPr>
           <w:rFonts w:ascii="Calibri" w:cs="Calibri" w:eastAsia="Calibri" w:hAnsi="Calibri"/>
           <w:b w:val="0"/>
+          <w:bCs w:val="0"/>
           <w:i w:val="0"/>
+          <w:iCs w:val="0"/>
           <w:smallCaps w:val="0"/>
           <w:strike w:val="0"/>
           <w:color w:val="000000"/>
@@ -12309,7 +12645,9 @@
         <w:rPr>
           <w:rFonts w:ascii="Calibri" w:cs="Calibri" w:eastAsia="Calibri" w:hAnsi="Calibri"/>
           <w:b w:val="0"/>
+          <w:bCs w:val="0"/>
           <w:i w:val="0"/>
+          <w:iCs w:val="0"/>
           <w:smallCaps w:val="0"/>
           <w:strike w:val="0"/>
           <w:color w:val="000000"/>
@@ -12324,7 +12662,9 @@
         <w:rPr>
           <w:rFonts w:ascii="Calibri" w:cs="Calibri" w:eastAsia="Calibri" w:hAnsi="Calibri"/>
           <w:b w:val="0"/>
+          <w:bCs w:val="0"/>
           <w:i w:val="0"/>
+          <w:iCs w:val="0"/>
           <w:smallCaps w:val="0"/>
           <w:strike w:val="0"/>
           <w:color w:val="000000"/>
@@ -12393,6 +12733,7 @@
         <w:rPr>
           <w:rFonts w:ascii="Calibri" w:cs="Calibri" w:eastAsia="Calibri" w:hAnsi="Calibri"/>
           <w:i w:val="1"/>
+          <w:iCs w:val="1"/>
           <w:color w:val="000000"/>
           <w:sz w:val="20"/>
           <w:szCs w:val="20"/>
@@ -12435,7 +12776,9 @@
         <w:rPr>
           <w:rFonts w:ascii="Calibri" w:cs="Calibri" w:eastAsia="Calibri" w:hAnsi="Calibri"/>
           <w:b w:val="0"/>
+          <w:bCs w:val="0"/>
           <w:i w:val="0"/>
+          <w:iCs w:val="0"/>
           <w:smallCaps w:val="0"/>
           <w:strike w:val="0"/>
           <w:color w:val="000000"/>
@@ -12450,7 +12793,9 @@
         <w:rPr>
           <w:rFonts w:ascii="Calibri" w:cs="Calibri" w:eastAsia="Calibri" w:hAnsi="Calibri"/>
           <w:b w:val="0"/>
+          <w:bCs w:val="0"/>
           <w:i w:val="0"/>
+          <w:iCs w:val="0"/>
           <w:smallCaps w:val="0"/>
           <w:strike w:val="0"/>
           <w:color w:val="000000"/>
@@ -12467,7 +12812,9 @@
         <w:rPr>
           <w:rFonts w:ascii="Calibri" w:cs="Calibri" w:eastAsia="Calibri" w:hAnsi="Calibri"/>
           <w:b w:val="0"/>
+          <w:bCs w:val="0"/>
           <w:i w:val="1"/>
+          <w:iCs w:val="1"/>
           <w:smallCaps w:val="0"/>
           <w:strike w:val="0"/>
           <w:color w:val="000000"/>
@@ -12484,7 +12831,9 @@
         <w:rPr>
           <w:rFonts w:ascii="Calibri" w:cs="Calibri" w:eastAsia="Calibri" w:hAnsi="Calibri"/>
           <w:b w:val="0"/>
+          <w:bCs w:val="0"/>
           <w:i w:val="0"/>
+          <w:iCs w:val="0"/>
           <w:smallCaps w:val="0"/>
           <w:strike w:val="0"/>
           <w:color w:val="000000"/>
@@ -12559,7 +12908,9 @@
         <w:rPr>
           <w:rFonts w:ascii="Calibri" w:cs="Calibri" w:eastAsia="Calibri" w:hAnsi="Calibri"/>
           <w:b w:val="0"/>
+          <w:bCs w:val="0"/>
           <w:i w:val="0"/>
+          <w:iCs w:val="0"/>
           <w:smallCaps w:val="0"/>
           <w:strike w:val="0"/>
           <w:color w:val="000000"/>
@@ -12574,7 +12925,9 @@
         <w:rPr>
           <w:rFonts w:ascii="Calibri" w:cs="Calibri" w:eastAsia="Calibri" w:hAnsi="Calibri"/>
           <w:b w:val="0"/>
+          <w:bCs w:val="0"/>
           <w:i w:val="0"/>
+          <w:iCs w:val="0"/>
           <w:smallCaps w:val="0"/>
           <w:strike w:val="0"/>
           <w:color w:val="000000"/>
@@ -12612,7 +12965,9 @@
         <w:rPr>
           <w:rFonts w:ascii="Calibri" w:cs="Calibri" w:eastAsia="Calibri" w:hAnsi="Calibri"/>
           <w:b w:val="0"/>
+          <w:bCs w:val="0"/>
           <w:i w:val="0"/>
+          <w:iCs w:val="0"/>
           <w:smallCaps w:val="0"/>
           <w:strike w:val="0"/>
           <w:color w:val="000000"/>
@@ -12627,7 +12982,9 @@
         <w:rPr>
           <w:rFonts w:ascii="Calibri" w:cs="Calibri" w:eastAsia="Calibri" w:hAnsi="Calibri"/>
           <w:b w:val="0"/>
+          <w:bCs w:val="0"/>
           <w:i w:val="0"/>
+          <w:iCs w:val="0"/>
           <w:smallCaps w:val="0"/>
           <w:strike w:val="0"/>
           <w:color w:val="000000"/>
@@ -12702,7 +13059,9 @@
         <w:rPr>
           <w:rFonts w:ascii="Calibri" w:cs="Calibri" w:eastAsia="Calibri" w:hAnsi="Calibri"/>
           <w:b w:val="0"/>
+          <w:bCs w:val="0"/>
           <w:i w:val="0"/>
+          <w:iCs w:val="0"/>
           <w:smallCaps w:val="0"/>
           <w:strike w:val="0"/>
           <w:color w:val="000000"/>
@@ -12717,7 +13076,9 @@
         <w:rPr>
           <w:rFonts w:ascii="Calibri" w:cs="Calibri" w:eastAsia="Calibri" w:hAnsi="Calibri"/>
           <w:b w:val="0"/>
+          <w:bCs w:val="0"/>
           <w:i w:val="0"/>
+          <w:iCs w:val="0"/>
           <w:smallCaps w:val="0"/>
           <w:strike w:val="0"/>
           <w:color w:val="000000"/>
@@ -12755,7 +13116,9 @@
         <w:rPr>
           <w:rFonts w:ascii="Calibri" w:cs="Calibri" w:eastAsia="Calibri" w:hAnsi="Calibri"/>
           <w:b w:val="0"/>
+          <w:bCs w:val="0"/>
           <w:i w:val="0"/>
+          <w:iCs w:val="0"/>
           <w:smallCaps w:val="0"/>
           <w:strike w:val="0"/>
           <w:color w:val="000000"/>
@@ -12770,7 +13133,9 @@
         <w:rPr>
           <w:rFonts w:ascii="Calibri" w:cs="Calibri" w:eastAsia="Calibri" w:hAnsi="Calibri"/>
           <w:b w:val="0"/>
+          <w:bCs w:val="0"/>
           <w:i w:val="0"/>
+          <w:iCs w:val="0"/>
           <w:smallCaps w:val="0"/>
           <w:strike w:val="0"/>
           <w:color w:val="000000"/>
@@ -12815,6 +13180,7 @@
         <w:rPr>
           <w:rFonts w:ascii="Calibri" w:cs="Calibri" w:eastAsia="Calibri" w:hAnsi="Calibri"/>
           <w:b w:val="1"/>
+          <w:bCs w:val="1"/>
           <w:sz w:val="20"/>
           <w:szCs w:val="20"/>
           <w:rtl w:val="0"/>
@@ -12966,6 +13332,7 @@
         <w:rPr>
           <w:rFonts w:ascii="Calibri" w:cs="Calibri" w:eastAsia="Calibri" w:hAnsi="Calibri"/>
           <w:b w:val="1"/>
+          <w:bCs w:val="1"/>
           <w:sz w:val="20"/>
           <w:szCs w:val="20"/>
           <w:rtl w:val="0"/>
@@ -13131,6 +13498,7 @@
         <w:rPr>
           <w:rFonts w:ascii="Calibri" w:cs="Calibri" w:eastAsia="Calibri" w:hAnsi="Calibri"/>
           <w:b w:val="1"/>
+          <w:bCs w:val="1"/>
           <w:sz w:val="20"/>
           <w:szCs w:val="20"/>
           <w:rtl w:val="0"/>
@@ -13934,6 +14302,7 @@
         <w:rPr>
           <w:rFonts w:ascii="Calibri" w:cs="Calibri" w:eastAsia="Calibri" w:hAnsi="Calibri"/>
           <w:b w:val="1"/>
+          <w:bCs w:val="1"/>
           <w:sz w:val="20"/>
           <w:szCs w:val="20"/>
           <w:rtl w:val="0"/>
@@ -14737,6 +15106,7 @@
         <w:rPr>
           <w:rFonts w:ascii="Calibri" w:cs="Calibri" w:eastAsia="Calibri" w:hAnsi="Calibri"/>
           <w:b w:val="1"/>
+          <w:bCs w:val="1"/>
           <w:sz w:val="20"/>
           <w:szCs w:val="20"/>
           <w:rtl w:val="0"/>
@@ -14840,6 +15210,7 @@
         <w:rPr>
           <w:rFonts w:ascii="Calibri" w:cs="Calibri" w:eastAsia="Calibri" w:hAnsi="Calibri"/>
           <w:i w:val="1"/>
+          <w:iCs w:val="1"/>
           <w:color w:val="000000"/>
           <w:sz w:val="20"/>
           <w:szCs w:val="20"/>
@@ -14861,6 +15232,7 @@
         <w:rPr>
           <w:rFonts w:ascii="Calibri" w:cs="Calibri" w:eastAsia="Calibri" w:hAnsi="Calibri"/>
           <w:i w:val="1"/>
+          <w:iCs w:val="1"/>
           <w:color w:val="000000"/>
           <w:sz w:val="20"/>
           <w:szCs w:val="20"/>
@@ -14914,6 +15286,7 @@
         <w:rPr>
           <w:rFonts w:ascii="Calibri" w:cs="Calibri" w:eastAsia="Calibri" w:hAnsi="Calibri"/>
           <w:i w:val="1"/>
+          <w:iCs w:val="1"/>
           <w:color w:val="000000"/>
           <w:sz w:val="20"/>
           <w:szCs w:val="20"/>
@@ -14955,6 +15328,7 @@
         <w:rPr>
           <w:rFonts w:ascii="Calibri" w:cs="Calibri" w:eastAsia="Calibri" w:hAnsi="Calibri"/>
           <w:i w:val="1"/>
+          <w:iCs w:val="1"/>
           <w:color w:val="000000"/>
           <w:sz w:val="20"/>
           <w:szCs w:val="20"/>
@@ -14996,6 +15370,7 @@
         <w:rPr>
           <w:rFonts w:ascii="Calibri" w:cs="Calibri" w:eastAsia="Calibri" w:hAnsi="Calibri"/>
           <w:i w:val="1"/>
+          <w:iCs w:val="1"/>
           <w:color w:val="000000"/>
           <w:sz w:val="20"/>
           <w:szCs w:val="20"/>
@@ -15017,6 +15392,7 @@
         <w:rPr>
           <w:rFonts w:ascii="Calibri" w:cs="Calibri" w:eastAsia="Calibri" w:hAnsi="Calibri"/>
           <w:i w:val="1"/>
+          <w:iCs w:val="1"/>
           <w:color w:val="000000"/>
           <w:sz w:val="20"/>
           <w:szCs w:val="20"/>
@@ -15043,6 +15419,7 @@
         <w:rPr>
           <w:rFonts w:ascii="Calibri" w:cs="Calibri" w:eastAsia="Calibri" w:hAnsi="Calibri"/>
           <w:b w:val="1"/>
+          <w:bCs w:val="1"/>
           <w:sz w:val="20"/>
           <w:szCs w:val="20"/>
           <w:rtl w:val="0"/>
@@ -15388,6 +15765,7 @@
         <w:jc w:val="center"/>
         <w:rPr>
           <w:b w:val="1"/>
+          <w:bCs w:val="1"/>
           <w:sz w:val="20"/>
           <w:szCs w:val="20"/>
         </w:rPr>
@@ -15411,6 +15789,7 @@
         <w:rPr>
           <w:rFonts w:ascii="Calibri" w:cs="Calibri" w:eastAsia="Calibri" w:hAnsi="Calibri"/>
           <w:b w:val="1"/>
+          <w:bCs w:val="1"/>
           <w:sz w:val="20"/>
           <w:szCs w:val="20"/>
           <w:rtl w:val="0"/>
@@ -15448,6 +15827,7 @@
         <w:rPr>
           <w:rFonts w:ascii="Calibri" w:cs="Calibri" w:eastAsia="Calibri" w:hAnsi="Calibri"/>
           <w:i w:val="1"/>
+          <w:iCs w:val="1"/>
           <w:sz w:val="20"/>
           <w:szCs w:val="20"/>
           <w:rtl w:val="0"/>
@@ -16425,6 +16805,7 @@
         <w:rPr>
           <w:rFonts w:ascii="Calibri" w:cs="Calibri" w:eastAsia="Calibri" w:hAnsi="Calibri"/>
           <w:b w:val="1"/>
+          <w:bCs w:val="1"/>
           <w:sz w:val="20"/>
           <w:szCs w:val="20"/>
           <w:rtl w:val="0"/>
@@ -17034,6 +17415,7 @@
         <w:rPr>
           <w:rFonts w:ascii="Calibri" w:cs="Calibri" w:eastAsia="Calibri" w:hAnsi="Calibri"/>
           <w:b w:val="1"/>
+          <w:bCs w:val="1"/>
           <w:sz w:val="20"/>
           <w:szCs w:val="20"/>
           <w:rtl w:val="0"/>
@@ -17659,6 +18041,7 @@
         <w:jc w:val="left"/>
         <w:rPr>
           <w:b w:val="1"/>
+          <w:bCs w:val="1"/>
           <w:sz w:val="20"/>
           <w:szCs w:val="20"/>
         </w:rPr>
@@ -17682,6 +18065,7 @@
         <w:rPr>
           <w:rFonts w:ascii="Calibri" w:cs="Calibri" w:eastAsia="Calibri" w:hAnsi="Calibri"/>
           <w:b w:val="1"/>
+          <w:bCs w:val="1"/>
           <w:sz w:val="20"/>
           <w:szCs w:val="20"/>
           <w:rtl w:val="0"/>
@@ -18184,6 +18568,7 @@
         <w:rPr>
           <w:rFonts w:ascii="Calibri" w:cs="Calibri" w:eastAsia="Calibri" w:hAnsi="Calibri"/>
           <w:b w:val="1"/>
+          <w:bCs w:val="1"/>
           <w:sz w:val="20"/>
           <w:szCs w:val="20"/>
           <w:rtl w:val="0"/>
@@ -18441,6 +18826,7 @@
         <w:rPr>
           <w:rFonts w:ascii="Calibri" w:cs="Calibri" w:eastAsia="Calibri" w:hAnsi="Calibri"/>
           <w:b w:val="1"/>
+          <w:bCs w:val="1"/>
           <w:sz w:val="20"/>
           <w:szCs w:val="20"/>
           <w:rtl w:val="0"/>
@@ -18777,363 +19163,188 @@
       <w:pPr>
         <w:jc w:val="center"/>
         <w:rPr>
-          <w:rFonts w:ascii="Calibri" w:cs="Calibri" w:eastAsia="Calibri" w:hAnsi="Calibri"/>
-          <w:sz w:val="20"/>
-          <w:szCs w:val="20"/>
-        </w:rPr>
-      </w:pPr>
-      <w:r>
-        <w:rPr>
-          <w:rFonts w:ascii="Calibri" w:cs="Calibri" w:eastAsia="Calibri" w:hAnsi="Calibri"/>
+          <w:sz w:val="20"/>
+          <w:szCs w:val="20"/>
+        </w:rPr>
+      </w:pPr>
+      <w:r>
+        <w:rPr>
           <w:b w:val="1"/>
-          <w:sz w:val="20"/>
-          <w:szCs w:val="20"/>
-          <w:rtl w:val="0"/>
-        </w:rPr>
-        <w:t xml:space="preserve">KUPEC</w:t>
-      </w:r>
-      <w:r>
-        <w:rPr>
-          <w:rFonts w:ascii="Calibri" w:cs="Calibri" w:eastAsia="Calibri" w:hAnsi="Calibri"/>
-          <w:sz w:val="20"/>
-          <w:szCs w:val="20"/>
-          <w:rtl w:val="0"/>
-        </w:rPr>
-        <w:t xml:space="preserve"> – CESTA LŽÍ</w:t>
-      </w:r>
-    </w:p>
-    <w:p>
-      <w:pPr>
-        <w:rPr>
-          <w:rFonts w:ascii="Calibri" w:cs="Calibri" w:eastAsia="Calibri" w:hAnsi="Calibri"/>
-          <w:sz w:val="20"/>
-          <w:szCs w:val="20"/>
-        </w:rPr>
-      </w:pPr>
-      <w:r>
-        <w:rPr>
-          <w:rFonts w:ascii="Calibri" w:cs="Calibri" w:eastAsia="Calibri" w:hAnsi="Calibri"/>
-          <w:sz w:val="20"/>
-          <w:szCs w:val="20"/>
-          <w:rtl w:val="0"/>
-        </w:rPr>
-        <w:t xml:space="preserve">Jsi skvělý vyjednavač a máš neomylnou schopnost vyčuchat šperky a zlato.</w:t>
+          <w:bCs w:val="1"/>
+          <w:sz w:val="20"/>
+          <w:szCs w:val="20"/>
+          <w:rtl w:val="0"/>
+        </w:rPr>
+        <w:t xml:space="preserve">KUPE</w:t>
+      </w:r>
+      <w:sdt>
+        <w:sdtPr>
+          <w:id w:val="236670461"/>
+          <w:tag w:val="goog_rdk_0"/>
+        </w:sdtPr>
+        <w:sdtContent>
+          <w:ins w:author="Marek Timko" w:id="0" w:date="2026-10-05T18:47:08Z">
+            <w:r>
+              <w:rPr>
+                <w:b w:val="1"/>
+                <w:bCs w:val="1"/>
+                <w:sz w:val="20"/>
+                <w:szCs w:val="20"/>
+                <w:rtl w:val="0"/>
+              </w:rPr>
+              <w:t xml:space="preserve">C</w:t>
+            </w:r>
+          </w:ins>
+        </w:sdtContent>
+      </w:sdt>
+      <w:sdt>
+        <w:sdtPr>
+          <w:id w:val="-293038171"/>
+          <w:tag w:val="goog_rdk_1"/>
+        </w:sdtPr>
+        <w:sdtContent>
+          <w:del w:author="Marek Timko" w:id="0" w:date="2026-10-05T18:47:08Z">
+            <w:r>
+              <w:rPr>
+                <w:b w:val="1"/>
+                <w:bCs w:val="1"/>
+                <w:sz w:val="20"/>
+                <w:szCs w:val="20"/>
+                <w:rtl w:val="0"/>
+              </w:rPr>
+              <w:delText xml:space="preserve">R</w:delText>
+            </w:r>
+          </w:del>
+        </w:sdtContent>
+      </w:sdt>
+      <w:r>
+        <w:rPr>
+          <w:sz w:val="20"/>
+          <w:szCs w:val="20"/>
+          <w:rtl w:val="0"/>
+        </w:rPr>
+        <w:t xml:space="preserve">– CESTA POKLADU</w:t>
+      </w:r>
+    </w:p>
+    <w:p>
+      <w:pPr>
+        <w:rPr>
+          <w:sz w:val="20"/>
+          <w:szCs w:val="20"/>
+        </w:rPr>
+      </w:pPr>
+      <w:r>
+        <w:rPr>
+          <w:sz w:val="20"/>
+          <w:szCs w:val="20"/>
+          <w:rtl w:val="0"/>
+        </w:rPr>
+        <w:t xml:space="preserve">Jsi skvělý vyjednavač a máš neomylnou schopnost vyčuchat šperky a zlato. </w:t>
       </w:r>
     </w:p>
     <w:p>
       <w:pPr>
         <w:numPr>
           <w:ilvl w:val="0"/>
-          <w:numId w:val="92"/>
+          <w:numId w:val="93"/>
         </w:numPr>
-        <w:pBdr>
-          <w:top w:space="0" w:sz="0" w:val="nil"/>
-          <w:left w:space="0" w:sz="0" w:val="nil"/>
-          <w:bottom w:space="0" w:sz="0" w:val="nil"/>
-          <w:right w:space="0" w:sz="0" w:val="nil"/>
-          <w:between w:space="0" w:sz="0" w:val="nil"/>
-        </w:pBdr>
         <w:spacing w:after="0" w:lineRule="auto"/>
         <w:ind w:left="720" w:hanging="360"/>
         <w:rPr>
-          <w:rFonts w:ascii="Calibri" w:cs="Calibri" w:eastAsia="Calibri" w:hAnsi="Calibri"/>
-          <w:color w:val="000000"/>
-          <w:sz w:val="20"/>
-          <w:szCs w:val="20"/>
-        </w:rPr>
-      </w:pPr>
-      <w:r>
-        <w:rPr>
-          <w:rFonts w:ascii="Calibri" w:cs="Calibri" w:eastAsia="Calibri" w:hAnsi="Calibri"/>
-          <w:sz w:val="20"/>
-          <w:szCs w:val="20"/>
-          <w:rtl w:val="0"/>
-        </w:rPr>
-        <w:t xml:space="preserve">P</w:t>
-      </w:r>
-      <w:r>
-        <w:rPr>
-          <w:sz w:val="20"/>
-          <w:szCs w:val="20"/>
-          <w:rtl w:val="0"/>
-        </w:rPr>
-        <w:t xml:space="preserve">ř</w:t>
-      </w:r>
-      <w:r>
-        <w:rPr>
-          <w:rFonts w:ascii="Calibri" w:cs="Calibri" w:eastAsia="Calibri" w:hAnsi="Calibri"/>
-          <w:sz w:val="20"/>
-          <w:szCs w:val="20"/>
-          <w:rtl w:val="0"/>
-        </w:rPr>
-        <w:t xml:space="preserve">i n</w:t>
-      </w:r>
-      <w:r>
-        <w:rPr>
-          <w:sz w:val="20"/>
-          <w:szCs w:val="20"/>
-          <w:rtl w:val="0"/>
-        </w:rPr>
-        <w:t xml:space="preserve">á</w:t>
-      </w:r>
-      <w:r>
-        <w:rPr>
-          <w:rFonts w:ascii="Calibri" w:cs="Calibri" w:eastAsia="Calibri" w:hAnsi="Calibri"/>
-          <w:sz w:val="20"/>
-          <w:szCs w:val="20"/>
-          <w:rtl w:val="0"/>
-        </w:rPr>
-        <w:t xml:space="preserve">kupu n</w:t>
-      </w:r>
-      <w:r>
-        <w:rPr>
-          <w:sz w:val="20"/>
-          <w:szCs w:val="20"/>
-          <w:rtl w:val="0"/>
-        </w:rPr>
-        <w:t xml:space="preserve">ě</w:t>
-      </w:r>
-      <w:r>
-        <w:rPr>
-          <w:rFonts w:ascii="Calibri" w:cs="Calibri" w:eastAsia="Calibri" w:hAnsi="Calibri"/>
-          <w:sz w:val="20"/>
-          <w:szCs w:val="20"/>
-          <w:rtl w:val="0"/>
-        </w:rPr>
-        <w:t xml:space="preserve">jak</w:t>
-      </w:r>
-      <w:r>
-        <w:rPr>
-          <w:sz w:val="20"/>
-          <w:szCs w:val="20"/>
-          <w:rtl w:val="0"/>
-        </w:rPr>
-        <w:t xml:space="preserve">é</w:t>
-      </w:r>
-      <w:r>
-        <w:rPr>
-          <w:rFonts w:ascii="Calibri" w:cs="Calibri" w:eastAsia="Calibri" w:hAnsi="Calibri"/>
-          <w:sz w:val="20"/>
-          <w:szCs w:val="20"/>
-          <w:rtl w:val="0"/>
-        </w:rPr>
-        <w:t xml:space="preserve">ho p</w:t>
-      </w:r>
-      <w:r>
-        <w:rPr>
-          <w:sz w:val="20"/>
-          <w:szCs w:val="20"/>
-          <w:rtl w:val="0"/>
-        </w:rPr>
-        <w:t xml:space="preserve">ř</w:t>
-      </w:r>
-      <w:r>
-        <w:rPr>
-          <w:rFonts w:ascii="Calibri" w:cs="Calibri" w:eastAsia="Calibri" w:hAnsi="Calibri"/>
-          <w:sz w:val="20"/>
-          <w:szCs w:val="20"/>
-          <w:rtl w:val="0"/>
-        </w:rPr>
-        <w:t xml:space="preserve">edm</w:t>
-      </w:r>
-      <w:r>
-        <w:rPr>
-          <w:sz w:val="20"/>
-          <w:szCs w:val="20"/>
-          <w:rtl w:val="0"/>
-        </w:rPr>
-        <w:t xml:space="preserve">ě</w:t>
-      </w:r>
-      <w:r>
-        <w:rPr>
-          <w:rFonts w:ascii="Calibri" w:cs="Calibri" w:eastAsia="Calibri" w:hAnsi="Calibri"/>
-          <w:sz w:val="20"/>
-          <w:szCs w:val="20"/>
-          <w:rtl w:val="0"/>
-        </w:rPr>
-        <w:t xml:space="preserve">tu m</w:t>
-      </w:r>
-      <w:r>
-        <w:rPr>
-          <w:sz w:val="20"/>
-          <w:szCs w:val="20"/>
-          <w:rtl w:val="0"/>
-        </w:rPr>
-        <w:t xml:space="preserve">ůž</w:t>
-      </w:r>
-      <w:r>
-        <w:rPr>
-          <w:rFonts w:ascii="Calibri" w:cs="Calibri" w:eastAsia="Calibri" w:hAnsi="Calibri"/>
-          <w:sz w:val="20"/>
-          <w:szCs w:val="20"/>
-          <w:rtl w:val="0"/>
-        </w:rPr>
-        <w:t xml:space="preserve">e</w:t>
-      </w:r>
-      <w:r>
-        <w:rPr>
-          <w:sz w:val="20"/>
-          <w:szCs w:val="20"/>
-          <w:rtl w:val="0"/>
-        </w:rPr>
-        <w:t xml:space="preserve">š</w:t>
-      </w:r>
-      <w:r>
-        <w:rPr>
-          <w:rFonts w:ascii="Calibri" w:cs="Calibri" w:eastAsia="Calibri" w:hAnsi="Calibri"/>
-          <w:sz w:val="20"/>
-          <w:szCs w:val="20"/>
-          <w:rtl w:val="0"/>
-        </w:rPr>
-        <w:t xml:space="preserve"> utracen</w:t>
-      </w:r>
-      <w:r>
-        <w:rPr>
-          <w:sz w:val="20"/>
-          <w:szCs w:val="20"/>
-          <w:rtl w:val="0"/>
-        </w:rPr>
-        <w:t xml:space="preserve">í</w:t>
-      </w:r>
-      <w:r>
-        <w:rPr>
-          <w:rFonts w:ascii="Calibri" w:cs="Calibri" w:eastAsia="Calibri" w:hAnsi="Calibri"/>
-          <w:sz w:val="20"/>
-          <w:szCs w:val="20"/>
-          <w:rtl w:val="0"/>
-        </w:rPr>
-        <w:t xml:space="preserve">m bod</w:t>
-      </w:r>
-      <w:r>
-        <w:rPr>
-          <w:sz w:val="20"/>
-          <w:szCs w:val="20"/>
-          <w:rtl w:val="0"/>
-        </w:rPr>
-        <w:t xml:space="preserve">ů</w:t>
-      </w:r>
-      <w:r>
-        <w:rPr>
-          <w:rFonts w:ascii="Calibri" w:cs="Calibri" w:eastAsia="Calibri" w:hAnsi="Calibri"/>
-          <w:sz w:val="20"/>
-          <w:szCs w:val="20"/>
-          <w:rtl w:val="0"/>
-        </w:rPr>
-        <w:t xml:space="preserve"> v</w:t>
-      </w:r>
-      <w:r>
-        <w:rPr>
-          <w:sz w:val="20"/>
-          <w:szCs w:val="20"/>
-          <w:rtl w:val="0"/>
-        </w:rPr>
-        <w:t xml:space="preserve">ů</w:t>
-      </w:r>
-      <w:r>
-        <w:rPr>
-          <w:rFonts w:ascii="Calibri" w:cs="Calibri" w:eastAsia="Calibri" w:hAnsi="Calibri"/>
-          <w:sz w:val="20"/>
-          <w:szCs w:val="20"/>
-          <w:rtl w:val="0"/>
-        </w:rPr>
-        <w:t xml:space="preserve">le automaticky usmlouvat cenu. Cena se sníží o jednu pětinu za každý utracený bod vůle. Maximálně můžeš utratit 4 body vůle, čímž cenu snížíš na jednu pětinu</w:t>
-      </w:r>
-      <w:r>
-        <w:rPr>
-          <w:rFonts w:ascii="Calibri" w:cs="Calibri" w:eastAsia="Calibri" w:hAnsi="Calibri"/>
-          <w:color w:val="000000"/>
-          <w:sz w:val="20"/>
-          <w:szCs w:val="20"/>
-          <w:rtl w:val="0"/>
-        </w:rPr>
-        <w:t xml:space="preserve">.</w:t>
+          <w:sz w:val="20"/>
+          <w:szCs w:val="20"/>
+        </w:rPr>
+      </w:pPr>
+      <w:r>
+        <w:rPr>
+          <w:sz w:val="20"/>
+          <w:szCs w:val="20"/>
+          <w:rtl w:val="0"/>
+        </w:rPr>
+        <w:t xml:space="preserve">Při nákupu nějakého předmětu můžeš utracením bodů vůle automaticky usmlouvat cenu. Cena se sníží o jednu pětinu za každý utracený bod vůle. Maximálně můžeš utratit 4 body vůle, čímž cenu snížíš na jednu pětinu.</w:t>
       </w:r>
     </w:p>
     <w:p>
       <w:pPr>
         <w:numPr>
           <w:ilvl w:val="0"/>
-          <w:numId w:val="92"/>
+          <w:numId w:val="93"/>
         </w:numPr>
-        <w:pBdr>
-          <w:top w:space="0" w:sz="0" w:val="nil"/>
-          <w:left w:space="0" w:sz="0" w:val="nil"/>
-          <w:bottom w:space="0" w:sz="0" w:val="nil"/>
-          <w:right w:space="0" w:sz="0" w:val="nil"/>
-          <w:between w:space="0" w:sz="0" w:val="nil"/>
-        </w:pBdr>
-        <w:spacing w:after="0" w:lineRule="auto"/>
+        <w:spacing w:after="0" w:afterAutospacing="0"/>
         <w:ind w:left="720" w:hanging="360"/>
         <w:rPr>
-          <w:rFonts w:ascii="Calibri" w:cs="Calibri" w:eastAsia="Calibri" w:hAnsi="Calibri"/>
-          <w:color w:val="000000"/>
-          <w:sz w:val="20"/>
-          <w:szCs w:val="20"/>
-        </w:rPr>
-      </w:pPr>
-      <w:r>
-        <w:rPr>
-          <w:rFonts w:ascii="Calibri" w:cs="Calibri" w:eastAsia="Calibri" w:hAnsi="Calibri"/>
-          <w:sz w:val="20"/>
-          <w:szCs w:val="20"/>
-          <w:rtl w:val="0"/>
-        </w:rPr>
-        <w:t xml:space="preserve">Kdykoli vejdeš do nové místnosti, můžeš utracením bodu vůle rozpoznat, jestli se v ní nacházejí nějaké cennosti a kde. Talent se týká jen zlata a šperků, nikoli jedinečných artefaktů.</w:t>
-      </w:r>
-      <w:r>
-        <w:rPr>
-          <w:rtl w:val="0"/>
-        </w:rPr>
+          <w:sz w:val="20"/>
+          <w:szCs w:val="20"/>
+          <w:u w:val="none"/>
+        </w:rPr>
+      </w:pPr>
+      <w:r>
+        <w:rPr>
+          <w:sz w:val="20"/>
+          <w:szCs w:val="20"/>
+          <w:rtl w:val="0"/>
+        </w:rPr>
+        <w:t xml:space="preserve">Utracením jednoho bodu vůle automaticky uspěješ při hodu na dostupnost (strana 179) pro neobvyklý předmět. Za dva body vůle pro vzácný předmět. Můžeš si napřed hodit a body případně utratit, teprve když neuspěješ. </w:t>
+      </w:r>
+      <w:r>
+        <w:rPr>
+          <w:sz w:val="16"/>
+          <w:szCs w:val="16"/>
+          <w:rtl w:val="0"/>
+        </w:rPr>
+        <w:t xml:space="preserve">(</w:t>
+      </w:r>
+      <w:r>
+        <w:rPr>
+          <w:i w:val="1"/>
+          <w:iCs w:val="1"/>
+          <w:sz w:val="16"/>
+          <w:szCs w:val="16"/>
+          <w:rtl w:val="0"/>
+        </w:rPr>
+        <w:t xml:space="preserve">NEOBVYKLÝ: Hoď si k6. Při hodu 4 nebo víc je k mání k6 jednotek nebo kusů. Každý týden je možné hodit znova. VZÁCNÝ: Hoď si k6. Při hodu 6 je k mání jedna</w:t>
+      </w:r>
+      <w:r>
+        <w:rPr>
+          <w:sz w:val="16"/>
+          <w:szCs w:val="16"/>
+          <w:rtl w:val="0"/>
+        </w:rPr>
+        <w:t xml:space="preserve">)</w:t>
       </w:r>
     </w:p>
     <w:p>
       <w:pPr>
         <w:numPr>
           <w:ilvl w:val="0"/>
-          <w:numId w:val="92"/>
+          <w:numId w:val="93"/>
         </w:numPr>
-        <w:pBdr>
-          <w:top w:space="0" w:sz="0" w:val="nil"/>
-          <w:left w:space="0" w:sz="0" w:val="nil"/>
-          <w:bottom w:space="0" w:sz="0" w:val="nil"/>
-          <w:right w:space="0" w:sz="0" w:val="nil"/>
-          <w:between w:space="0" w:sz="0" w:val="nil"/>
-        </w:pBdr>
         <w:ind w:left="720" w:hanging="360"/>
         <w:rPr>
-          <w:rFonts w:ascii="Calibri" w:cs="Calibri" w:eastAsia="Calibri" w:hAnsi="Calibri"/>
-          <w:color w:val="000000"/>
-          <w:sz w:val="20"/>
-          <w:szCs w:val="20"/>
-        </w:rPr>
-      </w:pPr>
-      <w:r>
-        <w:rPr>
-          <w:rFonts w:ascii="Calibri" w:cs="Calibri" w:eastAsia="Calibri" w:hAnsi="Calibri"/>
-          <w:sz w:val="20"/>
-          <w:szCs w:val="20"/>
-          <w:rtl w:val="0"/>
-        </w:rPr>
-        <w:t xml:space="preserve">Za každý utracený bod vůle najdeš po kapsách 1 zlaťák, a to i když tě před chvílí někdo prohledal nebo se ti stalo něco podobného.</w:t>
-      </w:r>
-      <w:r>
-        <w:rPr>
-          <w:rtl w:val="0"/>
-        </w:rPr>
-      </w:r>
-    </w:p>
-    <w:p>
-      <w:pPr>
-        <w:rPr>
-          <w:rFonts w:ascii="Calibri" w:cs="Calibri" w:eastAsia="Calibri" w:hAnsi="Calibri"/>
+          <w:sz w:val="20"/>
+          <w:szCs w:val="20"/>
+          <w:u w:val="none"/>
+        </w:rPr>
+      </w:pPr>
+      <w:r>
+        <w:rPr>
+          <w:sz w:val="20"/>
+          <w:szCs w:val="20"/>
+          <w:rtl w:val="0"/>
+        </w:rPr>
+        <w:t xml:space="preserve">Když prohledáváš místnost, můžeš v ní utracením bodu vůle najít všechny tajné dveře a skryté poklady.</w:t>
+      </w:r>
+    </w:p>
+    <w:p>
+      <w:pPr>
+        <w:jc w:val="center"/>
+        <w:rPr>
           <w:b w:val="1"/>
-          <w:sz w:val="20"/>
-          <w:szCs w:val="20"/>
-        </w:rPr>
-      </w:pPr>
-      <w:r>
-        <w:br w:type="page"/>
-      </w:r>
+          <w:bCs w:val="1"/>
+          <w:sz w:val="20"/>
+          <w:szCs w:val="20"/>
+        </w:rPr>
+      </w:pPr>
       <w:r>
         <w:rPr>
           <w:rtl w:val="0"/>
@@ -19153,6 +19364,7 @@
         <w:rPr>
           <w:rFonts w:ascii="Calibri" w:cs="Calibri" w:eastAsia="Calibri" w:hAnsi="Calibri"/>
           <w:b w:val="1"/>
+          <w:bCs w:val="1"/>
           <w:sz w:val="20"/>
           <w:szCs w:val="20"/>
           <w:rtl w:val="0"/>
@@ -19881,6 +20093,7 @@
         <w:rPr>
           <w:rFonts w:ascii="Calibri" w:cs="Calibri" w:eastAsia="Calibri" w:hAnsi="Calibri"/>
           <w:b w:val="1"/>
+          <w:bCs w:val="1"/>
           <w:sz w:val="20"/>
           <w:szCs w:val="20"/>
           <w:rtl w:val="0"/>
@@ -19927,6 +20140,7 @@
         <w:rPr>
           <w:rFonts w:ascii="Calibri" w:cs="Calibri" w:eastAsia="Calibri" w:hAnsi="Calibri"/>
           <w:i w:val="1"/>
+          <w:iCs w:val="1"/>
           <w:sz w:val="20"/>
           <w:szCs w:val="20"/>
           <w:rtl w:val="0"/>
@@ -20606,6 +20820,7 @@
         <w:rPr>
           <w:rFonts w:ascii="Calibri" w:cs="Calibri" w:eastAsia="Calibri" w:hAnsi="Calibri"/>
           <w:b w:val="1"/>
+          <w:bCs w:val="1"/>
           <w:sz w:val="20"/>
           <w:szCs w:val="20"/>
           <w:rtl w:val="0"/>
@@ -21256,6 +21471,7 @@
         <w:rPr>
           <w:rFonts w:ascii="Calibri" w:cs="Calibri" w:eastAsia="Calibri" w:hAnsi="Calibri"/>
           <w:b w:val="1"/>
+          <w:bCs w:val="1"/>
           <w:sz w:val="20"/>
           <w:szCs w:val="20"/>
           <w:rtl w:val="0"/>
@@ -21911,6 +22127,7 @@
         <w:rPr>
           <w:rFonts w:ascii="Calibri" w:cs="Calibri" w:eastAsia="Calibri" w:hAnsi="Calibri"/>
           <w:b w:val="1"/>
+          <w:bCs w:val="1"/>
           <w:sz w:val="20"/>
           <w:szCs w:val="20"/>
           <w:rtl w:val="0"/>
@@ -22566,6 +22783,7 @@
         <w:rPr>
           <w:rFonts w:ascii="Calibri" w:cs="Calibri" w:eastAsia="Calibri" w:hAnsi="Calibri"/>
           <w:b w:val="1"/>
+          <w:bCs w:val="1"/>
           <w:sz w:val="20"/>
           <w:szCs w:val="20"/>
           <w:rtl w:val="0"/>
@@ -23413,6 +23631,7 @@
         <w:rPr>
           <w:rFonts w:ascii="Calibri" w:cs="Calibri" w:eastAsia="Calibri" w:hAnsi="Calibri"/>
           <w:b w:val="1"/>
+          <w:bCs w:val="1"/>
           <w:sz w:val="20"/>
           <w:szCs w:val="20"/>
         </w:rPr>
@@ -23436,6 +23655,7 @@
         <w:rPr>
           <w:rFonts w:ascii="Calibri" w:cs="Calibri" w:eastAsia="Calibri" w:hAnsi="Calibri"/>
           <w:b w:val="1"/>
+          <w:bCs w:val="1"/>
           <w:sz w:val="20"/>
           <w:szCs w:val="20"/>
           <w:rtl w:val="0"/>
@@ -24215,6 +24435,7 @@
         <w:rPr>
           <w:rFonts w:ascii="Calibri" w:cs="Calibri" w:eastAsia="Calibri" w:hAnsi="Calibri"/>
           <w:b w:val="1"/>
+          <w:bCs w:val="1"/>
           <w:sz w:val="20"/>
           <w:szCs w:val="20"/>
           <w:rtl w:val="0"/>
@@ -25052,6 +25273,7 @@
         <w:rPr>
           <w:rFonts w:ascii="Calibri" w:cs="Calibri" w:eastAsia="Calibri" w:hAnsi="Calibri"/>
           <w:b w:val="1"/>
+          <w:bCs w:val="1"/>
           <w:sz w:val="20"/>
           <w:szCs w:val="20"/>
           <w:rtl w:val="0"/>
@@ -25838,6 +26060,7 @@
         <w:rPr>
           <w:rFonts w:ascii="Calibri" w:cs="Calibri" w:eastAsia="Calibri" w:hAnsi="Calibri"/>
           <w:b w:val="1"/>
+          <w:bCs w:val="1"/>
           <w:sz w:val="20"/>
           <w:szCs w:val="20"/>
           <w:rtl w:val="0"/>
@@ -25908,6 +26131,7 @@
         <w:rPr>
           <w:rFonts w:ascii="Calibri" w:cs="Calibri" w:eastAsia="Calibri" w:hAnsi="Calibri"/>
           <w:i w:val="1"/>
+          <w:iCs w:val="1"/>
           <w:color w:val="000000"/>
           <w:sz w:val="20"/>
           <w:szCs w:val="20"/>
@@ -25929,6 +26153,7 @@
         <w:rPr>
           <w:rFonts w:ascii="Calibri" w:cs="Calibri" w:eastAsia="Calibri" w:hAnsi="Calibri"/>
           <w:b w:val="1"/>
+          <w:bCs w:val="1"/>
           <w:color w:val="000000"/>
           <w:sz w:val="20"/>
           <w:szCs w:val="20"/>
@@ -26038,6 +26263,7 @@
         <w:rPr>
           <w:rFonts w:ascii="Calibri" w:cs="Calibri" w:eastAsia="Calibri" w:hAnsi="Calibri"/>
           <w:b w:val="1"/>
+          <w:bCs w:val="1"/>
           <w:sz w:val="20"/>
           <w:szCs w:val="20"/>
           <w:rtl w:val="0"/>
@@ -26173,6 +26399,7 @@
         <w:rPr>
           <w:rFonts w:ascii="Calibri" w:cs="Calibri" w:eastAsia="Calibri" w:hAnsi="Calibri"/>
           <w:i w:val="1"/>
+          <w:iCs w:val="1"/>
           <w:color w:val="000000"/>
           <w:sz w:val="20"/>
           <w:szCs w:val="20"/>
@@ -26194,6 +26421,7 @@
         <w:rPr>
           <w:rFonts w:ascii="Calibri" w:cs="Calibri" w:eastAsia="Calibri" w:hAnsi="Calibri"/>
           <w:i w:val="1"/>
+          <w:iCs w:val="1"/>
           <w:color w:val="000000"/>
           <w:sz w:val="20"/>
           <w:szCs w:val="20"/>
@@ -26225,6 +26453,7 @@
         <w:rPr>
           <w:rFonts w:ascii="Calibri" w:cs="Calibri" w:eastAsia="Calibri" w:hAnsi="Calibri"/>
           <w:b w:val="1"/>
+          <w:bCs w:val="1"/>
           <w:sz w:val="20"/>
           <w:szCs w:val="20"/>
           <w:rtl w:val="0"/>
@@ -26345,6 +26574,7 @@
         <w:rPr>
           <w:rFonts w:ascii="Calibri" w:cs="Calibri" w:eastAsia="Calibri" w:hAnsi="Calibri"/>
           <w:b w:val="1"/>
+          <w:bCs w:val="1"/>
           <w:sz w:val="20"/>
           <w:szCs w:val="20"/>
           <w:rtl w:val="0"/>
@@ -26354,6 +26584,7 @@
       <w:r>
         <w:rPr>
           <w:b w:val="1"/>
+          <w:bCs w:val="1"/>
           <w:sz w:val="20"/>
           <w:szCs w:val="20"/>
           <w:rtl w:val="0"/>
@@ -26364,6 +26595,7 @@
         <w:rPr>
           <w:rFonts w:ascii="Calibri" w:cs="Calibri" w:eastAsia="Calibri" w:hAnsi="Calibri"/>
           <w:b w:val="1"/>
+          <w:bCs w:val="1"/>
           <w:sz w:val="20"/>
           <w:szCs w:val="20"/>
           <w:rtl w:val="0"/>
@@ -26373,6 +26605,7 @@
       <w:r>
         <w:rPr>
           <w:b w:val="1"/>
+          <w:bCs w:val="1"/>
           <w:sz w:val="20"/>
           <w:szCs w:val="20"/>
           <w:rtl w:val="0"/>
@@ -26383,6 +26616,7 @@
         <w:rPr>
           <w:rFonts w:ascii="Calibri" w:cs="Calibri" w:eastAsia="Calibri" w:hAnsi="Calibri"/>
           <w:b w:val="1"/>
+          <w:bCs w:val="1"/>
           <w:sz w:val="20"/>
           <w:szCs w:val="20"/>
           <w:rtl w:val="0"/>
@@ -26453,6 +26687,7 @@
         <w:rPr>
           <w:rFonts w:ascii="Calibri" w:cs="Calibri" w:eastAsia="Calibri" w:hAnsi="Calibri"/>
           <w:b w:val="1"/>
+          <w:bCs w:val="1"/>
           <w:sz w:val="20"/>
           <w:szCs w:val="20"/>
           <w:rtl w:val="0"/>
@@ -26462,6 +26697,7 @@
       <w:r>
         <w:rPr>
           <w:b w:val="1"/>
+          <w:bCs w:val="1"/>
           <w:sz w:val="20"/>
           <w:szCs w:val="20"/>
           <w:rtl w:val="0"/>
@@ -26971,6 +27207,7 @@
         <w:rPr>
           <w:rFonts w:ascii="Calibri" w:cs="Calibri" w:eastAsia="Calibri" w:hAnsi="Calibri"/>
           <w:b w:val="1"/>
+          <w:bCs w:val="1"/>
           <w:sz w:val="20"/>
           <w:szCs w:val="20"/>
         </w:rPr>
@@ -26994,6 +27231,7 @@
         <w:rPr>
           <w:rFonts w:ascii="Calibri" w:cs="Calibri" w:eastAsia="Calibri" w:hAnsi="Calibri"/>
           <w:b w:val="1"/>
+          <w:bCs w:val="1"/>
           <w:sz w:val="20"/>
           <w:szCs w:val="20"/>
           <w:rtl w:val="0"/>
@@ -27802,6 +28040,7 @@
         <w:rPr>
           <w:rFonts w:ascii="Calibri" w:cs="Calibri" w:eastAsia="Calibri" w:hAnsi="Calibri"/>
           <w:b w:val="1"/>
+          <w:bCs w:val="1"/>
           <w:sz w:val="20"/>
           <w:szCs w:val="20"/>
           <w:rtl w:val="0"/>
@@ -28503,6 +28742,7 @@
         <w:rPr>
           <w:rFonts w:ascii="Calibri" w:cs="Calibri" w:eastAsia="Calibri" w:hAnsi="Calibri"/>
           <w:b w:val="1"/>
+          <w:bCs w:val="1"/>
           <w:sz w:val="20"/>
           <w:szCs w:val="20"/>
           <w:rtl w:val="0"/>
@@ -29354,6 +29594,7 @@
         <w:rPr>
           <w:rFonts w:ascii="Calibri" w:cs="Calibri" w:eastAsia="Calibri" w:hAnsi="Calibri"/>
           <w:b w:val="1"/>
+          <w:bCs w:val="1"/>
           <w:sz w:val="20"/>
           <w:szCs w:val="20"/>
         </w:rPr>
@@ -29377,6 +29618,7 @@
         <w:rPr>
           <w:rFonts w:ascii="Calibri" w:cs="Calibri" w:eastAsia="Calibri" w:hAnsi="Calibri"/>
           <w:b w:val="1"/>
+          <w:bCs w:val="1"/>
           <w:sz w:val="20"/>
           <w:szCs w:val="20"/>
           <w:rtl w:val="0"/>
@@ -29864,6 +30106,7 @@
         <w:rPr>
           <w:rFonts w:ascii="Calibri" w:cs="Calibri" w:eastAsia="Calibri" w:hAnsi="Calibri"/>
           <w:b w:val="1"/>
+          <w:bCs w:val="1"/>
           <w:sz w:val="20"/>
           <w:szCs w:val="20"/>
           <w:rtl w:val="0"/>
@@ -30207,6 +30450,7 @@
         <w:rPr>
           <w:rFonts w:ascii="Calibri" w:cs="Calibri" w:eastAsia="Calibri" w:hAnsi="Calibri"/>
           <w:i w:val="1"/>
+          <w:iCs w:val="1"/>
           <w:sz w:val="20"/>
           <w:szCs w:val="20"/>
           <w:rtl w:val="0"/>
@@ -30423,6 +30667,7 @@
         <w:rPr>
           <w:rFonts w:ascii="Calibri" w:cs="Calibri" w:eastAsia="Calibri" w:hAnsi="Calibri"/>
           <w:b w:val="1"/>
+          <w:bCs w:val="1"/>
           <w:sz w:val="20"/>
           <w:szCs w:val="20"/>
           <w:rtl w:val="0"/>
@@ -40104,87 +40349,105 @@
       <w:pPr>
         <w:ind w:left="720" w:hanging="360"/>
       </w:pPr>
-      <w:rPr/>
+      <w:rPr>
+        <w:u w:val="none"/>
+      </w:rPr>
     </w:lvl>
     <w:lvl w:ilvl="1">
       <w:start w:val="1"/>
+      <w:numFmt w:val="upperLetter"/>
+      <w:lvlText w:val="%2."/>
+      <w:lvlJc w:val="left"/>
+      <w:pPr>
+        <w:ind w:left="1440" w:hanging="360"/>
+      </w:pPr>
+      <w:rPr>
+        <w:u w:val="none"/>
+      </w:rPr>
+    </w:lvl>
+    <w:lvl w:ilvl="2">
+      <w:start w:val="1"/>
+      <w:numFmt w:val="decimal"/>
+      <w:lvlText w:val="%3."/>
+      <w:lvlJc w:val="left"/>
+      <w:pPr>
+        <w:ind w:left="2160" w:hanging="360"/>
+      </w:pPr>
+      <w:rPr>
+        <w:u w:val="none"/>
+      </w:rPr>
+    </w:lvl>
+    <w:lvl w:ilvl="3">
+      <w:start w:val="1"/>
       <w:numFmt w:val="lowerLetter"/>
-      <w:lvlText w:val="%2."/>
-      <w:lvlJc w:val="left"/>
-      <w:pPr>
-        <w:ind w:left="1440" w:hanging="360"/>
-      </w:pPr>
-      <w:rPr/>
-    </w:lvl>
-    <w:lvl w:ilvl="2">
+      <w:lvlText w:val="%4)"/>
+      <w:lvlJc w:val="left"/>
+      <w:pPr>
+        <w:ind w:left="2880" w:hanging="360"/>
+      </w:pPr>
+      <w:rPr>
+        <w:u w:val="none"/>
+      </w:rPr>
+    </w:lvl>
+    <w:lvl w:ilvl="4">
+      <w:start w:val="1"/>
+      <w:numFmt w:val="decimal"/>
+      <w:lvlText w:val="(%5)"/>
+      <w:lvlJc w:val="left"/>
+      <w:pPr>
+        <w:ind w:left="3600" w:hanging="360"/>
+      </w:pPr>
+      <w:rPr>
+        <w:u w:val="none"/>
+      </w:rPr>
+    </w:lvl>
+    <w:lvl w:ilvl="5">
+      <w:start w:val="1"/>
+      <w:numFmt w:val="lowerLetter"/>
+      <w:lvlText w:val="(%6)"/>
+      <w:lvlJc w:val="left"/>
+      <w:pPr>
+        <w:ind w:left="4320" w:hanging="360"/>
+      </w:pPr>
+      <w:rPr>
+        <w:u w:val="none"/>
+      </w:rPr>
+    </w:lvl>
+    <w:lvl w:ilvl="6">
       <w:start w:val="1"/>
       <w:numFmt w:val="lowerRoman"/>
-      <w:lvlText w:val="%3."/>
+      <w:lvlText w:val="(%7)"/>
       <w:lvlJc w:val="right"/>
       <w:pPr>
-        <w:ind w:left="2160" w:hanging="180"/>
-      </w:pPr>
-      <w:rPr/>
-    </w:lvl>
-    <w:lvl w:ilvl="3">
-      <w:start w:val="1"/>
-      <w:numFmt w:val="decimal"/>
-      <w:lvlText w:val="%4."/>
-      <w:lvlJc w:val="left"/>
-      <w:pPr>
-        <w:ind w:left="2880" w:hanging="360"/>
-      </w:pPr>
-      <w:rPr/>
-    </w:lvl>
-    <w:lvl w:ilvl="4">
+        <w:ind w:left="5040" w:hanging="360"/>
+      </w:pPr>
+      <w:rPr>
+        <w:u w:val="none"/>
+      </w:rPr>
+    </w:lvl>
+    <w:lvl w:ilvl="7">
       <w:start w:val="1"/>
       <w:numFmt w:val="lowerLetter"/>
-      <w:lvlText w:val="%5."/>
-      <w:lvlJc w:val="left"/>
-      <w:pPr>
-        <w:ind w:left="3600" w:hanging="360"/>
-      </w:pPr>
-      <w:rPr/>
-    </w:lvl>
-    <w:lvl w:ilvl="5">
+      <w:lvlText w:val="(%8)"/>
+      <w:lvlJc w:val="left"/>
+      <w:pPr>
+        <w:ind w:left="5760" w:hanging="360"/>
+      </w:pPr>
+      <w:rPr>
+        <w:u w:val="none"/>
+      </w:rPr>
+    </w:lvl>
+    <w:lvl w:ilvl="8">
       <w:start w:val="1"/>
       <w:numFmt w:val="lowerRoman"/>
-      <w:lvlText w:val="%6."/>
+      <w:lvlText w:val="(%9)"/>
       <w:lvlJc w:val="right"/>
       <w:pPr>
-        <w:ind w:left="4320" w:hanging="180"/>
-      </w:pPr>
-      <w:rPr/>
-    </w:lvl>
-    <w:lvl w:ilvl="6">
-      <w:start w:val="1"/>
-      <w:numFmt w:val="decimal"/>
-      <w:lvlText w:val="%7."/>
-      <w:lvlJc w:val="left"/>
-      <w:pPr>
-        <w:ind w:left="5040" w:hanging="360"/>
-      </w:pPr>
-      <w:rPr/>
-    </w:lvl>
-    <w:lvl w:ilvl="7">
-      <w:start w:val="1"/>
-      <w:numFmt w:val="lowerLetter"/>
-      <w:lvlText w:val="%8."/>
-      <w:lvlJc w:val="left"/>
-      <w:pPr>
-        <w:ind w:left="5760" w:hanging="360"/>
-      </w:pPr>
-      <w:rPr/>
-    </w:lvl>
-    <w:lvl w:ilvl="8">
-      <w:start w:val="1"/>
-      <w:numFmt w:val="lowerRoman"/>
-      <w:lvlText w:val="%9."/>
-      <w:lvlJc w:val="right"/>
-      <w:pPr>
-        <w:ind w:left="6480" w:hanging="180"/>
-      </w:pPr>
-      <w:rPr/>
+        <w:ind w:left="6480" w:hanging="360"/>
+      </w:pPr>
+      <w:rPr>
+        <w:u w:val="none"/>
+      </w:rPr>
     </w:lvl>
   </w:abstractNum>
   <w:num w:numId="1">
@@ -40527,6 +40790,7 @@
     </w:pPr>
     <w:rPr>
       <w:b w:val="1"/>
+      <w:bCs w:val="1"/>
       <w:sz w:val="36"/>
       <w:szCs w:val="36"/>
     </w:rPr>
@@ -40542,6 +40806,7 @@
     </w:pPr>
     <w:rPr>
       <w:b w:val="1"/>
+      <w:bCs w:val="1"/>
       <w:sz w:val="28"/>
       <w:szCs w:val="28"/>
     </w:rPr>
@@ -40557,6 +40822,7 @@
     </w:pPr>
     <w:rPr>
       <w:b w:val="1"/>
+      <w:bCs w:val="1"/>
       <w:sz w:val="24"/>
       <w:szCs w:val="24"/>
     </w:rPr>
@@ -40572,6 +40838,7 @@
     </w:pPr>
     <w:rPr>
       <w:b w:val="1"/>
+      <w:bCs w:val="1"/>
     </w:rPr>
   </w:style>
   <w:style w:type="paragraph" w:styleId="Heading6">
@@ -40585,6 +40852,7 @@
     </w:pPr>
     <w:rPr>
       <w:b w:val="1"/>
+      <w:bCs w:val="1"/>
       <w:sz w:val="20"/>
       <w:szCs w:val="20"/>
     </w:rPr>
@@ -40881,6 +41149,7 @@
     <w:rPr>
       <w:rFonts w:ascii="Georgia" w:cs="Georgia" w:eastAsia="Georgia" w:hAnsi="Georgia"/>
       <w:i w:val="1"/>
+      <w:iCs w:val="1"/>
       <w:color w:val="666666"/>
       <w:sz w:val="48"/>
       <w:szCs w:val="48"/>
@@ -41186,7 +41455,7 @@
 
 <file path=customXML/item1.xml><?xml version="1.0" encoding="utf-8"?>
 <go:gDocsCustomXmlDataStorage xmlns:go="http://customooxmlschemas.google.com/" xmlns:r="http://schemas.openxmlformats.org/officeDocument/2006/relationships" uri="GoogleDocsCustomDataVersion2">
-  <go:docsCustomData xmlns:go="http://customooxmlschemas.google.com/" roundtripDataSignature="AMtx7miRZzmj8OxZnjon0XTrb5gxCWxUTQ==">CgMxLjAyDmguYTY1amd6Zm4wcnpkOABqIwoUc3VnZ2VzdC5keDh4anphY2k1ODMSC0xpemFyZCBLaW5naiMKFHN1Z2dlc3QucmhpcWE0M3RpaDhnEgtMaXphcmQgS2luZ3IhMUV4ZVVLZk5IZXNEM3AyWGFmZkhDNmd4eEJOUjAzcHhj</go:docsCustomData>
+  <go:docsCustomData xmlns:go="http://customooxmlschemas.google.com/" roundtripDataSignature="AMtx7mje7toQ7TcWOMGeIhZNy+C73maEng==">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</go:docsCustomData>
 </go:gDocsCustomXmlDataStorage>
 </file>
 

</xml_diff>

<commit_message>
feat: replace Cesta zlata with Cesta pokladu
Cesta zlata was removed from the rules. The static talent data now carries
Cesta pokladu (kupec-cesta-pokladu) from the Google Drive talents document,
which is synced into import_files, and characters with Cesta zlata are
migrated to Cesta pokladu on load with their rank kept. Rebuilt FL_1.8.6.apk.

Co-Authored-By: Claude Opus 5.5 <noreply@anthropic.com>
</commit_message>
<xml_diff>
--- a/zz-denik/import_files/UpdatedGeneralTalentFormatted (2).docx
+++ b/zz-denik/import_files/UpdatedGeneralTalentFormatted (2).docx
@@ -67,6 +67,7 @@
         <w:rPr>
           <w:rFonts w:ascii="Calibri" w:cs="Calibri" w:eastAsia="Calibri" w:hAnsi="Calibri"/>
           <w:i w:val="1"/>
+          <w:iCs w:val="1"/>
           <w:sz w:val="20"/>
           <w:szCs w:val="20"/>
           <w:rtl w:val="0"/>
@@ -186,6 +187,7 @@
         <w:rPr>
           <w:rFonts w:ascii="Calibri" w:cs="Calibri" w:eastAsia="Calibri" w:hAnsi="Calibri"/>
           <w:i w:val="1"/>
+          <w:iCs w:val="1"/>
           <w:sz w:val="20"/>
           <w:szCs w:val="20"/>
           <w:rtl w:val="0"/>
@@ -205,6 +207,7 @@
         <w:rPr>
           <w:rFonts w:ascii="Calibri" w:cs="Calibri" w:eastAsia="Calibri" w:hAnsi="Calibri"/>
           <w:i w:val="1"/>
+          <w:iCs w:val="1"/>
           <w:sz w:val="20"/>
           <w:szCs w:val="20"/>
           <w:rtl w:val="0"/>
@@ -302,6 +305,7 @@
       <w:r>
         <w:rPr>
           <w:i w:val="1"/>
+          <w:iCs w:val="1"/>
           <w:sz w:val="20"/>
           <w:szCs w:val="20"/>
           <w:rtl w:val="0"/>
@@ -319,6 +323,7 @@
       <w:r>
         <w:rPr>
           <w:i w:val="1"/>
+          <w:iCs w:val="1"/>
           <w:sz w:val="20"/>
           <w:szCs w:val="20"/>
           <w:rtl w:val="0"/>
@@ -358,6 +363,7 @@
       <w:r>
         <w:rPr>
           <w:i w:val="1"/>
+          <w:iCs w:val="1"/>
           <w:sz w:val="20"/>
           <w:szCs w:val="20"/>
           <w:rtl w:val="0"/>
@@ -479,6 +485,7 @@
       <w:r>
         <w:rPr>
           <w:i w:val="1"/>
+          <w:iCs w:val="1"/>
           <w:sz w:val="20"/>
           <w:szCs w:val="20"/>
           <w:highlight w:val="yellow"/>
@@ -498,6 +505,7 @@
       <w:r>
         <w:rPr>
           <w:i w:val="1"/>
+          <w:iCs w:val="1"/>
           <w:sz w:val="20"/>
           <w:szCs w:val="20"/>
           <w:highlight w:val="yellow"/>
@@ -646,7 +654,7 @@
       <w:pPr>
         <w:numPr>
           <w:ilvl w:val="0"/>
-          <w:numId w:val="93"/>
+          <w:numId w:val="92"/>
         </w:numPr>
         <w:pBdr>
           <w:top w:space="0" w:sz="0" w:val="nil"/>
@@ -679,7 +687,7 @@
       <w:pPr>
         <w:numPr>
           <w:ilvl w:val="0"/>
-          <w:numId w:val="93"/>
+          <w:numId w:val="92"/>
         </w:numPr>
         <w:pBdr>
           <w:top w:space="0" w:sz="0" w:val="nil"/>
@@ -712,7 +720,7 @@
       <w:pPr>
         <w:numPr>
           <w:ilvl w:val="0"/>
-          <w:numId w:val="93"/>
+          <w:numId w:val="92"/>
         </w:numPr>
         <w:pBdr>
           <w:top w:space="0" w:sz="0" w:val="nil"/>
@@ -744,6 +752,7 @@
         <w:rPr>
           <w:rFonts w:ascii="Calibri" w:cs="Calibri" w:eastAsia="Calibri" w:hAnsi="Calibri"/>
           <w:i w:val="1"/>
+          <w:iCs w:val="1"/>
           <w:color w:val="000000"/>
           <w:sz w:val="20"/>
           <w:szCs w:val="20"/>
@@ -766,7 +775,7 @@
       <w:pPr>
         <w:numPr>
           <w:ilvl w:val="0"/>
-          <w:numId w:val="93"/>
+          <w:numId w:val="92"/>
         </w:numPr>
         <w:pBdr>
           <w:top w:space="0" w:sz="0" w:val="nil"/>
@@ -787,6 +796,7 @@
         <w:rPr>
           <w:rFonts w:ascii="Calibri" w:cs="Calibri" w:eastAsia="Calibri" w:hAnsi="Calibri"/>
           <w:i w:val="1"/>
+          <w:iCs w:val="1"/>
           <w:color w:val="000000"/>
           <w:sz w:val="20"/>
           <w:szCs w:val="20"/>
@@ -878,6 +888,7 @@
         <w:rPr>
           <w:rFonts w:ascii="Calibri" w:cs="Calibri" w:eastAsia="Calibri" w:hAnsi="Calibri"/>
           <w:i w:val="1"/>
+          <w:iCs w:val="1"/>
           <w:color w:val="000000"/>
           <w:sz w:val="20"/>
           <w:szCs w:val="20"/>
@@ -899,6 +910,7 @@
         <w:rPr>
           <w:rFonts w:ascii="Calibri" w:cs="Calibri" w:eastAsia="Calibri" w:hAnsi="Calibri"/>
           <w:i w:val="1"/>
+          <w:iCs w:val="1"/>
           <w:color w:val="000000"/>
           <w:sz w:val="20"/>
           <w:szCs w:val="20"/>
@@ -953,6 +965,7 @@
         <w:rPr>
           <w:rFonts w:ascii="Calibri" w:cs="Calibri" w:eastAsia="Calibri" w:hAnsi="Calibri"/>
           <w:i w:val="1"/>
+          <w:iCs w:val="1"/>
           <w:color w:val="000000"/>
           <w:sz w:val="20"/>
           <w:szCs w:val="20"/>
@@ -974,6 +987,7 @@
         <w:rPr>
           <w:rFonts w:ascii="Calibri" w:cs="Calibri" w:eastAsia="Calibri" w:hAnsi="Calibri"/>
           <w:i w:val="1"/>
+          <w:iCs w:val="1"/>
           <w:color w:val="000000"/>
           <w:sz w:val="20"/>
           <w:szCs w:val="20"/>
@@ -1022,6 +1036,7 @@
         <w:rPr>
           <w:rFonts w:ascii="Calibri" w:cs="Calibri" w:eastAsia="Calibri" w:hAnsi="Calibri"/>
           <w:i w:val="1"/>
+          <w:iCs w:val="1"/>
           <w:color w:val="000000"/>
           <w:sz w:val="20"/>
           <w:szCs w:val="20"/>
@@ -1113,6 +1128,7 @@
         <w:rPr>
           <w:rFonts w:ascii="Calibri" w:cs="Calibri" w:eastAsia="Calibri" w:hAnsi="Calibri"/>
           <w:i w:val="1"/>
+          <w:iCs w:val="1"/>
           <w:color w:val="000000"/>
           <w:sz w:val="20"/>
           <w:szCs w:val="20"/>
@@ -1134,6 +1150,7 @@
         <w:rPr>
           <w:rFonts w:ascii="Calibri" w:cs="Calibri" w:eastAsia="Calibri" w:hAnsi="Calibri"/>
           <w:i w:val="1"/>
+          <w:iCs w:val="1"/>
           <w:color w:val="000000"/>
           <w:sz w:val="20"/>
           <w:szCs w:val="20"/>
@@ -1188,6 +1205,7 @@
         <w:rPr>
           <w:rFonts w:ascii="Calibri" w:cs="Calibri" w:eastAsia="Calibri" w:hAnsi="Calibri"/>
           <w:i w:val="1"/>
+          <w:iCs w:val="1"/>
           <w:color w:val="000000"/>
           <w:sz w:val="20"/>
           <w:szCs w:val="20"/>
@@ -1521,6 +1539,30 @@
     </w:p>
     <w:p>
       <w:pPr>
+        <w:pBdr>
+          <w:top w:space="0" w:sz="0" w:val="nil"/>
+          <w:left w:space="0" w:sz="0" w:val="nil"/>
+          <w:bottom w:space="0" w:sz="0" w:val="nil"/>
+          <w:right w:space="0" w:sz="0" w:val="nil"/>
+          <w:between w:space="0" w:sz="0" w:val="nil"/>
+        </w:pBdr>
+        <w:jc w:val="center"/>
+        <w:rPr>
+          <w:sz w:val="20"/>
+          <w:szCs w:val="20"/>
+        </w:rPr>
+      </w:pPr>
+      <w:r>
+        <w:rPr>
+          <w:sz w:val="20"/>
+          <w:szCs w:val="20"/>
+          <w:rtl w:val="0"/>
+        </w:rPr>
+        <w:t xml:space="preserve">Dungeon delver</w:t>
+      </w:r>
+    </w:p>
+    <w:p>
+      <w:pPr>
         <w:ind w:left="360" w:firstLine="0"/>
         <w:jc w:val="center"/>
         <w:rPr>
@@ -1616,6 +1658,7 @@
         <w:rPr>
           <w:rFonts w:ascii="Calibri" w:cs="Calibri" w:eastAsia="Calibri" w:hAnsi="Calibri"/>
           <w:i w:val="1"/>
+          <w:iCs w:val="1"/>
           <w:color w:val="000000"/>
           <w:sz w:val="20"/>
           <w:szCs w:val="20"/>
@@ -1754,6 +1797,7 @@
         <w:rPr>
           <w:rFonts w:ascii="Calibri" w:cs="Calibri" w:eastAsia="Calibri" w:hAnsi="Calibri"/>
           <w:i w:val="1"/>
+          <w:iCs w:val="1"/>
           <w:sz w:val="20"/>
           <w:szCs w:val="20"/>
           <w:rtl w:val="0"/>
@@ -1865,6 +1909,7 @@
         <w:rPr>
           <w:rFonts w:ascii="Calibri" w:cs="Calibri" w:eastAsia="Calibri" w:hAnsi="Calibri"/>
           <w:i w:val="1"/>
+          <w:iCs w:val="1"/>
           <w:color w:val="000000"/>
           <w:sz w:val="20"/>
           <w:szCs w:val="20"/>
@@ -1919,6 +1964,7 @@
         <w:rPr>
           <w:rFonts w:ascii="Calibri" w:cs="Calibri" w:eastAsia="Calibri" w:hAnsi="Calibri"/>
           <w:i w:val="1"/>
+          <w:iCs w:val="1"/>
           <w:color w:val="000000"/>
           <w:sz w:val="20"/>
           <w:szCs w:val="20"/>
@@ -1972,6 +2018,7 @@
         <w:rPr>
           <w:rFonts w:ascii="Calibri" w:cs="Calibri" w:eastAsia="Calibri" w:hAnsi="Calibri"/>
           <w:i w:val="1"/>
+          <w:iCs w:val="1"/>
           <w:color w:val="000000"/>
           <w:sz w:val="20"/>
           <w:szCs w:val="20"/>
@@ -2065,6 +2112,7 @@
         <w:rPr>
           <w:rFonts w:ascii="Calibri" w:cs="Calibri" w:eastAsia="Calibri" w:hAnsi="Calibri"/>
           <w:i w:val="1"/>
+          <w:iCs w:val="1"/>
           <w:color w:val="000000"/>
           <w:sz w:val="20"/>
           <w:szCs w:val="20"/>
@@ -2152,6 +2200,7 @@
         <w:rPr>
           <w:rFonts w:ascii="Calibri" w:cs="Calibri" w:eastAsia="Calibri" w:hAnsi="Calibri"/>
           <w:i w:val="1"/>
+          <w:iCs w:val="1"/>
           <w:color w:val="000000"/>
           <w:sz w:val="20"/>
           <w:szCs w:val="20"/>
@@ -2206,6 +2255,7 @@
         <w:rPr>
           <w:rFonts w:ascii="Calibri" w:cs="Calibri" w:eastAsia="Calibri" w:hAnsi="Calibri"/>
           <w:i w:val="1"/>
+          <w:iCs w:val="1"/>
           <w:color w:val="000000"/>
           <w:sz w:val="20"/>
           <w:szCs w:val="20"/>
@@ -2227,6 +2277,7 @@
         <w:rPr>
           <w:rFonts w:ascii="Calibri" w:cs="Calibri" w:eastAsia="Calibri" w:hAnsi="Calibri"/>
           <w:i w:val="1"/>
+          <w:iCs w:val="1"/>
           <w:color w:val="000000"/>
           <w:sz w:val="20"/>
           <w:szCs w:val="20"/>
@@ -2248,6 +2299,7 @@
         <w:rPr>
           <w:rFonts w:ascii="Calibri" w:cs="Calibri" w:eastAsia="Calibri" w:hAnsi="Calibri"/>
           <w:i w:val="1"/>
+          <w:iCs w:val="1"/>
           <w:color w:val="000000"/>
           <w:sz w:val="20"/>
           <w:szCs w:val="20"/>
@@ -2335,7 +2387,9 @@
         <w:rPr>
           <w:rFonts w:ascii="Calibri" w:cs="Calibri" w:eastAsia="Calibri" w:hAnsi="Calibri"/>
           <w:b w:val="0"/>
+          <w:bCs w:val="0"/>
           <w:i w:val="0"/>
+          <w:iCs w:val="0"/>
           <w:smallCaps w:val="0"/>
           <w:strike w:val="0"/>
           <w:color w:val="000000"/>
@@ -2350,7 +2404,9 @@
         <w:rPr>
           <w:rFonts w:ascii="Calibri" w:cs="Calibri" w:eastAsia="Calibri" w:hAnsi="Calibri"/>
           <w:b w:val="0"/>
+          <w:bCs w:val="0"/>
           <w:i w:val="0"/>
+          <w:iCs w:val="0"/>
           <w:smallCaps w:val="0"/>
           <w:strike w:val="0"/>
           <w:color w:val="000000"/>
@@ -2367,7 +2423,9 @@
         <w:rPr>
           <w:rFonts w:ascii="Quattrocento Sans" w:cs="Quattrocento Sans" w:eastAsia="Quattrocento Sans" w:hAnsi="Quattrocento Sans"/>
           <w:b w:val="0"/>
+          <w:bCs w:val="0"/>
           <w:i w:val="0"/>
+          <w:iCs w:val="0"/>
           <w:smallCaps w:val="0"/>
           <w:strike w:val="0"/>
           <w:color w:val="000000"/>
@@ -2384,7 +2442,9 @@
         <w:rPr>
           <w:rFonts w:ascii="Calibri" w:cs="Calibri" w:eastAsia="Calibri" w:hAnsi="Calibri"/>
           <w:b w:val="0"/>
+          <w:bCs w:val="0"/>
           <w:i w:val="0"/>
+          <w:iCs w:val="0"/>
           <w:smallCaps w:val="0"/>
           <w:strike w:val="0"/>
           <w:color w:val="000000"/>
@@ -2422,7 +2482,9 @@
         <w:rPr>
           <w:rFonts w:ascii="Calibri" w:cs="Calibri" w:eastAsia="Calibri" w:hAnsi="Calibri"/>
           <w:b w:val="0"/>
+          <w:bCs w:val="0"/>
           <w:i w:val="0"/>
+          <w:iCs w:val="0"/>
           <w:smallCaps w:val="0"/>
           <w:strike w:val="0"/>
           <w:color w:val="000000"/>
@@ -2437,7 +2499,9 @@
         <w:rPr>
           <w:rFonts w:ascii="Calibri" w:cs="Calibri" w:eastAsia="Calibri" w:hAnsi="Calibri"/>
           <w:b w:val="0"/>
+          <w:bCs w:val="0"/>
           <w:i w:val="0"/>
+          <w:iCs w:val="0"/>
           <w:smallCaps w:val="0"/>
           <w:strike w:val="0"/>
           <w:color w:val="000000"/>
@@ -2475,7 +2539,9 @@
         <w:rPr>
           <w:rFonts w:ascii="Calibri" w:cs="Calibri" w:eastAsia="Calibri" w:hAnsi="Calibri"/>
           <w:b w:val="0"/>
+          <w:bCs w:val="0"/>
           <w:i w:val="0"/>
+          <w:iCs w:val="0"/>
           <w:smallCaps w:val="0"/>
           <w:strike w:val="0"/>
           <w:color w:val="000000"/>
@@ -2490,7 +2556,9 @@
         <w:rPr>
           <w:rFonts w:ascii="Calibri" w:cs="Calibri" w:eastAsia="Calibri" w:hAnsi="Calibri"/>
           <w:b w:val="0"/>
+          <w:bCs w:val="0"/>
           <w:i w:val="0"/>
+          <w:iCs w:val="0"/>
           <w:smallCaps w:val="0"/>
           <w:strike w:val="0"/>
           <w:color w:val="000000"/>
@@ -2563,7 +2631,9 @@
         <w:rPr>
           <w:rFonts w:ascii="Calibri" w:cs="Calibri" w:eastAsia="Calibri" w:hAnsi="Calibri"/>
           <w:b w:val="0"/>
+          <w:bCs w:val="0"/>
           <w:i w:val="0"/>
+          <w:iCs w:val="0"/>
           <w:smallCaps w:val="0"/>
           <w:strike w:val="0"/>
           <w:color w:val="000000"/>
@@ -2578,7 +2648,9 @@
         <w:rPr>
           <w:rFonts w:ascii="Calibri" w:cs="Calibri" w:eastAsia="Calibri" w:hAnsi="Calibri"/>
           <w:b w:val="0"/>
+          <w:bCs w:val="0"/>
           <w:i w:val="0"/>
+          <w:iCs w:val="0"/>
           <w:smallCaps w:val="0"/>
           <w:strike w:val="0"/>
           <w:color w:val="000000"/>
@@ -2594,6 +2666,7 @@
       <w:r>
         <w:rPr>
           <w:i w:val="1"/>
+          <w:iCs w:val="1"/>
           <w:sz w:val="20"/>
           <w:szCs w:val="20"/>
           <w:rtl w:val="0"/>
@@ -2604,7 +2677,9 @@
         <w:rPr>
           <w:rFonts w:ascii="Calibri" w:cs="Calibri" w:eastAsia="Calibri" w:hAnsi="Calibri"/>
           <w:b w:val="0"/>
+          <w:bCs w:val="0"/>
           <w:i w:val="0"/>
+          <w:iCs w:val="0"/>
           <w:smallCaps w:val="0"/>
           <w:strike w:val="0"/>
           <w:color w:val="000000"/>
@@ -2642,7 +2717,9 @@
         <w:rPr>
           <w:rFonts w:ascii="Calibri" w:cs="Calibri" w:eastAsia="Calibri" w:hAnsi="Calibri"/>
           <w:b w:val="0"/>
+          <w:bCs w:val="0"/>
           <w:i w:val="0"/>
+          <w:iCs w:val="0"/>
           <w:smallCaps w:val="0"/>
           <w:strike w:val="0"/>
           <w:color w:val="000000"/>
@@ -2657,7 +2734,9 @@
         <w:rPr>
           <w:rFonts w:ascii="Calibri" w:cs="Calibri" w:eastAsia="Calibri" w:hAnsi="Calibri"/>
           <w:b w:val="0"/>
+          <w:bCs w:val="0"/>
           <w:i w:val="0"/>
+          <w:iCs w:val="0"/>
           <w:smallCaps w:val="0"/>
           <w:strike w:val="0"/>
           <w:color w:val="000000"/>
@@ -2695,7 +2774,9 @@
         <w:rPr>
           <w:rFonts w:ascii="Calibri" w:cs="Calibri" w:eastAsia="Calibri" w:hAnsi="Calibri"/>
           <w:b w:val="0"/>
+          <w:bCs w:val="0"/>
           <w:i w:val="0"/>
+          <w:iCs w:val="0"/>
           <w:smallCaps w:val="0"/>
           <w:strike w:val="0"/>
           <w:color w:val="000000"/>
@@ -2710,7 +2791,9 @@
         <w:rPr>
           <w:rFonts w:ascii="Calibri" w:cs="Calibri" w:eastAsia="Calibri" w:hAnsi="Calibri"/>
           <w:b w:val="0"/>
+          <w:bCs w:val="0"/>
           <w:i w:val="0"/>
+          <w:iCs w:val="0"/>
           <w:smallCaps w:val="0"/>
           <w:strike w:val="0"/>
           <w:color w:val="000000"/>
@@ -2766,6 +2849,7 @@
         <w:rPr>
           <w:rFonts w:ascii="Calibri" w:cs="Calibri" w:eastAsia="Calibri" w:hAnsi="Calibri"/>
           <w:i w:val="1"/>
+          <w:iCs w:val="1"/>
           <w:sz w:val="20"/>
           <w:szCs w:val="20"/>
           <w:rtl w:val="0"/>
@@ -3045,6 +3129,7 @@
         <w:rPr>
           <w:rFonts w:ascii="Calibri" w:cs="Calibri" w:eastAsia="Calibri" w:hAnsi="Calibri"/>
           <w:i w:val="1"/>
+          <w:iCs w:val="1"/>
           <w:color w:val="000000"/>
           <w:sz w:val="20"/>
           <w:szCs w:val="20"/>
@@ -3066,6 +3151,7 @@
         <w:rPr>
           <w:rFonts w:ascii="Calibri" w:cs="Calibri" w:eastAsia="Calibri" w:hAnsi="Calibri"/>
           <w:i w:val="1"/>
+          <w:iCs w:val="1"/>
           <w:color w:val="000000"/>
           <w:sz w:val="20"/>
           <w:szCs w:val="20"/>
@@ -3152,6 +3238,7 @@
         <w:rPr>
           <w:rFonts w:ascii="Calibri" w:cs="Calibri" w:eastAsia="Calibri" w:hAnsi="Calibri"/>
           <w:i w:val="1"/>
+          <w:iCs w:val="1"/>
           <w:color w:val="000000"/>
           <w:sz w:val="20"/>
           <w:szCs w:val="20"/>
@@ -3410,7 +3497,9 @@
         <w:rPr>
           <w:rFonts w:ascii="Calibri" w:cs="Calibri" w:eastAsia="Calibri" w:hAnsi="Calibri"/>
           <w:b w:val="0"/>
+          <w:bCs w:val="0"/>
           <w:i w:val="0"/>
+          <w:iCs w:val="0"/>
           <w:smallCaps w:val="0"/>
           <w:strike w:val="0"/>
           <w:color w:val="000000"/>
@@ -3425,7 +3514,9 @@
         <w:rPr>
           <w:rFonts w:ascii="Calibri" w:cs="Calibri" w:eastAsia="Calibri" w:hAnsi="Calibri"/>
           <w:b w:val="0"/>
+          <w:bCs w:val="0"/>
           <w:i w:val="0"/>
+          <w:iCs w:val="0"/>
           <w:smallCaps w:val="0"/>
           <w:strike w:val="0"/>
           <w:color w:val="000000"/>
@@ -3514,6 +3605,7 @@
         <w:rPr>
           <w:rFonts w:ascii="Calibri" w:cs="Calibri" w:eastAsia="Calibri" w:hAnsi="Calibri"/>
           <w:i w:val="1"/>
+          <w:iCs w:val="1"/>
           <w:color w:val="000000"/>
           <w:sz w:val="20"/>
           <w:szCs w:val="20"/>
@@ -3535,6 +3627,7 @@
         <w:rPr>
           <w:rFonts w:ascii="Calibri" w:cs="Calibri" w:eastAsia="Calibri" w:hAnsi="Calibri"/>
           <w:i w:val="1"/>
+          <w:iCs w:val="1"/>
           <w:color w:val="000000"/>
           <w:sz w:val="20"/>
           <w:szCs w:val="20"/>
@@ -3584,6 +3677,7 @@
         <w:rPr>
           <w:rFonts w:ascii="Calibri" w:cs="Calibri" w:eastAsia="Calibri" w:hAnsi="Calibri"/>
           <w:i w:val="1"/>
+          <w:iCs w:val="1"/>
           <w:color w:val="000000"/>
           <w:sz w:val="20"/>
           <w:szCs w:val="20"/>
@@ -3637,6 +3731,7 @@
         <w:rPr>
           <w:rFonts w:ascii="Calibri" w:cs="Calibri" w:eastAsia="Calibri" w:hAnsi="Calibri"/>
           <w:i w:val="1"/>
+          <w:iCs w:val="1"/>
           <w:color w:val="000000"/>
           <w:sz w:val="20"/>
           <w:szCs w:val="20"/>
@@ -3728,6 +3823,7 @@
         <w:rPr>
           <w:rFonts w:ascii="Calibri" w:cs="Calibri" w:eastAsia="Calibri" w:hAnsi="Calibri"/>
           <w:i w:val="1"/>
+          <w:iCs w:val="1"/>
           <w:color w:val="000000"/>
           <w:sz w:val="20"/>
           <w:szCs w:val="20"/>
@@ -3957,6 +4053,7 @@
         <w:rPr>
           <w:rFonts w:ascii="Calibri" w:cs="Calibri" w:eastAsia="Calibri" w:hAnsi="Calibri"/>
           <w:i w:val="1"/>
+          <w:iCs w:val="1"/>
           <w:color w:val="000000"/>
           <w:sz w:val="20"/>
           <w:szCs w:val="20"/>
@@ -4106,6 +4203,7 @@
         <w:rPr>
           <w:rFonts w:ascii="Calibri" w:cs="Calibri" w:eastAsia="Calibri" w:hAnsi="Calibri"/>
           <w:b w:val="1"/>
+          <w:bCs w:val="1"/>
           <w:color w:val="000000"/>
           <w:sz w:val="20"/>
           <w:szCs w:val="20"/>
@@ -4197,6 +4295,7 @@
         <w:rPr>
           <w:rFonts w:ascii="Calibri" w:cs="Calibri" w:eastAsia="Calibri" w:hAnsi="Calibri"/>
           <w:i w:val="1"/>
+          <w:iCs w:val="1"/>
           <w:color w:val="000000"/>
           <w:sz w:val="20"/>
           <w:szCs w:val="20"/>
@@ -4251,6 +4350,7 @@
         <w:rPr>
           <w:rFonts w:ascii="Calibri" w:cs="Calibri" w:eastAsia="Calibri" w:hAnsi="Calibri"/>
           <w:i w:val="1"/>
+          <w:iCs w:val="1"/>
           <w:color w:val="000000"/>
           <w:sz w:val="20"/>
           <w:szCs w:val="20"/>
@@ -4304,6 +4404,7 @@
         <w:rPr>
           <w:rFonts w:ascii="Calibri" w:cs="Calibri" w:eastAsia="Calibri" w:hAnsi="Calibri"/>
           <w:i w:val="1"/>
+          <w:iCs w:val="1"/>
           <w:color w:val="000000"/>
           <w:sz w:val="20"/>
           <w:szCs w:val="20"/>
@@ -4395,6 +4496,7 @@
         <w:rPr>
           <w:rFonts w:ascii="Calibri" w:cs="Calibri" w:eastAsia="Calibri" w:hAnsi="Calibri"/>
           <w:b w:val="1"/>
+          <w:bCs w:val="1"/>
           <w:color w:val="000000"/>
           <w:sz w:val="20"/>
           <w:szCs w:val="20"/>
@@ -4555,6 +4657,7 @@
         <w:rPr>
           <w:rFonts w:ascii="Calibri" w:cs="Calibri" w:eastAsia="Calibri" w:hAnsi="Calibri"/>
           <w:i w:val="1"/>
+          <w:iCs w:val="1"/>
           <w:color w:val="000000"/>
           <w:sz w:val="20"/>
           <w:szCs w:val="20"/>
@@ -4609,6 +4712,7 @@
         <w:rPr>
           <w:rFonts w:ascii="Calibri" w:cs="Calibri" w:eastAsia="Calibri" w:hAnsi="Calibri"/>
           <w:i w:val="1"/>
+          <w:iCs w:val="1"/>
           <w:color w:val="000000"/>
           <w:sz w:val="20"/>
           <w:szCs w:val="20"/>
@@ -4630,6 +4734,7 @@
         <w:rPr>
           <w:rFonts w:ascii="Calibri" w:cs="Calibri" w:eastAsia="Calibri" w:hAnsi="Calibri"/>
           <w:i w:val="1"/>
+          <w:iCs w:val="1"/>
           <w:color w:val="000000"/>
           <w:sz w:val="20"/>
           <w:szCs w:val="20"/>
@@ -4720,6 +4825,7 @@
         <w:rPr>
           <w:rFonts w:ascii="Calibri" w:cs="Calibri" w:eastAsia="Calibri" w:hAnsi="Calibri"/>
           <w:i w:val="1"/>
+          <w:iCs w:val="1"/>
           <w:sz w:val="20"/>
           <w:szCs w:val="20"/>
           <w:rtl w:val="0"/>
@@ -4772,6 +4878,7 @@
         <w:rPr>
           <w:rFonts w:ascii="Calibri" w:cs="Calibri" w:eastAsia="Calibri" w:hAnsi="Calibri"/>
           <w:i w:val="1"/>
+          <w:iCs w:val="1"/>
           <w:color w:val="000000"/>
           <w:sz w:val="20"/>
           <w:szCs w:val="20"/>
@@ -4846,6 +4953,7 @@
         <w:rPr>
           <w:rFonts w:ascii="Calibri" w:cs="Calibri" w:eastAsia="Calibri" w:hAnsi="Calibri"/>
           <w:i w:val="1"/>
+          <w:iCs w:val="1"/>
           <w:color w:val="000000"/>
           <w:sz w:val="20"/>
           <w:szCs w:val="20"/>
@@ -4964,6 +5072,7 @@
         <w:rPr>
           <w:rFonts w:ascii="Calibri" w:cs="Calibri" w:eastAsia="Calibri" w:hAnsi="Calibri"/>
           <w:i w:val="1"/>
+          <w:iCs w:val="1"/>
           <w:color w:val="000000"/>
           <w:sz w:val="20"/>
           <w:szCs w:val="20"/>
@@ -4985,6 +5094,7 @@
         <w:rPr>
           <w:rFonts w:ascii="Calibri" w:cs="Calibri" w:eastAsia="Calibri" w:hAnsi="Calibri"/>
           <w:i w:val="1"/>
+          <w:iCs w:val="1"/>
           <w:color w:val="000000"/>
           <w:sz w:val="20"/>
           <w:szCs w:val="20"/>
@@ -5006,6 +5116,7 @@
         <w:rPr>
           <w:rFonts w:ascii="Calibri" w:cs="Calibri" w:eastAsia="Calibri" w:hAnsi="Calibri"/>
           <w:i w:val="1"/>
+          <w:iCs w:val="1"/>
           <w:color w:val="000000"/>
           <w:sz w:val="20"/>
           <w:szCs w:val="20"/>
@@ -5129,6 +5240,7 @@
         <w:rPr>
           <w:rFonts w:ascii="Calibri" w:cs="Calibri" w:eastAsia="Calibri" w:hAnsi="Calibri"/>
           <w:i w:val="1"/>
+          <w:iCs w:val="1"/>
           <w:sz w:val="20"/>
           <w:szCs w:val="20"/>
           <w:rtl w:val="0"/>
@@ -5181,6 +5293,7 @@
         <w:rPr>
           <w:rFonts w:ascii="Calibri" w:cs="Calibri" w:eastAsia="Calibri" w:hAnsi="Calibri"/>
           <w:i w:val="1"/>
+          <w:iCs w:val="1"/>
           <w:color w:val="000000"/>
           <w:sz w:val="20"/>
           <w:szCs w:val="20"/>
@@ -5250,6 +5363,7 @@
         <w:rPr>
           <w:rFonts w:ascii="Calibri" w:cs="Calibri" w:eastAsia="Calibri" w:hAnsi="Calibri"/>
           <w:i w:val="1"/>
+          <w:iCs w:val="1"/>
           <w:color w:val="000000"/>
           <w:sz w:val="20"/>
           <w:szCs w:val="20"/>
@@ -5823,6 +5937,7 @@
       <w:r>
         <w:rPr>
           <w:i w:val="1"/>
+          <w:iCs w:val="1"/>
           <w:sz w:val="20"/>
           <w:szCs w:val="20"/>
           <w:rtl w:val="0"/>
@@ -5868,6 +5983,7 @@
       <w:r>
         <w:rPr>
           <w:i w:val="1"/>
+          <w:iCs w:val="1"/>
           <w:sz w:val="20"/>
           <w:szCs w:val="20"/>
           <w:rtl w:val="0"/>
@@ -5953,6 +6069,7 @@
         <w:rPr>
           <w:rFonts w:ascii="Calibri" w:cs="Calibri" w:eastAsia="Calibri" w:hAnsi="Calibri"/>
           <w:i w:val="1"/>
+          <w:iCs w:val="1"/>
           <w:color w:val="000000"/>
           <w:sz w:val="20"/>
           <w:szCs w:val="20"/>
@@ -5974,6 +6091,7 @@
         <w:rPr>
           <w:rFonts w:ascii="Calibri" w:cs="Calibri" w:eastAsia="Calibri" w:hAnsi="Calibri"/>
           <w:i w:val="1"/>
+          <w:iCs w:val="1"/>
           <w:color w:val="000000"/>
           <w:sz w:val="20"/>
           <w:szCs w:val="20"/>
@@ -6028,6 +6146,7 @@
         <w:rPr>
           <w:rFonts w:ascii="Calibri" w:cs="Calibri" w:eastAsia="Calibri" w:hAnsi="Calibri"/>
           <w:i w:val="1"/>
+          <w:iCs w:val="1"/>
           <w:color w:val="000000"/>
           <w:sz w:val="20"/>
           <w:szCs w:val="20"/>
@@ -6049,6 +6168,7 @@
         <w:rPr>
           <w:rFonts w:ascii="Calibri" w:cs="Calibri" w:eastAsia="Calibri" w:hAnsi="Calibri"/>
           <w:i w:val="1"/>
+          <w:iCs w:val="1"/>
           <w:color w:val="000000"/>
           <w:sz w:val="20"/>
           <w:szCs w:val="20"/>
@@ -6097,6 +6217,7 @@
         <w:rPr>
           <w:rFonts w:ascii="Calibri" w:cs="Calibri" w:eastAsia="Calibri" w:hAnsi="Calibri"/>
           <w:i w:val="1"/>
+          <w:iCs w:val="1"/>
           <w:color w:val="000000"/>
           <w:sz w:val="20"/>
           <w:szCs w:val="20"/>
@@ -6328,6 +6449,7 @@
         <w:rPr>
           <w:rFonts w:ascii="Calibri" w:cs="Calibri" w:eastAsia="Calibri" w:hAnsi="Calibri"/>
           <w:i w:val="1"/>
+          <w:iCs w:val="1"/>
           <w:color w:val="000000"/>
           <w:sz w:val="20"/>
           <w:szCs w:val="20"/>
@@ -6382,6 +6504,7 @@
         <w:rPr>
           <w:rFonts w:ascii="Calibri" w:cs="Calibri" w:eastAsia="Calibri" w:hAnsi="Calibri"/>
           <w:i w:val="1"/>
+          <w:iCs w:val="1"/>
           <w:color w:val="000000"/>
           <w:sz w:val="20"/>
           <w:szCs w:val="20"/>
@@ -6424,6 +6547,7 @@
         <w:rPr>
           <w:rFonts w:ascii="Calibri" w:cs="Calibri" w:eastAsia="Calibri" w:hAnsi="Calibri"/>
           <w:i w:val="1"/>
+          <w:iCs w:val="1"/>
           <w:color w:val="000000"/>
           <w:sz w:val="20"/>
           <w:szCs w:val="20"/>
@@ -6553,6 +6677,7 @@
         <w:rPr>
           <w:rFonts w:ascii="Calibri" w:cs="Calibri" w:eastAsia="Calibri" w:hAnsi="Calibri"/>
           <w:i w:val="1"/>
+          <w:iCs w:val="1"/>
           <w:color w:val="000000"/>
           <w:sz w:val="20"/>
           <w:szCs w:val="20"/>
@@ -6602,6 +6727,7 @@
         <w:rPr>
           <w:rFonts w:ascii="Calibri" w:cs="Calibri" w:eastAsia="Calibri" w:hAnsi="Calibri"/>
           <w:i w:val="1"/>
+          <w:iCs w:val="1"/>
           <w:color w:val="000000"/>
           <w:sz w:val="20"/>
           <w:szCs w:val="20"/>
@@ -6650,6 +6776,7 @@
         <w:rPr>
           <w:rFonts w:ascii="Calibri" w:cs="Calibri" w:eastAsia="Calibri" w:hAnsi="Calibri"/>
           <w:i w:val="1"/>
+          <w:iCs w:val="1"/>
           <w:color w:val="000000"/>
           <w:sz w:val="20"/>
           <w:szCs w:val="20"/>
@@ -6904,6 +7031,7 @@
         <w:rPr>
           <w:rFonts w:ascii="Calibri" w:cs="Calibri" w:eastAsia="Calibri" w:hAnsi="Calibri"/>
           <w:i w:val="1"/>
+          <w:iCs w:val="1"/>
           <w:color w:val="000000"/>
           <w:sz w:val="20"/>
           <w:szCs w:val="20"/>
@@ -6925,6 +7053,7 @@
         <w:rPr>
           <w:rFonts w:ascii="Calibri" w:cs="Calibri" w:eastAsia="Calibri" w:hAnsi="Calibri"/>
           <w:i w:val="1"/>
+          <w:iCs w:val="1"/>
           <w:color w:val="000000"/>
           <w:sz w:val="20"/>
           <w:szCs w:val="20"/>
@@ -6979,6 +7108,7 @@
         <w:rPr>
           <w:rFonts w:ascii="Calibri" w:cs="Calibri" w:eastAsia="Calibri" w:hAnsi="Calibri"/>
           <w:i w:val="1"/>
+          <w:iCs w:val="1"/>
           <w:color w:val="000000"/>
           <w:sz w:val="20"/>
           <w:szCs w:val="20"/>
@@ -7000,6 +7130,7 @@
         <w:rPr>
           <w:rFonts w:ascii="Calibri" w:cs="Calibri" w:eastAsia="Calibri" w:hAnsi="Calibri"/>
           <w:i w:val="1"/>
+          <w:iCs w:val="1"/>
           <w:color w:val="000000"/>
           <w:sz w:val="20"/>
           <w:szCs w:val="20"/>
@@ -7038,6 +7169,7 @@
         <w:rPr>
           <w:rFonts w:ascii="Calibri" w:cs="Calibri" w:eastAsia="Calibri" w:hAnsi="Calibri"/>
           <w:i w:val="1"/>
+          <w:iCs w:val="1"/>
           <w:color w:val="000000"/>
           <w:sz w:val="20"/>
           <w:szCs w:val="20"/>
@@ -7557,6 +7689,7 @@
         <w:rPr>
           <w:rFonts w:ascii="Calibri" w:cs="Calibri" w:eastAsia="Calibri" w:hAnsi="Calibri"/>
           <w:i w:val="1"/>
+          <w:iCs w:val="1"/>
           <w:color w:val="000000"/>
           <w:sz w:val="20"/>
           <w:szCs w:val="20"/>
@@ -7578,6 +7711,7 @@
         <w:rPr>
           <w:rFonts w:ascii="Calibri" w:cs="Calibri" w:eastAsia="Calibri" w:hAnsi="Calibri"/>
           <w:i w:val="1"/>
+          <w:iCs w:val="1"/>
           <w:color w:val="000000"/>
           <w:sz w:val="20"/>
           <w:szCs w:val="20"/>
@@ -7632,6 +7766,7 @@
         <w:rPr>
           <w:rFonts w:ascii="Calibri" w:cs="Calibri" w:eastAsia="Calibri" w:hAnsi="Calibri"/>
           <w:i w:val="1"/>
+          <w:iCs w:val="1"/>
           <w:color w:val="000000"/>
           <w:sz w:val="20"/>
           <w:szCs w:val="20"/>
@@ -7681,6 +7816,7 @@
         <w:rPr>
           <w:rFonts w:ascii="Calibri" w:cs="Calibri" w:eastAsia="Calibri" w:hAnsi="Calibri"/>
           <w:i w:val="1"/>
+          <w:iCs w:val="1"/>
           <w:color w:val="000000"/>
           <w:sz w:val="20"/>
           <w:szCs w:val="20"/>
@@ -7804,6 +7940,7 @@
         <w:rPr>
           <w:rFonts w:ascii="Calibri" w:cs="Calibri" w:eastAsia="Calibri" w:hAnsi="Calibri"/>
           <w:i w:val="1"/>
+          <w:iCs w:val="1"/>
           <w:color w:val="000000"/>
           <w:sz w:val="20"/>
           <w:szCs w:val="20"/>
@@ -7825,6 +7962,7 @@
         <w:rPr>
           <w:rFonts w:ascii="Calibri" w:cs="Calibri" w:eastAsia="Calibri" w:hAnsi="Calibri"/>
           <w:i w:val="1"/>
+          <w:iCs w:val="1"/>
           <w:color w:val="000000"/>
           <w:sz w:val="20"/>
           <w:szCs w:val="20"/>
@@ -7911,6 +8049,7 @@
         <w:rPr>
           <w:rFonts w:ascii="Calibri" w:cs="Calibri" w:eastAsia="Calibri" w:hAnsi="Calibri"/>
           <w:i w:val="1"/>
+          <w:iCs w:val="1"/>
           <w:color w:val="000000"/>
           <w:sz w:val="20"/>
           <w:szCs w:val="20"/>
@@ -7932,6 +8071,7 @@
         <w:rPr>
           <w:rFonts w:ascii="Calibri" w:cs="Calibri" w:eastAsia="Calibri" w:hAnsi="Calibri"/>
           <w:i w:val="1"/>
+          <w:iCs w:val="1"/>
           <w:color w:val="000000"/>
           <w:sz w:val="20"/>
           <w:szCs w:val="20"/>
@@ -8023,6 +8163,7 @@
         <w:rPr>
           <w:rFonts w:ascii="Calibri" w:cs="Calibri" w:eastAsia="Calibri" w:hAnsi="Calibri"/>
           <w:i w:val="1"/>
+          <w:iCs w:val="1"/>
           <w:color w:val="000000"/>
           <w:sz w:val="20"/>
           <w:szCs w:val="20"/>
@@ -8077,6 +8218,7 @@
         <w:rPr>
           <w:rFonts w:ascii="Calibri" w:cs="Calibri" w:eastAsia="Calibri" w:hAnsi="Calibri"/>
           <w:i w:val="1"/>
+          <w:iCs w:val="1"/>
           <w:color w:val="000000"/>
           <w:sz w:val="20"/>
           <w:szCs w:val="20"/>
@@ -8127,6 +8269,7 @@
       <w:r>
         <w:rPr>
           <w:i w:val="1"/>
+          <w:iCs w:val="1"/>
           <w:sz w:val="20"/>
           <w:szCs w:val="20"/>
           <w:rtl w:val="0"/>
@@ -8431,6 +8574,7 @@
         <w:rPr>
           <w:rFonts w:ascii="Calibri" w:cs="Calibri" w:eastAsia="Calibri" w:hAnsi="Calibri"/>
           <w:i w:val="1"/>
+          <w:iCs w:val="1"/>
           <w:color w:val="000000"/>
           <w:sz w:val="20"/>
           <w:szCs w:val="20"/>
@@ -8512,6 +8656,7 @@
         <w:rPr>
           <w:rFonts w:ascii="Calibri" w:cs="Calibri" w:eastAsia="Calibri" w:hAnsi="Calibri"/>
           <w:i w:val="1"/>
+          <w:iCs w:val="1"/>
           <w:color w:val="000000"/>
           <w:sz w:val="20"/>
           <w:szCs w:val="20"/>
@@ -8570,6 +8715,7 @@
       <w:r>
         <w:rPr>
           <w:i w:val="1"/>
+          <w:iCs w:val="1"/>
           <w:sz w:val="20"/>
           <w:szCs w:val="20"/>
           <w:highlight w:val="yellow"/>
@@ -8618,6 +8764,7 @@
       <w:r>
         <w:rPr>
           <w:i w:val="1"/>
+          <w:iCs w:val="1"/>
           <w:sz w:val="20"/>
           <w:szCs w:val="20"/>
           <w:highlight w:val="yellow"/>
@@ -8661,6 +8808,7 @@
       <w:r>
         <w:rPr>
           <w:i w:val="1"/>
+          <w:iCs w:val="1"/>
           <w:sz w:val="20"/>
           <w:szCs w:val="20"/>
           <w:highlight w:val="yellow"/>
@@ -8759,6 +8907,7 @@
         <w:rPr>
           <w:rFonts w:ascii="Calibri" w:cs="Calibri" w:eastAsia="Calibri" w:hAnsi="Calibri"/>
           <w:i w:val="1"/>
+          <w:iCs w:val="1"/>
           <w:color w:val="000000"/>
           <w:sz w:val="20"/>
           <w:szCs w:val="20"/>
@@ -8780,6 +8929,7 @@
         <w:rPr>
           <w:rFonts w:ascii="Calibri" w:cs="Calibri" w:eastAsia="Calibri" w:hAnsi="Calibri"/>
           <w:i w:val="1"/>
+          <w:iCs w:val="1"/>
           <w:color w:val="000000"/>
           <w:sz w:val="20"/>
           <w:szCs w:val="20"/>
@@ -9006,6 +9156,7 @@
         <w:rPr>
           <w:rFonts w:ascii="Calibri" w:cs="Calibri" w:eastAsia="Calibri" w:hAnsi="Calibri"/>
           <w:i w:val="1"/>
+          <w:iCs w:val="1"/>
           <w:color w:val="000000"/>
           <w:sz w:val="20"/>
           <w:szCs w:val="20"/>
@@ -9117,7 +9268,9 @@
         <w:rPr>
           <w:rFonts w:ascii="Calibri" w:cs="Calibri" w:eastAsia="Calibri" w:hAnsi="Calibri"/>
           <w:b w:val="0"/>
+          <w:bCs w:val="0"/>
           <w:i w:val="0"/>
+          <w:iCs w:val="0"/>
           <w:smallCaps w:val="0"/>
           <w:strike w:val="0"/>
           <w:color w:val="000000"/>
@@ -9132,7 +9285,9 @@
         <w:rPr>
           <w:rFonts w:ascii="Calibri" w:cs="Calibri" w:eastAsia="Calibri" w:hAnsi="Calibri"/>
           <w:b w:val="0"/>
+          <w:bCs w:val="0"/>
           <w:i w:val="0"/>
+          <w:iCs w:val="0"/>
           <w:smallCaps w:val="0"/>
           <w:strike w:val="0"/>
           <w:color w:val="000000"/>
@@ -9149,7 +9304,9 @@
         <w:rPr>
           <w:rFonts w:ascii="Calibri" w:cs="Calibri" w:eastAsia="Calibri" w:hAnsi="Calibri"/>
           <w:b w:val="0"/>
+          <w:bCs w:val="0"/>
           <w:i w:val="1"/>
+          <w:iCs w:val="1"/>
           <w:smallCaps w:val="0"/>
           <w:strike w:val="0"/>
           <w:color w:val="000000"/>
@@ -9166,7 +9323,9 @@
         <w:rPr>
           <w:rFonts w:ascii="Calibri" w:cs="Calibri" w:eastAsia="Calibri" w:hAnsi="Calibri"/>
           <w:b w:val="0"/>
+          <w:bCs w:val="0"/>
           <w:i w:val="0"/>
+          <w:iCs w:val="0"/>
           <w:smallCaps w:val="0"/>
           <w:strike w:val="0"/>
           <w:color w:val="000000"/>
@@ -9204,7 +9363,9 @@
         <w:rPr>
           <w:rFonts w:ascii="Calibri" w:cs="Calibri" w:eastAsia="Calibri" w:hAnsi="Calibri"/>
           <w:b w:val="0"/>
+          <w:bCs w:val="0"/>
           <w:i w:val="0"/>
+          <w:iCs w:val="0"/>
           <w:smallCaps w:val="0"/>
           <w:strike w:val="0"/>
           <w:color w:val="000000"/>
@@ -9219,7 +9380,9 @@
         <w:rPr>
           <w:rFonts w:ascii="Calibri" w:cs="Calibri" w:eastAsia="Calibri" w:hAnsi="Calibri"/>
           <w:b w:val="0"/>
+          <w:bCs w:val="0"/>
           <w:i w:val="0"/>
+          <w:iCs w:val="0"/>
           <w:smallCaps w:val="0"/>
           <w:strike w:val="0"/>
           <w:color w:val="000000"/>
@@ -9236,7 +9399,9 @@
         <w:rPr>
           <w:rFonts w:ascii="Calibri" w:cs="Calibri" w:eastAsia="Calibri" w:hAnsi="Calibri"/>
           <w:b w:val="0"/>
+          <w:bCs w:val="0"/>
           <w:i w:val="1"/>
+          <w:iCs w:val="1"/>
           <w:smallCaps w:val="0"/>
           <w:strike w:val="0"/>
           <w:color w:val="000000"/>
@@ -9253,7 +9418,9 @@
         <w:rPr>
           <w:rFonts w:ascii="Calibri" w:cs="Calibri" w:eastAsia="Calibri" w:hAnsi="Calibri"/>
           <w:b w:val="0"/>
+          <w:bCs w:val="0"/>
           <w:i w:val="0"/>
+          <w:iCs w:val="0"/>
           <w:smallCaps w:val="0"/>
           <w:strike w:val="0"/>
           <w:color w:val="000000"/>
@@ -9270,7 +9437,9 @@
         <w:rPr>
           <w:rFonts w:ascii="Calibri" w:cs="Calibri" w:eastAsia="Calibri" w:hAnsi="Calibri"/>
           <w:b w:val="0"/>
+          <w:bCs w:val="0"/>
           <w:i w:val="1"/>
+          <w:iCs w:val="1"/>
           <w:smallCaps w:val="0"/>
           <w:strike w:val="0"/>
           <w:color w:val="000000"/>
@@ -9287,7 +9456,9 @@
         <w:rPr>
           <w:rFonts w:ascii="Calibri" w:cs="Calibri" w:eastAsia="Calibri" w:hAnsi="Calibri"/>
           <w:b w:val="0"/>
+          <w:bCs w:val="0"/>
           <w:i w:val="0"/>
+          <w:iCs w:val="0"/>
           <w:smallCaps w:val="0"/>
           <w:strike w:val="0"/>
           <w:color w:val="000000"/>
@@ -9330,7 +9501,9 @@
         <w:rPr>
           <w:rFonts w:ascii="Calibri" w:cs="Calibri" w:eastAsia="Calibri" w:hAnsi="Calibri"/>
           <w:b w:val="0"/>
+          <w:bCs w:val="0"/>
           <w:i w:val="0"/>
+          <w:iCs w:val="0"/>
           <w:smallCaps w:val="0"/>
           <w:strike w:val="0"/>
           <w:color w:val="000000"/>
@@ -9345,7 +9518,9 @@
         <w:rPr>
           <w:rFonts w:ascii="Calibri" w:cs="Calibri" w:eastAsia="Calibri" w:hAnsi="Calibri"/>
           <w:b w:val="0"/>
+          <w:bCs w:val="0"/>
           <w:i w:val="0"/>
+          <w:iCs w:val="0"/>
           <w:smallCaps w:val="0"/>
           <w:strike w:val="0"/>
           <w:color w:val="000000"/>
@@ -9399,6 +9574,7 @@
         <w:rPr>
           <w:rFonts w:ascii="Calibri" w:cs="Calibri" w:eastAsia="Calibri" w:hAnsi="Calibri"/>
           <w:i w:val="1"/>
+          <w:iCs w:val="1"/>
           <w:sz w:val="20"/>
           <w:szCs w:val="20"/>
           <w:rtl w:val="0"/>
@@ -9451,6 +9627,7 @@
         <w:rPr>
           <w:rFonts w:ascii="Calibri" w:cs="Calibri" w:eastAsia="Calibri" w:hAnsi="Calibri"/>
           <w:i w:val="1"/>
+          <w:iCs w:val="1"/>
           <w:color w:val="000000"/>
           <w:sz w:val="20"/>
           <w:szCs w:val="20"/>
@@ -9472,6 +9649,7 @@
         <w:rPr>
           <w:rFonts w:ascii="Calibri" w:cs="Calibri" w:eastAsia="Calibri" w:hAnsi="Calibri"/>
           <w:i w:val="1"/>
+          <w:iCs w:val="1"/>
           <w:color w:val="000000"/>
           <w:sz w:val="20"/>
           <w:szCs w:val="20"/>
@@ -9521,6 +9699,7 @@
         <w:rPr>
           <w:rFonts w:ascii="Calibri" w:cs="Calibri" w:eastAsia="Calibri" w:hAnsi="Calibri"/>
           <w:i w:val="1"/>
+          <w:iCs w:val="1"/>
           <w:color w:val="000000"/>
           <w:sz w:val="20"/>
           <w:szCs w:val="20"/>
@@ -9575,6 +9754,7 @@
         <w:rPr>
           <w:rFonts w:ascii="Calibri" w:cs="Calibri" w:eastAsia="Calibri" w:hAnsi="Calibri"/>
           <w:i w:val="1"/>
+          <w:iCs w:val="1"/>
           <w:color w:val="000000"/>
           <w:sz w:val="20"/>
           <w:szCs w:val="20"/>
@@ -9628,6 +9808,7 @@
         <w:rPr>
           <w:rFonts w:ascii="Calibri" w:cs="Calibri" w:eastAsia="Calibri" w:hAnsi="Calibri"/>
           <w:i w:val="1"/>
+          <w:iCs w:val="1"/>
           <w:color w:val="000000"/>
           <w:sz w:val="20"/>
           <w:szCs w:val="20"/>
@@ -9714,6 +9895,7 @@
         <w:rPr>
           <w:rFonts w:ascii="Calibri" w:cs="Calibri" w:eastAsia="Calibri" w:hAnsi="Calibri"/>
           <w:i w:val="1"/>
+          <w:iCs w:val="1"/>
           <w:color w:val="000000"/>
           <w:sz w:val="20"/>
           <w:szCs w:val="20"/>
@@ -9768,6 +9950,7 @@
         <w:rPr>
           <w:rFonts w:ascii="Calibri" w:cs="Calibri" w:eastAsia="Calibri" w:hAnsi="Calibri"/>
           <w:i w:val="1"/>
+          <w:iCs w:val="1"/>
           <w:color w:val="000000"/>
           <w:sz w:val="20"/>
           <w:szCs w:val="20"/>
@@ -9821,6 +10004,7 @@
         <w:rPr>
           <w:rFonts w:ascii="Calibri" w:cs="Calibri" w:eastAsia="Calibri" w:hAnsi="Calibri"/>
           <w:i w:val="1"/>
+          <w:iCs w:val="1"/>
           <w:color w:val="000000"/>
           <w:sz w:val="20"/>
           <w:szCs w:val="20"/>
@@ -9874,6 +10058,7 @@
         <w:rPr>
           <w:rFonts w:ascii="Calibri" w:cs="Calibri" w:eastAsia="Calibri" w:hAnsi="Calibri"/>
           <w:i w:val="1"/>
+          <w:iCs w:val="1"/>
           <w:sz w:val="20"/>
           <w:szCs w:val="20"/>
           <w:rtl w:val="0"/>
@@ -9922,6 +10107,7 @@
         <w:rPr>
           <w:rFonts w:ascii="Calibri" w:cs="Calibri" w:eastAsia="Calibri" w:hAnsi="Calibri"/>
           <w:i w:val="1"/>
+          <w:iCs w:val="1"/>
           <w:color w:val="000000"/>
           <w:sz w:val="20"/>
           <w:szCs w:val="20"/>
@@ -9976,6 +10162,7 @@
         <w:rPr>
           <w:rFonts w:ascii="Calibri" w:cs="Calibri" w:eastAsia="Calibri" w:hAnsi="Calibri"/>
           <w:i w:val="1"/>
+          <w:iCs w:val="1"/>
           <w:color w:val="000000"/>
           <w:sz w:val="20"/>
           <w:szCs w:val="20"/>
@@ -10069,7 +10256,9 @@
         <w:rPr>
           <w:rFonts w:ascii="Calibri" w:cs="Calibri" w:eastAsia="Calibri" w:hAnsi="Calibri"/>
           <w:b w:val="0"/>
+          <w:bCs w:val="0"/>
           <w:i w:val="0"/>
+          <w:iCs w:val="0"/>
           <w:smallCaps w:val="0"/>
           <w:strike w:val="0"/>
           <w:color w:val="000000"/>
@@ -10084,7 +10273,9 @@
         <w:rPr>
           <w:rFonts w:ascii="Calibri" w:cs="Calibri" w:eastAsia="Calibri" w:hAnsi="Calibri"/>
           <w:b w:val="0"/>
+          <w:bCs w:val="0"/>
           <w:i w:val="0"/>
+          <w:iCs w:val="0"/>
           <w:smallCaps w:val="0"/>
           <w:strike w:val="0"/>
           <w:color w:val="000000"/>
@@ -10101,7 +10292,9 @@
         <w:rPr>
           <w:rFonts w:ascii="Calibri" w:cs="Calibri" w:eastAsia="Calibri" w:hAnsi="Calibri"/>
           <w:b w:val="0"/>
+          <w:bCs w:val="0"/>
           <w:i w:val="1"/>
+          <w:iCs w:val="1"/>
           <w:smallCaps w:val="0"/>
           <w:strike w:val="0"/>
           <w:color w:val="000000"/>
@@ -10118,7 +10311,9 @@
         <w:rPr>
           <w:rFonts w:ascii="Calibri" w:cs="Calibri" w:eastAsia="Calibri" w:hAnsi="Calibri"/>
           <w:b w:val="0"/>
+          <w:bCs w:val="0"/>
           <w:i w:val="0"/>
+          <w:iCs w:val="0"/>
           <w:smallCaps w:val="0"/>
           <w:strike w:val="0"/>
           <w:color w:val="000000"/>
@@ -10135,7 +10330,9 @@
         <w:rPr>
           <w:rFonts w:ascii="Calibri" w:cs="Calibri" w:eastAsia="Calibri" w:hAnsi="Calibri"/>
           <w:b w:val="0"/>
+          <w:bCs w:val="0"/>
           <w:i w:val="1"/>
+          <w:iCs w:val="1"/>
           <w:smallCaps w:val="0"/>
           <w:strike w:val="0"/>
           <w:color w:val="000000"/>
@@ -10152,7 +10349,9 @@
         <w:rPr>
           <w:rFonts w:ascii="Calibri" w:cs="Calibri" w:eastAsia="Calibri" w:hAnsi="Calibri"/>
           <w:b w:val="0"/>
+          <w:bCs w:val="0"/>
           <w:i w:val="0"/>
+          <w:iCs w:val="0"/>
           <w:smallCaps w:val="0"/>
           <w:strike w:val="0"/>
           <w:color w:val="000000"/>
@@ -10169,7 +10368,9 @@
         <w:rPr>
           <w:rFonts w:ascii="Calibri" w:cs="Calibri" w:eastAsia="Calibri" w:hAnsi="Calibri"/>
           <w:b w:val="0"/>
+          <w:bCs w:val="0"/>
           <w:i w:val="1"/>
+          <w:iCs w:val="1"/>
           <w:smallCaps w:val="0"/>
           <w:strike w:val="0"/>
           <w:color w:val="000000"/>
@@ -10186,7 +10387,9 @@
         <w:rPr>
           <w:rFonts w:ascii="Calibri" w:cs="Calibri" w:eastAsia="Calibri" w:hAnsi="Calibri"/>
           <w:b w:val="0"/>
+          <w:bCs w:val="0"/>
           <w:i w:val="0"/>
+          <w:iCs w:val="0"/>
           <w:smallCaps w:val="0"/>
           <w:strike w:val="0"/>
           <w:color w:val="000000"/>
@@ -10224,7 +10427,9 @@
         <w:rPr>
           <w:rFonts w:ascii="Calibri" w:cs="Calibri" w:eastAsia="Calibri" w:hAnsi="Calibri"/>
           <w:b w:val="0"/>
+          <w:bCs w:val="0"/>
           <w:i w:val="0"/>
+          <w:iCs w:val="0"/>
           <w:smallCaps w:val="0"/>
           <w:strike w:val="0"/>
           <w:color w:val="000000"/>
@@ -10239,7 +10444,9 @@
         <w:rPr>
           <w:rFonts w:ascii="Calibri" w:cs="Calibri" w:eastAsia="Calibri" w:hAnsi="Calibri"/>
           <w:b w:val="0"/>
+          <w:bCs w:val="0"/>
           <w:i w:val="0"/>
+          <w:iCs w:val="0"/>
           <w:smallCaps w:val="0"/>
           <w:strike w:val="0"/>
           <w:color w:val="000000"/>
@@ -10277,7 +10484,9 @@
         <w:rPr>
           <w:rFonts w:ascii="Calibri" w:cs="Calibri" w:eastAsia="Calibri" w:hAnsi="Calibri"/>
           <w:b w:val="0"/>
+          <w:bCs w:val="0"/>
           <w:i w:val="0"/>
+          <w:iCs w:val="0"/>
           <w:smallCaps w:val="0"/>
           <w:strike w:val="0"/>
           <w:color w:val="000000"/>
@@ -10292,7 +10501,9 @@
         <w:rPr>
           <w:rFonts w:ascii="Calibri" w:cs="Calibri" w:eastAsia="Calibri" w:hAnsi="Calibri"/>
           <w:b w:val="0"/>
+          <w:bCs w:val="0"/>
           <w:i w:val="0"/>
+          <w:iCs w:val="0"/>
           <w:smallCaps w:val="0"/>
           <w:strike w:val="0"/>
           <w:color w:val="000000"/>
@@ -10309,7 +10520,9 @@
         <w:rPr>
           <w:rFonts w:ascii="Calibri" w:cs="Calibri" w:eastAsia="Calibri" w:hAnsi="Calibri"/>
           <w:b w:val="0"/>
+          <w:bCs w:val="0"/>
           <w:i w:val="1"/>
+          <w:iCs w:val="1"/>
           <w:smallCaps w:val="0"/>
           <w:strike w:val="0"/>
           <w:color w:val="000000"/>
@@ -10326,7 +10539,9 @@
         <w:rPr>
           <w:rFonts w:ascii="Calibri" w:cs="Calibri" w:eastAsia="Calibri" w:hAnsi="Calibri"/>
           <w:b w:val="0"/>
+          <w:bCs w:val="0"/>
           <w:i w:val="0"/>
+          <w:iCs w:val="0"/>
           <w:smallCaps w:val="0"/>
           <w:strike w:val="0"/>
           <w:color w:val="000000"/>
@@ -10343,7 +10558,9 @@
         <w:rPr>
           <w:rFonts w:ascii="Calibri" w:cs="Calibri" w:eastAsia="Calibri" w:hAnsi="Calibri"/>
           <w:b w:val="0"/>
+          <w:bCs w:val="0"/>
           <w:i w:val="1"/>
+          <w:iCs w:val="1"/>
           <w:smallCaps w:val="0"/>
           <w:strike w:val="0"/>
           <w:color w:val="000000"/>
@@ -10360,7 +10577,9 @@
         <w:rPr>
           <w:rFonts w:ascii="Calibri" w:cs="Calibri" w:eastAsia="Calibri" w:hAnsi="Calibri"/>
           <w:b w:val="0"/>
+          <w:bCs w:val="0"/>
           <w:i w:val="0"/>
+          <w:iCs w:val="0"/>
           <w:smallCaps w:val="0"/>
           <w:strike w:val="0"/>
           <w:color w:val="000000"/>
@@ -10439,6 +10658,7 @@
         <w:rPr>
           <w:rFonts w:ascii="Calibri" w:cs="Calibri" w:eastAsia="Calibri" w:hAnsi="Calibri"/>
           <w:i w:val="1"/>
+          <w:iCs w:val="1"/>
           <w:color w:val="000000"/>
           <w:sz w:val="20"/>
           <w:szCs w:val="20"/>
@@ -10481,7 +10701,9 @@
         <w:rPr>
           <w:rFonts w:ascii="Calibri" w:cs="Calibri" w:eastAsia="Calibri" w:hAnsi="Calibri"/>
           <w:b w:val="0"/>
+          <w:bCs w:val="0"/>
           <w:i w:val="0"/>
+          <w:iCs w:val="0"/>
           <w:smallCaps w:val="0"/>
           <w:strike w:val="0"/>
           <w:color w:val="000000"/>
@@ -10496,7 +10718,9 @@
         <w:rPr>
           <w:rFonts w:ascii="Calibri" w:cs="Calibri" w:eastAsia="Calibri" w:hAnsi="Calibri"/>
           <w:b w:val="0"/>
+          <w:bCs w:val="0"/>
           <w:i w:val="0"/>
+          <w:iCs w:val="0"/>
           <w:smallCaps w:val="0"/>
           <w:strike w:val="0"/>
           <w:color w:val="000000"/>
@@ -10534,7 +10758,9 @@
         <w:rPr>
           <w:rFonts w:ascii="Calibri" w:cs="Calibri" w:eastAsia="Calibri" w:hAnsi="Calibri"/>
           <w:b w:val="0"/>
+          <w:bCs w:val="0"/>
           <w:i w:val="0"/>
+          <w:iCs w:val="0"/>
           <w:smallCaps w:val="0"/>
           <w:strike w:val="0"/>
           <w:color w:val="000000"/>
@@ -10549,7 +10775,9 @@
         <w:rPr>
           <w:rFonts w:ascii="Calibri" w:cs="Calibri" w:eastAsia="Calibri" w:hAnsi="Calibri"/>
           <w:b w:val="0"/>
+          <w:bCs w:val="0"/>
           <w:i w:val="0"/>
+          <w:iCs w:val="0"/>
           <w:smallCaps w:val="0"/>
           <w:strike w:val="0"/>
           <w:color w:val="000000"/>
@@ -10566,7 +10794,9 @@
         <w:rPr>
           <w:rFonts w:ascii="Calibri" w:cs="Calibri" w:eastAsia="Calibri" w:hAnsi="Calibri"/>
           <w:b w:val="0"/>
+          <w:bCs w:val="0"/>
           <w:i w:val="1"/>
+          <w:iCs w:val="1"/>
           <w:smallCaps w:val="0"/>
           <w:strike w:val="0"/>
           <w:color w:val="000000"/>
@@ -10583,7 +10813,9 @@
         <w:rPr>
           <w:rFonts w:ascii="Calibri" w:cs="Calibri" w:eastAsia="Calibri" w:hAnsi="Calibri"/>
           <w:b w:val="0"/>
+          <w:bCs w:val="0"/>
           <w:i w:val="0"/>
+          <w:iCs w:val="0"/>
           <w:smallCaps w:val="0"/>
           <w:strike w:val="0"/>
           <w:color w:val="000000"/>
@@ -10621,7 +10853,9 @@
         <w:rPr>
           <w:rFonts w:ascii="Calibri" w:cs="Calibri" w:eastAsia="Calibri" w:hAnsi="Calibri"/>
           <w:b w:val="0"/>
+          <w:bCs w:val="0"/>
           <w:i w:val="0"/>
+          <w:iCs w:val="0"/>
           <w:smallCaps w:val="0"/>
           <w:strike w:val="0"/>
           <w:color w:val="000000"/>
@@ -10636,7 +10870,9 @@
         <w:rPr>
           <w:rFonts w:ascii="Calibri" w:cs="Calibri" w:eastAsia="Calibri" w:hAnsi="Calibri"/>
           <w:b w:val="0"/>
+          <w:bCs w:val="0"/>
           <w:i w:val="0"/>
+          <w:iCs w:val="0"/>
           <w:smallCaps w:val="0"/>
           <w:strike w:val="0"/>
           <w:color w:val="000000"/>
@@ -10711,7 +10947,9 @@
         <w:rPr>
           <w:rFonts w:ascii="Calibri" w:cs="Calibri" w:eastAsia="Calibri" w:hAnsi="Calibri"/>
           <w:b w:val="0"/>
+          <w:bCs w:val="0"/>
           <w:i w:val="0"/>
+          <w:iCs w:val="0"/>
           <w:smallCaps w:val="0"/>
           <w:strike w:val="0"/>
           <w:color w:val="000000"/>
@@ -10726,7 +10964,9 @@
         <w:rPr>
           <w:rFonts w:ascii="Calibri" w:cs="Calibri" w:eastAsia="Calibri" w:hAnsi="Calibri"/>
           <w:b w:val="0"/>
+          <w:bCs w:val="0"/>
           <w:i w:val="0"/>
+          <w:iCs w:val="0"/>
           <w:smallCaps w:val="0"/>
           <w:strike w:val="0"/>
           <w:color w:val="000000"/>
@@ -10764,7 +11004,9 @@
         <w:rPr>
           <w:rFonts w:ascii="Calibri" w:cs="Calibri" w:eastAsia="Calibri" w:hAnsi="Calibri"/>
           <w:b w:val="0"/>
+          <w:bCs w:val="0"/>
           <w:i w:val="0"/>
+          <w:iCs w:val="0"/>
           <w:smallCaps w:val="0"/>
           <w:strike w:val="0"/>
           <w:color w:val="000000"/>
@@ -10779,7 +11021,9 @@
         <w:rPr>
           <w:rFonts w:ascii="Calibri" w:cs="Calibri" w:eastAsia="Calibri" w:hAnsi="Calibri"/>
           <w:b w:val="0"/>
+          <w:bCs w:val="0"/>
           <w:i w:val="0"/>
+          <w:iCs w:val="0"/>
           <w:smallCaps w:val="0"/>
           <w:strike w:val="0"/>
           <w:color w:val="000000"/>
@@ -10854,7 +11098,9 @@
         <w:rPr>
           <w:rFonts w:ascii="Calibri" w:cs="Calibri" w:eastAsia="Calibri" w:hAnsi="Calibri"/>
           <w:b w:val="0"/>
+          <w:bCs w:val="0"/>
           <w:i w:val="0"/>
+          <w:iCs w:val="0"/>
           <w:smallCaps w:val="0"/>
           <w:strike w:val="0"/>
           <w:color w:val="000000"/>
@@ -10869,7 +11115,9 @@
         <w:rPr>
           <w:rFonts w:ascii="Calibri" w:cs="Calibri" w:eastAsia="Calibri" w:hAnsi="Calibri"/>
           <w:b w:val="0"/>
+          <w:bCs w:val="0"/>
           <w:i w:val="0"/>
+          <w:iCs w:val="0"/>
           <w:smallCaps w:val="0"/>
           <w:strike w:val="0"/>
           <w:color w:val="000000"/>
@@ -10907,7 +11155,9 @@
         <w:rPr>
           <w:rFonts w:ascii="Calibri" w:cs="Calibri" w:eastAsia="Calibri" w:hAnsi="Calibri"/>
           <w:b w:val="0"/>
+          <w:bCs w:val="0"/>
           <w:i w:val="0"/>
+          <w:iCs w:val="0"/>
           <w:smallCaps w:val="0"/>
           <w:strike w:val="0"/>
           <w:color w:val="000000"/>
@@ -10922,7 +11172,9 @@
         <w:rPr>
           <w:rFonts w:ascii="Calibri" w:cs="Calibri" w:eastAsia="Calibri" w:hAnsi="Calibri"/>
           <w:b w:val="0"/>
+          <w:bCs w:val="0"/>
           <w:i w:val="0"/>
+          <w:iCs w:val="0"/>
           <w:smallCaps w:val="0"/>
           <w:strike w:val="0"/>
           <w:color w:val="000000"/>
@@ -10991,6 +11243,7 @@
         <w:rPr>
           <w:rFonts w:ascii="Calibri" w:cs="Calibri" w:eastAsia="Calibri" w:hAnsi="Calibri"/>
           <w:i w:val="1"/>
+          <w:iCs w:val="1"/>
           <w:color w:val="000000"/>
           <w:sz w:val="20"/>
           <w:szCs w:val="20"/>
@@ -11033,7 +11286,9 @@
         <w:rPr>
           <w:rFonts w:ascii="Calibri" w:cs="Calibri" w:eastAsia="Calibri" w:hAnsi="Calibri"/>
           <w:b w:val="0"/>
+          <w:bCs w:val="0"/>
           <w:i w:val="0"/>
+          <w:iCs w:val="0"/>
           <w:smallCaps w:val="0"/>
           <w:strike w:val="0"/>
           <w:color w:val="000000"/>
@@ -11048,7 +11303,9 @@
         <w:rPr>
           <w:rFonts w:ascii="Calibri" w:cs="Calibri" w:eastAsia="Calibri" w:hAnsi="Calibri"/>
           <w:b w:val="0"/>
+          <w:bCs w:val="0"/>
           <w:i w:val="0"/>
+          <w:iCs w:val="0"/>
           <w:smallCaps w:val="0"/>
           <w:strike w:val="0"/>
           <w:color w:val="000000"/>
@@ -11086,7 +11343,9 @@
         <w:rPr>
           <w:rFonts w:ascii="Calibri" w:cs="Calibri" w:eastAsia="Calibri" w:hAnsi="Calibri"/>
           <w:b w:val="0"/>
+          <w:bCs w:val="0"/>
           <w:i w:val="0"/>
+          <w:iCs w:val="0"/>
           <w:smallCaps w:val="0"/>
           <w:strike w:val="0"/>
           <w:color w:val="000000"/>
@@ -11101,7 +11360,9 @@
         <w:rPr>
           <w:rFonts w:ascii="Calibri" w:cs="Calibri" w:eastAsia="Calibri" w:hAnsi="Calibri"/>
           <w:b w:val="0"/>
+          <w:bCs w:val="0"/>
           <w:i w:val="0"/>
+          <w:iCs w:val="0"/>
           <w:smallCaps w:val="0"/>
           <w:strike w:val="0"/>
           <w:color w:val="000000"/>
@@ -11139,7 +11400,9 @@
         <w:rPr>
           <w:rFonts w:ascii="Calibri" w:cs="Calibri" w:eastAsia="Calibri" w:hAnsi="Calibri"/>
           <w:b w:val="0"/>
+          <w:bCs w:val="0"/>
           <w:i w:val="0"/>
+          <w:iCs w:val="0"/>
           <w:smallCaps w:val="0"/>
           <w:strike w:val="0"/>
           <w:color w:val="000000"/>
@@ -11154,7 +11417,9 @@
         <w:rPr>
           <w:rFonts w:ascii="Calibri" w:cs="Calibri" w:eastAsia="Calibri" w:hAnsi="Calibri"/>
           <w:b w:val="0"/>
+          <w:bCs w:val="0"/>
           <w:i w:val="0"/>
+          <w:iCs w:val="0"/>
           <w:smallCaps w:val="0"/>
           <w:strike w:val="0"/>
           <w:color w:val="000000"/>
@@ -11171,7 +11436,9 @@
         <w:rPr>
           <w:rFonts w:ascii="Calibri" w:cs="Calibri" w:eastAsia="Calibri" w:hAnsi="Calibri"/>
           <w:b w:val="0"/>
+          <w:bCs w:val="0"/>
           <w:i w:val="1"/>
+          <w:iCs w:val="1"/>
           <w:smallCaps w:val="0"/>
           <w:strike w:val="0"/>
           <w:color w:val="000000"/>
@@ -11251,7 +11518,9 @@
         <w:rPr>
           <w:rFonts w:ascii="Calibri" w:cs="Calibri" w:eastAsia="Calibri" w:hAnsi="Calibri"/>
           <w:b w:val="0"/>
+          <w:bCs w:val="0"/>
           <w:i w:val="0"/>
+          <w:iCs w:val="0"/>
           <w:smallCaps w:val="0"/>
           <w:strike w:val="0"/>
           <w:color w:val="000000"/>
@@ -11266,7 +11535,9 @@
         <w:rPr>
           <w:rFonts w:ascii="Calibri" w:cs="Calibri" w:eastAsia="Calibri" w:hAnsi="Calibri"/>
           <w:b w:val="0"/>
+          <w:bCs w:val="0"/>
           <w:i w:val="0"/>
+          <w:iCs w:val="0"/>
           <w:smallCaps w:val="0"/>
           <w:strike w:val="0"/>
           <w:color w:val="000000"/>
@@ -11304,7 +11575,9 @@
         <w:rPr>
           <w:rFonts w:ascii="Calibri" w:cs="Calibri" w:eastAsia="Calibri" w:hAnsi="Calibri"/>
           <w:b w:val="0"/>
+          <w:bCs w:val="0"/>
           <w:i w:val="0"/>
+          <w:iCs w:val="0"/>
           <w:smallCaps w:val="0"/>
           <w:strike w:val="0"/>
           <w:color w:val="000000"/>
@@ -11319,7 +11592,9 @@
         <w:rPr>
           <w:rFonts w:ascii="Calibri" w:cs="Calibri" w:eastAsia="Calibri" w:hAnsi="Calibri"/>
           <w:b w:val="0"/>
+          <w:bCs w:val="0"/>
           <w:i w:val="0"/>
+          <w:iCs w:val="0"/>
           <w:smallCaps w:val="0"/>
           <w:strike w:val="0"/>
           <w:color w:val="000000"/>
@@ -11394,7 +11669,9 @@
         <w:rPr>
           <w:rFonts w:ascii="Calibri" w:cs="Calibri" w:eastAsia="Calibri" w:hAnsi="Calibri"/>
           <w:b w:val="0"/>
+          <w:bCs w:val="0"/>
           <w:i w:val="0"/>
+          <w:iCs w:val="0"/>
           <w:smallCaps w:val="0"/>
           <w:strike w:val="0"/>
           <w:color w:val="000000"/>
@@ -11409,7 +11686,9 @@
         <w:rPr>
           <w:rFonts w:ascii="Calibri" w:cs="Calibri" w:eastAsia="Calibri" w:hAnsi="Calibri"/>
           <w:b w:val="0"/>
+          <w:bCs w:val="0"/>
           <w:i w:val="0"/>
+          <w:iCs w:val="0"/>
           <w:smallCaps w:val="0"/>
           <w:strike w:val="0"/>
           <w:color w:val="000000"/>
@@ -11447,7 +11726,9 @@
         <w:rPr>
           <w:rFonts w:ascii="Calibri" w:cs="Calibri" w:eastAsia="Calibri" w:hAnsi="Calibri"/>
           <w:b w:val="0"/>
+          <w:bCs w:val="0"/>
           <w:i w:val="0"/>
+          <w:iCs w:val="0"/>
           <w:smallCaps w:val="0"/>
           <w:strike w:val="0"/>
           <w:color w:val="000000"/>
@@ -11462,7 +11743,9 @@
         <w:rPr>
           <w:rFonts w:ascii="Calibri" w:cs="Calibri" w:eastAsia="Calibri" w:hAnsi="Calibri"/>
           <w:b w:val="0"/>
+          <w:bCs w:val="0"/>
           <w:i w:val="0"/>
+          <w:iCs w:val="0"/>
           <w:smallCaps w:val="0"/>
           <w:strike w:val="0"/>
           <w:color w:val="000000"/>
@@ -11500,7 +11783,9 @@
         <w:rPr>
           <w:rFonts w:ascii="Calibri" w:cs="Calibri" w:eastAsia="Calibri" w:hAnsi="Calibri"/>
           <w:b w:val="0"/>
+          <w:bCs w:val="0"/>
           <w:i w:val="0"/>
+          <w:iCs w:val="0"/>
           <w:smallCaps w:val="0"/>
           <w:strike w:val="0"/>
           <w:color w:val="000000"/>
@@ -11515,7 +11800,9 @@
         <w:rPr>
           <w:rFonts w:ascii="Calibri" w:cs="Calibri" w:eastAsia="Calibri" w:hAnsi="Calibri"/>
           <w:b w:val="0"/>
+          <w:bCs w:val="0"/>
           <w:i w:val="0"/>
+          <w:iCs w:val="0"/>
           <w:smallCaps w:val="0"/>
           <w:strike w:val="0"/>
           <w:color w:val="000000"/>
@@ -11532,7 +11819,9 @@
         <w:rPr>
           <w:rFonts w:ascii="Calibri" w:cs="Calibri" w:eastAsia="Calibri" w:hAnsi="Calibri"/>
           <w:b w:val="0"/>
+          <w:bCs w:val="0"/>
           <w:i w:val="1"/>
+          <w:iCs w:val="1"/>
           <w:smallCaps w:val="0"/>
           <w:strike w:val="0"/>
           <w:color w:val="000000"/>
@@ -11549,7 +11838,9 @@
         <w:rPr>
           <w:rFonts w:ascii="Calibri" w:cs="Calibri" w:eastAsia="Calibri" w:hAnsi="Calibri"/>
           <w:b w:val="0"/>
+          <w:bCs w:val="0"/>
           <w:i w:val="0"/>
+          <w:iCs w:val="0"/>
           <w:smallCaps w:val="0"/>
           <w:strike w:val="0"/>
           <w:color w:val="000000"/>
@@ -11618,6 +11909,7 @@
         <w:rPr>
           <w:rFonts w:ascii="Calibri" w:cs="Calibri" w:eastAsia="Calibri" w:hAnsi="Calibri"/>
           <w:i w:val="1"/>
+          <w:iCs w:val="1"/>
           <w:color w:val="000000"/>
           <w:sz w:val="20"/>
           <w:szCs w:val="20"/>
@@ -11660,7 +11952,9 @@
         <w:rPr>
           <w:rFonts w:ascii="Calibri" w:cs="Calibri" w:eastAsia="Calibri" w:hAnsi="Calibri"/>
           <w:b w:val="0"/>
+          <w:bCs w:val="0"/>
           <w:i w:val="0"/>
+          <w:iCs w:val="0"/>
           <w:smallCaps w:val="0"/>
           <w:strike w:val="0"/>
           <w:color w:val="000000"/>
@@ -11675,7 +11969,9 @@
         <w:rPr>
           <w:rFonts w:ascii="Calibri" w:cs="Calibri" w:eastAsia="Calibri" w:hAnsi="Calibri"/>
           <w:b w:val="0"/>
+          <w:bCs w:val="0"/>
           <w:i w:val="0"/>
+          <w:iCs w:val="0"/>
           <w:smallCaps w:val="0"/>
           <w:strike w:val="0"/>
           <w:color w:val="000000"/>
@@ -11746,7 +12042,9 @@
         <w:rPr>
           <w:rFonts w:ascii="Calibri" w:cs="Calibri" w:eastAsia="Calibri" w:hAnsi="Calibri"/>
           <w:b w:val="0"/>
+          <w:bCs w:val="0"/>
           <w:i w:val="0"/>
+          <w:iCs w:val="0"/>
           <w:smallCaps w:val="0"/>
           <w:strike w:val="0"/>
           <w:color w:val="000000"/>
@@ -11761,7 +12059,9 @@
         <w:rPr>
           <w:rFonts w:ascii="Calibri" w:cs="Calibri" w:eastAsia="Calibri" w:hAnsi="Calibri"/>
           <w:b w:val="0"/>
+          <w:bCs w:val="0"/>
           <w:i w:val="0"/>
+          <w:iCs w:val="0"/>
           <w:smallCaps w:val="0"/>
           <w:strike w:val="0"/>
           <w:color w:val="000000"/>
@@ -11799,7 +12099,9 @@
         <w:rPr>
           <w:rFonts w:ascii="Calibri" w:cs="Calibri" w:eastAsia="Calibri" w:hAnsi="Calibri"/>
           <w:b w:val="0"/>
+          <w:bCs w:val="0"/>
           <w:i w:val="0"/>
+          <w:iCs w:val="0"/>
           <w:smallCaps w:val="0"/>
           <w:strike w:val="0"/>
           <w:color w:val="000000"/>
@@ -11814,7 +12116,9 @@
         <w:rPr>
           <w:rFonts w:ascii="Calibri" w:cs="Calibri" w:eastAsia="Calibri" w:hAnsi="Calibri"/>
           <w:b w:val="0"/>
+          <w:bCs w:val="0"/>
           <w:i w:val="0"/>
+          <w:iCs w:val="0"/>
           <w:smallCaps w:val="0"/>
           <w:strike w:val="0"/>
           <w:color w:val="000000"/>
@@ -11852,7 +12156,9 @@
         <w:rPr>
           <w:rFonts w:ascii="Calibri" w:cs="Calibri" w:eastAsia="Calibri" w:hAnsi="Calibri"/>
           <w:b w:val="0"/>
+          <w:bCs w:val="0"/>
           <w:i w:val="0"/>
+          <w:iCs w:val="0"/>
           <w:smallCaps w:val="0"/>
           <w:strike w:val="0"/>
           <w:color w:val="000000"/>
@@ -11867,7 +12173,9 @@
         <w:rPr>
           <w:rFonts w:ascii="Calibri" w:cs="Calibri" w:eastAsia="Calibri" w:hAnsi="Calibri"/>
           <w:b w:val="0"/>
+          <w:bCs w:val="0"/>
           <w:i w:val="0"/>
+          <w:iCs w:val="0"/>
           <w:smallCaps w:val="0"/>
           <w:strike w:val="0"/>
           <w:color w:val="000000"/>
@@ -11905,7 +12213,9 @@
         <w:rPr>
           <w:rFonts w:ascii="Calibri" w:cs="Calibri" w:eastAsia="Calibri" w:hAnsi="Calibri"/>
           <w:b w:val="0"/>
+          <w:bCs w:val="0"/>
           <w:i w:val="0"/>
+          <w:iCs w:val="0"/>
           <w:smallCaps w:val="0"/>
           <w:strike w:val="0"/>
           <w:color w:val="000000"/>
@@ -11920,7 +12230,9 @@
         <w:rPr>
           <w:rFonts w:ascii="Calibri" w:cs="Calibri" w:eastAsia="Calibri" w:hAnsi="Calibri"/>
           <w:b w:val="0"/>
+          <w:bCs w:val="0"/>
           <w:i w:val="0"/>
+          <w:iCs w:val="0"/>
           <w:smallCaps w:val="0"/>
           <w:strike w:val="0"/>
           <w:color w:val="000000"/>
@@ -11958,7 +12270,9 @@
         <w:rPr>
           <w:rFonts w:ascii="Calibri" w:cs="Calibri" w:eastAsia="Calibri" w:hAnsi="Calibri"/>
           <w:b w:val="0"/>
+          <w:bCs w:val="0"/>
           <w:i w:val="0"/>
+          <w:iCs w:val="0"/>
           <w:smallCaps w:val="0"/>
           <w:strike w:val="0"/>
           <w:color w:val="000000"/>
@@ -11973,7 +12287,9 @@
         <w:rPr>
           <w:rFonts w:ascii="Calibri" w:cs="Calibri" w:eastAsia="Calibri" w:hAnsi="Calibri"/>
           <w:b w:val="0"/>
+          <w:bCs w:val="0"/>
           <w:i w:val="0"/>
+          <w:iCs w:val="0"/>
           <w:smallCaps w:val="0"/>
           <w:strike w:val="0"/>
           <w:color w:val="000000"/>
@@ -12044,7 +12360,9 @@
         <w:rPr>
           <w:rFonts w:ascii="Calibri" w:cs="Calibri" w:eastAsia="Calibri" w:hAnsi="Calibri"/>
           <w:b w:val="0"/>
+          <w:bCs w:val="0"/>
           <w:i w:val="0"/>
+          <w:iCs w:val="0"/>
           <w:smallCaps w:val="0"/>
           <w:strike w:val="0"/>
           <w:color w:val="000000"/>
@@ -12059,7 +12377,9 @@
         <w:rPr>
           <w:rFonts w:ascii="Calibri" w:cs="Calibri" w:eastAsia="Calibri" w:hAnsi="Calibri"/>
           <w:b w:val="0"/>
+          <w:bCs w:val="0"/>
           <w:i w:val="0"/>
+          <w:iCs w:val="0"/>
           <w:smallCaps w:val="0"/>
           <w:strike w:val="0"/>
           <w:color w:val="000000"/>
@@ -12097,7 +12417,9 @@
         <w:rPr>
           <w:rFonts w:ascii="Calibri" w:cs="Calibri" w:eastAsia="Calibri" w:hAnsi="Calibri"/>
           <w:b w:val="0"/>
+          <w:bCs w:val="0"/>
           <w:i w:val="0"/>
+          <w:iCs w:val="0"/>
           <w:smallCaps w:val="0"/>
           <w:strike w:val="0"/>
           <w:color w:val="000000"/>
@@ -12112,7 +12434,9 @@
         <w:rPr>
           <w:rFonts w:ascii="Calibri" w:cs="Calibri" w:eastAsia="Calibri" w:hAnsi="Calibri"/>
           <w:b w:val="0"/>
+          <w:bCs w:val="0"/>
           <w:i w:val="0"/>
+          <w:iCs w:val="0"/>
           <w:smallCaps w:val="0"/>
           <w:strike w:val="0"/>
           <w:color w:val="000000"/>
@@ -12150,7 +12474,9 @@
         <w:rPr>
           <w:rFonts w:ascii="Calibri" w:cs="Calibri" w:eastAsia="Calibri" w:hAnsi="Calibri"/>
           <w:b w:val="0"/>
+          <w:bCs w:val="0"/>
           <w:i w:val="0"/>
+          <w:iCs w:val="0"/>
           <w:smallCaps w:val="0"/>
           <w:strike w:val="0"/>
           <w:color w:val="000000"/>
@@ -12165,7 +12491,9 @@
         <w:rPr>
           <w:rFonts w:ascii="Calibri" w:cs="Calibri" w:eastAsia="Calibri" w:hAnsi="Calibri"/>
           <w:b w:val="0"/>
+          <w:bCs w:val="0"/>
           <w:i w:val="0"/>
+          <w:iCs w:val="0"/>
           <w:smallCaps w:val="0"/>
           <w:strike w:val="0"/>
           <w:color w:val="000000"/>
@@ -12203,7 +12531,9 @@
         <w:rPr>
           <w:rFonts w:ascii="Calibri" w:cs="Calibri" w:eastAsia="Calibri" w:hAnsi="Calibri"/>
           <w:b w:val="0"/>
+          <w:bCs w:val="0"/>
           <w:i w:val="0"/>
+          <w:iCs w:val="0"/>
           <w:smallCaps w:val="0"/>
           <w:strike w:val="0"/>
           <w:color w:val="000000"/>
@@ -12218,7 +12548,9 @@
         <w:rPr>
           <w:rFonts w:ascii="Calibri" w:cs="Calibri" w:eastAsia="Calibri" w:hAnsi="Calibri"/>
           <w:b w:val="0"/>
+          <w:bCs w:val="0"/>
           <w:i w:val="0"/>
+          <w:iCs w:val="0"/>
           <w:smallCaps w:val="0"/>
           <w:strike w:val="0"/>
           <w:color w:val="000000"/>
@@ -12256,7 +12588,9 @@
         <w:rPr>
           <w:rFonts w:ascii="Calibri" w:cs="Calibri" w:eastAsia="Calibri" w:hAnsi="Calibri"/>
           <w:b w:val="0"/>
+          <w:bCs w:val="0"/>
           <w:i w:val="0"/>
+          <w:iCs w:val="0"/>
           <w:smallCaps w:val="0"/>
           <w:strike w:val="0"/>
           <w:color w:val="000000"/>
@@ -12271,7 +12605,9 @@
         <w:rPr>
           <w:rFonts w:ascii="Calibri" w:cs="Calibri" w:eastAsia="Calibri" w:hAnsi="Calibri"/>
           <w:b w:val="0"/>
+          <w:bCs w:val="0"/>
           <w:i w:val="0"/>
+          <w:iCs w:val="0"/>
           <w:smallCaps w:val="0"/>
           <w:strike w:val="0"/>
           <w:color w:val="000000"/>
@@ -12309,7 +12645,9 @@
         <w:rPr>
           <w:rFonts w:ascii="Calibri" w:cs="Calibri" w:eastAsia="Calibri" w:hAnsi="Calibri"/>
           <w:b w:val="0"/>
+          <w:bCs w:val="0"/>
           <w:i w:val="0"/>
+          <w:iCs w:val="0"/>
           <w:smallCaps w:val="0"/>
           <w:strike w:val="0"/>
           <w:color w:val="000000"/>
@@ -12324,7 +12662,9 @@
         <w:rPr>
           <w:rFonts w:ascii="Calibri" w:cs="Calibri" w:eastAsia="Calibri" w:hAnsi="Calibri"/>
           <w:b w:val="0"/>
+          <w:bCs w:val="0"/>
           <w:i w:val="0"/>
+          <w:iCs w:val="0"/>
           <w:smallCaps w:val="0"/>
           <w:strike w:val="0"/>
           <w:color w:val="000000"/>
@@ -12393,6 +12733,7 @@
         <w:rPr>
           <w:rFonts w:ascii="Calibri" w:cs="Calibri" w:eastAsia="Calibri" w:hAnsi="Calibri"/>
           <w:i w:val="1"/>
+          <w:iCs w:val="1"/>
           <w:color w:val="000000"/>
           <w:sz w:val="20"/>
           <w:szCs w:val="20"/>
@@ -12435,7 +12776,9 @@
         <w:rPr>
           <w:rFonts w:ascii="Calibri" w:cs="Calibri" w:eastAsia="Calibri" w:hAnsi="Calibri"/>
           <w:b w:val="0"/>
+          <w:bCs w:val="0"/>
           <w:i w:val="0"/>
+          <w:iCs w:val="0"/>
           <w:smallCaps w:val="0"/>
           <w:strike w:val="0"/>
           <w:color w:val="000000"/>
@@ -12450,7 +12793,9 @@
         <w:rPr>
           <w:rFonts w:ascii="Calibri" w:cs="Calibri" w:eastAsia="Calibri" w:hAnsi="Calibri"/>
           <w:b w:val="0"/>
+          <w:bCs w:val="0"/>
           <w:i w:val="0"/>
+          <w:iCs w:val="0"/>
           <w:smallCaps w:val="0"/>
           <w:strike w:val="0"/>
           <w:color w:val="000000"/>
@@ -12467,7 +12812,9 @@
         <w:rPr>
           <w:rFonts w:ascii="Calibri" w:cs="Calibri" w:eastAsia="Calibri" w:hAnsi="Calibri"/>
           <w:b w:val="0"/>
+          <w:bCs w:val="0"/>
           <w:i w:val="1"/>
+          <w:iCs w:val="1"/>
           <w:smallCaps w:val="0"/>
           <w:strike w:val="0"/>
           <w:color w:val="000000"/>
@@ -12484,7 +12831,9 @@
         <w:rPr>
           <w:rFonts w:ascii="Calibri" w:cs="Calibri" w:eastAsia="Calibri" w:hAnsi="Calibri"/>
           <w:b w:val="0"/>
+          <w:bCs w:val="0"/>
           <w:i w:val="0"/>
+          <w:iCs w:val="0"/>
           <w:smallCaps w:val="0"/>
           <w:strike w:val="0"/>
           <w:color w:val="000000"/>
@@ -12559,7 +12908,9 @@
         <w:rPr>
           <w:rFonts w:ascii="Calibri" w:cs="Calibri" w:eastAsia="Calibri" w:hAnsi="Calibri"/>
           <w:b w:val="0"/>
+          <w:bCs w:val="0"/>
           <w:i w:val="0"/>
+          <w:iCs w:val="0"/>
           <w:smallCaps w:val="0"/>
           <w:strike w:val="0"/>
           <w:color w:val="000000"/>
@@ -12574,7 +12925,9 @@
         <w:rPr>
           <w:rFonts w:ascii="Calibri" w:cs="Calibri" w:eastAsia="Calibri" w:hAnsi="Calibri"/>
           <w:b w:val="0"/>
+          <w:bCs w:val="0"/>
           <w:i w:val="0"/>
+          <w:iCs w:val="0"/>
           <w:smallCaps w:val="0"/>
           <w:strike w:val="0"/>
           <w:color w:val="000000"/>
@@ -12612,7 +12965,9 @@
         <w:rPr>
           <w:rFonts w:ascii="Calibri" w:cs="Calibri" w:eastAsia="Calibri" w:hAnsi="Calibri"/>
           <w:b w:val="0"/>
+          <w:bCs w:val="0"/>
           <w:i w:val="0"/>
+          <w:iCs w:val="0"/>
           <w:smallCaps w:val="0"/>
           <w:strike w:val="0"/>
           <w:color w:val="000000"/>
@@ -12627,7 +12982,9 @@
         <w:rPr>
           <w:rFonts w:ascii="Calibri" w:cs="Calibri" w:eastAsia="Calibri" w:hAnsi="Calibri"/>
           <w:b w:val="0"/>
+          <w:bCs w:val="0"/>
           <w:i w:val="0"/>
+          <w:iCs w:val="0"/>
           <w:smallCaps w:val="0"/>
           <w:strike w:val="0"/>
           <w:color w:val="000000"/>
@@ -12702,7 +13059,9 @@
         <w:rPr>
           <w:rFonts w:ascii="Calibri" w:cs="Calibri" w:eastAsia="Calibri" w:hAnsi="Calibri"/>
           <w:b w:val="0"/>
+          <w:bCs w:val="0"/>
           <w:i w:val="0"/>
+          <w:iCs w:val="0"/>
           <w:smallCaps w:val="0"/>
           <w:strike w:val="0"/>
           <w:color w:val="000000"/>
@@ -12717,7 +13076,9 @@
         <w:rPr>
           <w:rFonts w:ascii="Calibri" w:cs="Calibri" w:eastAsia="Calibri" w:hAnsi="Calibri"/>
           <w:b w:val="0"/>
+          <w:bCs w:val="0"/>
           <w:i w:val="0"/>
+          <w:iCs w:val="0"/>
           <w:smallCaps w:val="0"/>
           <w:strike w:val="0"/>
           <w:color w:val="000000"/>
@@ -12755,7 +13116,9 @@
         <w:rPr>
           <w:rFonts w:ascii="Calibri" w:cs="Calibri" w:eastAsia="Calibri" w:hAnsi="Calibri"/>
           <w:b w:val="0"/>
+          <w:bCs w:val="0"/>
           <w:i w:val="0"/>
+          <w:iCs w:val="0"/>
           <w:smallCaps w:val="0"/>
           <w:strike w:val="0"/>
           <w:color w:val="000000"/>
@@ -12770,7 +13133,9 @@
         <w:rPr>
           <w:rFonts w:ascii="Calibri" w:cs="Calibri" w:eastAsia="Calibri" w:hAnsi="Calibri"/>
           <w:b w:val="0"/>
+          <w:bCs w:val="0"/>
           <w:i w:val="0"/>
+          <w:iCs w:val="0"/>
           <w:smallCaps w:val="0"/>
           <w:strike w:val="0"/>
           <w:color w:val="000000"/>
@@ -12815,6 +13180,7 @@
         <w:rPr>
           <w:rFonts w:ascii="Calibri" w:cs="Calibri" w:eastAsia="Calibri" w:hAnsi="Calibri"/>
           <w:b w:val="1"/>
+          <w:bCs w:val="1"/>
           <w:sz w:val="20"/>
           <w:szCs w:val="20"/>
           <w:rtl w:val="0"/>
@@ -12966,6 +13332,7 @@
         <w:rPr>
           <w:rFonts w:ascii="Calibri" w:cs="Calibri" w:eastAsia="Calibri" w:hAnsi="Calibri"/>
           <w:b w:val="1"/>
+          <w:bCs w:val="1"/>
           <w:sz w:val="20"/>
           <w:szCs w:val="20"/>
           <w:rtl w:val="0"/>
@@ -13131,6 +13498,7 @@
         <w:rPr>
           <w:rFonts w:ascii="Calibri" w:cs="Calibri" w:eastAsia="Calibri" w:hAnsi="Calibri"/>
           <w:b w:val="1"/>
+          <w:bCs w:val="1"/>
           <w:sz w:val="20"/>
           <w:szCs w:val="20"/>
           <w:rtl w:val="0"/>
@@ -13934,6 +14302,7 @@
         <w:rPr>
           <w:rFonts w:ascii="Calibri" w:cs="Calibri" w:eastAsia="Calibri" w:hAnsi="Calibri"/>
           <w:b w:val="1"/>
+          <w:bCs w:val="1"/>
           <w:sz w:val="20"/>
           <w:szCs w:val="20"/>
           <w:rtl w:val="0"/>
@@ -14737,6 +15106,7 @@
         <w:rPr>
           <w:rFonts w:ascii="Calibri" w:cs="Calibri" w:eastAsia="Calibri" w:hAnsi="Calibri"/>
           <w:b w:val="1"/>
+          <w:bCs w:val="1"/>
           <w:sz w:val="20"/>
           <w:szCs w:val="20"/>
           <w:rtl w:val="0"/>
@@ -14840,6 +15210,7 @@
         <w:rPr>
           <w:rFonts w:ascii="Calibri" w:cs="Calibri" w:eastAsia="Calibri" w:hAnsi="Calibri"/>
           <w:i w:val="1"/>
+          <w:iCs w:val="1"/>
           <w:color w:val="000000"/>
           <w:sz w:val="20"/>
           <w:szCs w:val="20"/>
@@ -14861,6 +15232,7 @@
         <w:rPr>
           <w:rFonts w:ascii="Calibri" w:cs="Calibri" w:eastAsia="Calibri" w:hAnsi="Calibri"/>
           <w:i w:val="1"/>
+          <w:iCs w:val="1"/>
           <w:color w:val="000000"/>
           <w:sz w:val="20"/>
           <w:szCs w:val="20"/>
@@ -14914,6 +15286,7 @@
         <w:rPr>
           <w:rFonts w:ascii="Calibri" w:cs="Calibri" w:eastAsia="Calibri" w:hAnsi="Calibri"/>
           <w:i w:val="1"/>
+          <w:iCs w:val="1"/>
           <w:color w:val="000000"/>
           <w:sz w:val="20"/>
           <w:szCs w:val="20"/>
@@ -14955,6 +15328,7 @@
         <w:rPr>
           <w:rFonts w:ascii="Calibri" w:cs="Calibri" w:eastAsia="Calibri" w:hAnsi="Calibri"/>
           <w:i w:val="1"/>
+          <w:iCs w:val="1"/>
           <w:color w:val="000000"/>
           <w:sz w:val="20"/>
           <w:szCs w:val="20"/>
@@ -14996,6 +15370,7 @@
         <w:rPr>
           <w:rFonts w:ascii="Calibri" w:cs="Calibri" w:eastAsia="Calibri" w:hAnsi="Calibri"/>
           <w:i w:val="1"/>
+          <w:iCs w:val="1"/>
           <w:color w:val="000000"/>
           <w:sz w:val="20"/>
           <w:szCs w:val="20"/>
@@ -15017,6 +15392,7 @@
         <w:rPr>
           <w:rFonts w:ascii="Calibri" w:cs="Calibri" w:eastAsia="Calibri" w:hAnsi="Calibri"/>
           <w:i w:val="1"/>
+          <w:iCs w:val="1"/>
           <w:color w:val="000000"/>
           <w:sz w:val="20"/>
           <w:szCs w:val="20"/>
@@ -15043,6 +15419,7 @@
         <w:rPr>
           <w:rFonts w:ascii="Calibri" w:cs="Calibri" w:eastAsia="Calibri" w:hAnsi="Calibri"/>
           <w:b w:val="1"/>
+          <w:bCs w:val="1"/>
           <w:sz w:val="20"/>
           <w:szCs w:val="20"/>
           <w:rtl w:val="0"/>
@@ -15388,6 +15765,7 @@
         <w:jc w:val="center"/>
         <w:rPr>
           <w:b w:val="1"/>
+          <w:bCs w:val="1"/>
           <w:sz w:val="20"/>
           <w:szCs w:val="20"/>
         </w:rPr>
@@ -15411,6 +15789,7 @@
         <w:rPr>
           <w:rFonts w:ascii="Calibri" w:cs="Calibri" w:eastAsia="Calibri" w:hAnsi="Calibri"/>
           <w:b w:val="1"/>
+          <w:bCs w:val="1"/>
           <w:sz w:val="20"/>
           <w:szCs w:val="20"/>
           <w:rtl w:val="0"/>
@@ -15448,6 +15827,7 @@
         <w:rPr>
           <w:rFonts w:ascii="Calibri" w:cs="Calibri" w:eastAsia="Calibri" w:hAnsi="Calibri"/>
           <w:i w:val="1"/>
+          <w:iCs w:val="1"/>
           <w:sz w:val="20"/>
           <w:szCs w:val="20"/>
           <w:rtl w:val="0"/>
@@ -16425,6 +16805,7 @@
         <w:rPr>
           <w:rFonts w:ascii="Calibri" w:cs="Calibri" w:eastAsia="Calibri" w:hAnsi="Calibri"/>
           <w:b w:val="1"/>
+          <w:bCs w:val="1"/>
           <w:sz w:val="20"/>
           <w:szCs w:val="20"/>
           <w:rtl w:val="0"/>
@@ -17034,6 +17415,7 @@
         <w:rPr>
           <w:rFonts w:ascii="Calibri" w:cs="Calibri" w:eastAsia="Calibri" w:hAnsi="Calibri"/>
           <w:b w:val="1"/>
+          <w:bCs w:val="1"/>
           <w:sz w:val="20"/>
           <w:szCs w:val="20"/>
           <w:rtl w:val="0"/>
@@ -17659,6 +18041,7 @@
         <w:jc w:val="left"/>
         <w:rPr>
           <w:b w:val="1"/>
+          <w:bCs w:val="1"/>
           <w:sz w:val="20"/>
           <w:szCs w:val="20"/>
         </w:rPr>
@@ -17682,6 +18065,7 @@
         <w:rPr>
           <w:rFonts w:ascii="Calibri" w:cs="Calibri" w:eastAsia="Calibri" w:hAnsi="Calibri"/>
           <w:b w:val="1"/>
+          <w:bCs w:val="1"/>
           <w:sz w:val="20"/>
           <w:szCs w:val="20"/>
           <w:rtl w:val="0"/>
@@ -18184,6 +18568,7 @@
         <w:rPr>
           <w:rFonts w:ascii="Calibri" w:cs="Calibri" w:eastAsia="Calibri" w:hAnsi="Calibri"/>
           <w:b w:val="1"/>
+          <w:bCs w:val="1"/>
           <w:sz w:val="20"/>
           <w:szCs w:val="20"/>
           <w:rtl w:val="0"/>
@@ -18441,6 +18826,7 @@
         <w:rPr>
           <w:rFonts w:ascii="Calibri" w:cs="Calibri" w:eastAsia="Calibri" w:hAnsi="Calibri"/>
           <w:b w:val="1"/>
+          <w:bCs w:val="1"/>
           <w:sz w:val="20"/>
           <w:szCs w:val="20"/>
           <w:rtl w:val="0"/>
@@ -18777,363 +19163,188 @@
       <w:pPr>
         <w:jc w:val="center"/>
         <w:rPr>
-          <w:rFonts w:ascii="Calibri" w:cs="Calibri" w:eastAsia="Calibri" w:hAnsi="Calibri"/>
-          <w:sz w:val="20"/>
-          <w:szCs w:val="20"/>
-        </w:rPr>
-      </w:pPr>
-      <w:r>
-        <w:rPr>
-          <w:rFonts w:ascii="Calibri" w:cs="Calibri" w:eastAsia="Calibri" w:hAnsi="Calibri"/>
+          <w:sz w:val="20"/>
+          <w:szCs w:val="20"/>
+        </w:rPr>
+      </w:pPr>
+      <w:r>
+        <w:rPr>
           <w:b w:val="1"/>
-          <w:sz w:val="20"/>
-          <w:szCs w:val="20"/>
-          <w:rtl w:val="0"/>
-        </w:rPr>
-        <w:t xml:space="preserve">KUPEC</w:t>
-      </w:r>
-      <w:r>
-        <w:rPr>
-          <w:rFonts w:ascii="Calibri" w:cs="Calibri" w:eastAsia="Calibri" w:hAnsi="Calibri"/>
-          <w:sz w:val="20"/>
-          <w:szCs w:val="20"/>
-          <w:rtl w:val="0"/>
-        </w:rPr>
-        <w:t xml:space="preserve"> – CESTA LŽÍ</w:t>
-      </w:r>
-    </w:p>
-    <w:p>
-      <w:pPr>
-        <w:rPr>
-          <w:rFonts w:ascii="Calibri" w:cs="Calibri" w:eastAsia="Calibri" w:hAnsi="Calibri"/>
-          <w:sz w:val="20"/>
-          <w:szCs w:val="20"/>
-        </w:rPr>
-      </w:pPr>
-      <w:r>
-        <w:rPr>
-          <w:rFonts w:ascii="Calibri" w:cs="Calibri" w:eastAsia="Calibri" w:hAnsi="Calibri"/>
-          <w:sz w:val="20"/>
-          <w:szCs w:val="20"/>
-          <w:rtl w:val="0"/>
-        </w:rPr>
-        <w:t xml:space="preserve">Jsi skvělý vyjednavač a máš neomylnou schopnost vyčuchat šperky a zlato.</w:t>
+          <w:bCs w:val="1"/>
+          <w:sz w:val="20"/>
+          <w:szCs w:val="20"/>
+          <w:rtl w:val="0"/>
+        </w:rPr>
+        <w:t xml:space="preserve">KUPE</w:t>
+      </w:r>
+      <w:sdt>
+        <w:sdtPr>
+          <w:id w:val="236670461"/>
+          <w:tag w:val="goog_rdk_0"/>
+        </w:sdtPr>
+        <w:sdtContent>
+          <w:ins w:author="Marek Timko" w:id="0" w:date="2026-10-05T18:47:08Z">
+            <w:r>
+              <w:rPr>
+                <w:b w:val="1"/>
+                <w:bCs w:val="1"/>
+                <w:sz w:val="20"/>
+                <w:szCs w:val="20"/>
+                <w:rtl w:val="0"/>
+              </w:rPr>
+              <w:t xml:space="preserve">C</w:t>
+            </w:r>
+          </w:ins>
+        </w:sdtContent>
+      </w:sdt>
+      <w:sdt>
+        <w:sdtPr>
+          <w:id w:val="-293038171"/>
+          <w:tag w:val="goog_rdk_1"/>
+        </w:sdtPr>
+        <w:sdtContent>
+          <w:del w:author="Marek Timko" w:id="0" w:date="2026-10-05T18:47:08Z">
+            <w:r>
+              <w:rPr>
+                <w:b w:val="1"/>
+                <w:bCs w:val="1"/>
+                <w:sz w:val="20"/>
+                <w:szCs w:val="20"/>
+                <w:rtl w:val="0"/>
+              </w:rPr>
+              <w:delText xml:space="preserve">R</w:delText>
+            </w:r>
+          </w:del>
+        </w:sdtContent>
+      </w:sdt>
+      <w:r>
+        <w:rPr>
+          <w:sz w:val="20"/>
+          <w:szCs w:val="20"/>
+          <w:rtl w:val="0"/>
+        </w:rPr>
+        <w:t xml:space="preserve">– CESTA POKLADU</w:t>
+      </w:r>
+    </w:p>
+    <w:p>
+      <w:pPr>
+        <w:rPr>
+          <w:sz w:val="20"/>
+          <w:szCs w:val="20"/>
+        </w:rPr>
+      </w:pPr>
+      <w:r>
+        <w:rPr>
+          <w:sz w:val="20"/>
+          <w:szCs w:val="20"/>
+          <w:rtl w:val="0"/>
+        </w:rPr>
+        <w:t xml:space="preserve">Jsi skvělý vyjednavač a máš neomylnou schopnost vyčuchat šperky a zlato. </w:t>
       </w:r>
     </w:p>
     <w:p>
       <w:pPr>
         <w:numPr>
           <w:ilvl w:val="0"/>
-          <w:numId w:val="92"/>
+          <w:numId w:val="93"/>
         </w:numPr>
-        <w:pBdr>
-          <w:top w:space="0" w:sz="0" w:val="nil"/>
-          <w:left w:space="0" w:sz="0" w:val="nil"/>
-          <w:bottom w:space="0" w:sz="0" w:val="nil"/>
-          <w:right w:space="0" w:sz="0" w:val="nil"/>
-          <w:between w:space="0" w:sz="0" w:val="nil"/>
-        </w:pBdr>
         <w:spacing w:after="0" w:lineRule="auto"/>
         <w:ind w:left="720" w:hanging="360"/>
         <w:rPr>
-          <w:rFonts w:ascii="Calibri" w:cs="Calibri" w:eastAsia="Calibri" w:hAnsi="Calibri"/>
-          <w:color w:val="000000"/>
-          <w:sz w:val="20"/>
-          <w:szCs w:val="20"/>
-        </w:rPr>
-      </w:pPr>
-      <w:r>
-        <w:rPr>
-          <w:rFonts w:ascii="Calibri" w:cs="Calibri" w:eastAsia="Calibri" w:hAnsi="Calibri"/>
-          <w:sz w:val="20"/>
-          <w:szCs w:val="20"/>
-          <w:rtl w:val="0"/>
-        </w:rPr>
-        <w:t xml:space="preserve">P</w:t>
-      </w:r>
-      <w:r>
-        <w:rPr>
-          <w:sz w:val="20"/>
-          <w:szCs w:val="20"/>
-          <w:rtl w:val="0"/>
-        </w:rPr>
-        <w:t xml:space="preserve">ř</w:t>
-      </w:r>
-      <w:r>
-        <w:rPr>
-          <w:rFonts w:ascii="Calibri" w:cs="Calibri" w:eastAsia="Calibri" w:hAnsi="Calibri"/>
-          <w:sz w:val="20"/>
-          <w:szCs w:val="20"/>
-          <w:rtl w:val="0"/>
-        </w:rPr>
-        <w:t xml:space="preserve">i n</w:t>
-      </w:r>
-      <w:r>
-        <w:rPr>
-          <w:sz w:val="20"/>
-          <w:szCs w:val="20"/>
-          <w:rtl w:val="0"/>
-        </w:rPr>
-        <w:t xml:space="preserve">á</w:t>
-      </w:r>
-      <w:r>
-        <w:rPr>
-          <w:rFonts w:ascii="Calibri" w:cs="Calibri" w:eastAsia="Calibri" w:hAnsi="Calibri"/>
-          <w:sz w:val="20"/>
-          <w:szCs w:val="20"/>
-          <w:rtl w:val="0"/>
-        </w:rPr>
-        <w:t xml:space="preserve">kupu n</w:t>
-      </w:r>
-      <w:r>
-        <w:rPr>
-          <w:sz w:val="20"/>
-          <w:szCs w:val="20"/>
-          <w:rtl w:val="0"/>
-        </w:rPr>
-        <w:t xml:space="preserve">ě</w:t>
-      </w:r>
-      <w:r>
-        <w:rPr>
-          <w:rFonts w:ascii="Calibri" w:cs="Calibri" w:eastAsia="Calibri" w:hAnsi="Calibri"/>
-          <w:sz w:val="20"/>
-          <w:szCs w:val="20"/>
-          <w:rtl w:val="0"/>
-        </w:rPr>
-        <w:t xml:space="preserve">jak</w:t>
-      </w:r>
-      <w:r>
-        <w:rPr>
-          <w:sz w:val="20"/>
-          <w:szCs w:val="20"/>
-          <w:rtl w:val="0"/>
-        </w:rPr>
-        <w:t xml:space="preserve">é</w:t>
-      </w:r>
-      <w:r>
-        <w:rPr>
-          <w:rFonts w:ascii="Calibri" w:cs="Calibri" w:eastAsia="Calibri" w:hAnsi="Calibri"/>
-          <w:sz w:val="20"/>
-          <w:szCs w:val="20"/>
-          <w:rtl w:val="0"/>
-        </w:rPr>
-        <w:t xml:space="preserve">ho p</w:t>
-      </w:r>
-      <w:r>
-        <w:rPr>
-          <w:sz w:val="20"/>
-          <w:szCs w:val="20"/>
-          <w:rtl w:val="0"/>
-        </w:rPr>
-        <w:t xml:space="preserve">ř</w:t>
-      </w:r>
-      <w:r>
-        <w:rPr>
-          <w:rFonts w:ascii="Calibri" w:cs="Calibri" w:eastAsia="Calibri" w:hAnsi="Calibri"/>
-          <w:sz w:val="20"/>
-          <w:szCs w:val="20"/>
-          <w:rtl w:val="0"/>
-        </w:rPr>
-        <w:t xml:space="preserve">edm</w:t>
-      </w:r>
-      <w:r>
-        <w:rPr>
-          <w:sz w:val="20"/>
-          <w:szCs w:val="20"/>
-          <w:rtl w:val="0"/>
-        </w:rPr>
-        <w:t xml:space="preserve">ě</w:t>
-      </w:r>
-      <w:r>
-        <w:rPr>
-          <w:rFonts w:ascii="Calibri" w:cs="Calibri" w:eastAsia="Calibri" w:hAnsi="Calibri"/>
-          <w:sz w:val="20"/>
-          <w:szCs w:val="20"/>
-          <w:rtl w:val="0"/>
-        </w:rPr>
-        <w:t xml:space="preserve">tu m</w:t>
-      </w:r>
-      <w:r>
-        <w:rPr>
-          <w:sz w:val="20"/>
-          <w:szCs w:val="20"/>
-          <w:rtl w:val="0"/>
-        </w:rPr>
-        <w:t xml:space="preserve">ůž</w:t>
-      </w:r>
-      <w:r>
-        <w:rPr>
-          <w:rFonts w:ascii="Calibri" w:cs="Calibri" w:eastAsia="Calibri" w:hAnsi="Calibri"/>
-          <w:sz w:val="20"/>
-          <w:szCs w:val="20"/>
-          <w:rtl w:val="0"/>
-        </w:rPr>
-        <w:t xml:space="preserve">e</w:t>
-      </w:r>
-      <w:r>
-        <w:rPr>
-          <w:sz w:val="20"/>
-          <w:szCs w:val="20"/>
-          <w:rtl w:val="0"/>
-        </w:rPr>
-        <w:t xml:space="preserve">š</w:t>
-      </w:r>
-      <w:r>
-        <w:rPr>
-          <w:rFonts w:ascii="Calibri" w:cs="Calibri" w:eastAsia="Calibri" w:hAnsi="Calibri"/>
-          <w:sz w:val="20"/>
-          <w:szCs w:val="20"/>
-          <w:rtl w:val="0"/>
-        </w:rPr>
-        <w:t xml:space="preserve"> utracen</w:t>
-      </w:r>
-      <w:r>
-        <w:rPr>
-          <w:sz w:val="20"/>
-          <w:szCs w:val="20"/>
-          <w:rtl w:val="0"/>
-        </w:rPr>
-        <w:t xml:space="preserve">í</w:t>
-      </w:r>
-      <w:r>
-        <w:rPr>
-          <w:rFonts w:ascii="Calibri" w:cs="Calibri" w:eastAsia="Calibri" w:hAnsi="Calibri"/>
-          <w:sz w:val="20"/>
-          <w:szCs w:val="20"/>
-          <w:rtl w:val="0"/>
-        </w:rPr>
-        <w:t xml:space="preserve">m bod</w:t>
-      </w:r>
-      <w:r>
-        <w:rPr>
-          <w:sz w:val="20"/>
-          <w:szCs w:val="20"/>
-          <w:rtl w:val="0"/>
-        </w:rPr>
-        <w:t xml:space="preserve">ů</w:t>
-      </w:r>
-      <w:r>
-        <w:rPr>
-          <w:rFonts w:ascii="Calibri" w:cs="Calibri" w:eastAsia="Calibri" w:hAnsi="Calibri"/>
-          <w:sz w:val="20"/>
-          <w:szCs w:val="20"/>
-          <w:rtl w:val="0"/>
-        </w:rPr>
-        <w:t xml:space="preserve"> v</w:t>
-      </w:r>
-      <w:r>
-        <w:rPr>
-          <w:sz w:val="20"/>
-          <w:szCs w:val="20"/>
-          <w:rtl w:val="0"/>
-        </w:rPr>
-        <w:t xml:space="preserve">ů</w:t>
-      </w:r>
-      <w:r>
-        <w:rPr>
-          <w:rFonts w:ascii="Calibri" w:cs="Calibri" w:eastAsia="Calibri" w:hAnsi="Calibri"/>
-          <w:sz w:val="20"/>
-          <w:szCs w:val="20"/>
-          <w:rtl w:val="0"/>
-        </w:rPr>
-        <w:t xml:space="preserve">le automaticky usmlouvat cenu. Cena se sníží o jednu pětinu za každý utracený bod vůle. Maximálně můžeš utratit 4 body vůle, čímž cenu snížíš na jednu pětinu</w:t>
-      </w:r>
-      <w:r>
-        <w:rPr>
-          <w:rFonts w:ascii="Calibri" w:cs="Calibri" w:eastAsia="Calibri" w:hAnsi="Calibri"/>
-          <w:color w:val="000000"/>
-          <w:sz w:val="20"/>
-          <w:szCs w:val="20"/>
-          <w:rtl w:val="0"/>
-        </w:rPr>
-        <w:t xml:space="preserve">.</w:t>
+          <w:sz w:val="20"/>
+          <w:szCs w:val="20"/>
+        </w:rPr>
+      </w:pPr>
+      <w:r>
+        <w:rPr>
+          <w:sz w:val="20"/>
+          <w:szCs w:val="20"/>
+          <w:rtl w:val="0"/>
+        </w:rPr>
+        <w:t xml:space="preserve">Při nákupu nějakého předmětu můžeš utracením bodů vůle automaticky usmlouvat cenu. Cena se sníží o jednu pětinu za každý utracený bod vůle. Maximálně můžeš utratit 4 body vůle, čímž cenu snížíš na jednu pětinu.</w:t>
       </w:r>
     </w:p>
     <w:p>
       <w:pPr>
         <w:numPr>
           <w:ilvl w:val="0"/>
-          <w:numId w:val="92"/>
+          <w:numId w:val="93"/>
         </w:numPr>
-        <w:pBdr>
-          <w:top w:space="0" w:sz="0" w:val="nil"/>
-          <w:left w:space="0" w:sz="0" w:val="nil"/>
-          <w:bottom w:space="0" w:sz="0" w:val="nil"/>
-          <w:right w:space="0" w:sz="0" w:val="nil"/>
-          <w:between w:space="0" w:sz="0" w:val="nil"/>
-        </w:pBdr>
-        <w:spacing w:after="0" w:lineRule="auto"/>
+        <w:spacing w:after="0" w:afterAutospacing="0"/>
         <w:ind w:left="720" w:hanging="360"/>
         <w:rPr>
-          <w:rFonts w:ascii="Calibri" w:cs="Calibri" w:eastAsia="Calibri" w:hAnsi="Calibri"/>
-          <w:color w:val="000000"/>
-          <w:sz w:val="20"/>
-          <w:szCs w:val="20"/>
-        </w:rPr>
-      </w:pPr>
-      <w:r>
-        <w:rPr>
-          <w:rFonts w:ascii="Calibri" w:cs="Calibri" w:eastAsia="Calibri" w:hAnsi="Calibri"/>
-          <w:sz w:val="20"/>
-          <w:szCs w:val="20"/>
-          <w:rtl w:val="0"/>
-        </w:rPr>
-        <w:t xml:space="preserve">Kdykoli vejdeš do nové místnosti, můžeš utracením bodu vůle rozpoznat, jestli se v ní nacházejí nějaké cennosti a kde. Talent se týká jen zlata a šperků, nikoli jedinečných artefaktů.</w:t>
-      </w:r>
-      <w:r>
-        <w:rPr>
-          <w:rtl w:val="0"/>
-        </w:rPr>
+          <w:sz w:val="20"/>
+          <w:szCs w:val="20"/>
+          <w:u w:val="none"/>
+        </w:rPr>
+      </w:pPr>
+      <w:r>
+        <w:rPr>
+          <w:sz w:val="20"/>
+          <w:szCs w:val="20"/>
+          <w:rtl w:val="0"/>
+        </w:rPr>
+        <w:t xml:space="preserve">Utracením jednoho bodu vůle automaticky uspěješ při hodu na dostupnost (strana 179) pro neobvyklý předmět. Za dva body vůle pro vzácný předmět. Můžeš si napřed hodit a body případně utratit, teprve když neuspěješ. </w:t>
+      </w:r>
+      <w:r>
+        <w:rPr>
+          <w:sz w:val="16"/>
+          <w:szCs w:val="16"/>
+          <w:rtl w:val="0"/>
+        </w:rPr>
+        <w:t xml:space="preserve">(</w:t>
+      </w:r>
+      <w:r>
+        <w:rPr>
+          <w:i w:val="1"/>
+          <w:iCs w:val="1"/>
+          <w:sz w:val="16"/>
+          <w:szCs w:val="16"/>
+          <w:rtl w:val="0"/>
+        </w:rPr>
+        <w:t xml:space="preserve">NEOBVYKLÝ: Hoď si k6. Při hodu 4 nebo víc je k mání k6 jednotek nebo kusů. Každý týden je možné hodit znova. VZÁCNÝ: Hoď si k6. Při hodu 6 je k mání jedna</w:t>
+      </w:r>
+      <w:r>
+        <w:rPr>
+          <w:sz w:val="16"/>
+          <w:szCs w:val="16"/>
+          <w:rtl w:val="0"/>
+        </w:rPr>
+        <w:t xml:space="preserve">)</w:t>
       </w:r>
     </w:p>
     <w:p>
       <w:pPr>
         <w:numPr>
           <w:ilvl w:val="0"/>
-          <w:numId w:val="92"/>
+          <w:numId w:val="93"/>
         </w:numPr>
-        <w:pBdr>
-          <w:top w:space="0" w:sz="0" w:val="nil"/>
-          <w:left w:space="0" w:sz="0" w:val="nil"/>
-          <w:bottom w:space="0" w:sz="0" w:val="nil"/>
-          <w:right w:space="0" w:sz="0" w:val="nil"/>
-          <w:between w:space="0" w:sz="0" w:val="nil"/>
-        </w:pBdr>
         <w:ind w:left="720" w:hanging="360"/>
         <w:rPr>
-          <w:rFonts w:ascii="Calibri" w:cs="Calibri" w:eastAsia="Calibri" w:hAnsi="Calibri"/>
-          <w:color w:val="000000"/>
-          <w:sz w:val="20"/>
-          <w:szCs w:val="20"/>
-        </w:rPr>
-      </w:pPr>
-      <w:r>
-        <w:rPr>
-          <w:rFonts w:ascii="Calibri" w:cs="Calibri" w:eastAsia="Calibri" w:hAnsi="Calibri"/>
-          <w:sz w:val="20"/>
-          <w:szCs w:val="20"/>
-          <w:rtl w:val="0"/>
-        </w:rPr>
-        <w:t xml:space="preserve">Za každý utracený bod vůle najdeš po kapsách 1 zlaťák, a to i když tě před chvílí někdo prohledal nebo se ti stalo něco podobného.</w:t>
-      </w:r>
-      <w:r>
-        <w:rPr>
-          <w:rtl w:val="0"/>
-        </w:rPr>
-      </w:r>
-    </w:p>
-    <w:p>
-      <w:pPr>
-        <w:rPr>
-          <w:rFonts w:ascii="Calibri" w:cs="Calibri" w:eastAsia="Calibri" w:hAnsi="Calibri"/>
+          <w:sz w:val="20"/>
+          <w:szCs w:val="20"/>
+          <w:u w:val="none"/>
+        </w:rPr>
+      </w:pPr>
+      <w:r>
+        <w:rPr>
+          <w:sz w:val="20"/>
+          <w:szCs w:val="20"/>
+          <w:rtl w:val="0"/>
+        </w:rPr>
+        <w:t xml:space="preserve">Když prohledáváš místnost, můžeš v ní utracením bodu vůle najít všechny tajné dveře a skryté poklady.</w:t>
+      </w:r>
+    </w:p>
+    <w:p>
+      <w:pPr>
+        <w:jc w:val="center"/>
+        <w:rPr>
           <w:b w:val="1"/>
-          <w:sz w:val="20"/>
-          <w:szCs w:val="20"/>
-        </w:rPr>
-      </w:pPr>
-      <w:r>
-        <w:br w:type="page"/>
-      </w:r>
+          <w:bCs w:val="1"/>
+          <w:sz w:val="20"/>
+          <w:szCs w:val="20"/>
+        </w:rPr>
+      </w:pPr>
       <w:r>
         <w:rPr>
           <w:rtl w:val="0"/>
@@ -19153,6 +19364,7 @@
         <w:rPr>
           <w:rFonts w:ascii="Calibri" w:cs="Calibri" w:eastAsia="Calibri" w:hAnsi="Calibri"/>
           <w:b w:val="1"/>
+          <w:bCs w:val="1"/>
           <w:sz w:val="20"/>
           <w:szCs w:val="20"/>
           <w:rtl w:val="0"/>
@@ -19881,6 +20093,7 @@
         <w:rPr>
           <w:rFonts w:ascii="Calibri" w:cs="Calibri" w:eastAsia="Calibri" w:hAnsi="Calibri"/>
           <w:b w:val="1"/>
+          <w:bCs w:val="1"/>
           <w:sz w:val="20"/>
           <w:szCs w:val="20"/>
           <w:rtl w:val="0"/>
@@ -19927,6 +20140,7 @@
         <w:rPr>
           <w:rFonts w:ascii="Calibri" w:cs="Calibri" w:eastAsia="Calibri" w:hAnsi="Calibri"/>
           <w:i w:val="1"/>
+          <w:iCs w:val="1"/>
           <w:sz w:val="20"/>
           <w:szCs w:val="20"/>
           <w:rtl w:val="0"/>
@@ -20606,6 +20820,7 @@
         <w:rPr>
           <w:rFonts w:ascii="Calibri" w:cs="Calibri" w:eastAsia="Calibri" w:hAnsi="Calibri"/>
           <w:b w:val="1"/>
+          <w:bCs w:val="1"/>
           <w:sz w:val="20"/>
           <w:szCs w:val="20"/>
           <w:rtl w:val="0"/>
@@ -21256,6 +21471,7 @@
         <w:rPr>
           <w:rFonts w:ascii="Calibri" w:cs="Calibri" w:eastAsia="Calibri" w:hAnsi="Calibri"/>
           <w:b w:val="1"/>
+          <w:bCs w:val="1"/>
           <w:sz w:val="20"/>
           <w:szCs w:val="20"/>
           <w:rtl w:val="0"/>
@@ -21911,6 +22127,7 @@
         <w:rPr>
           <w:rFonts w:ascii="Calibri" w:cs="Calibri" w:eastAsia="Calibri" w:hAnsi="Calibri"/>
           <w:b w:val="1"/>
+          <w:bCs w:val="1"/>
           <w:sz w:val="20"/>
           <w:szCs w:val="20"/>
           <w:rtl w:val="0"/>
@@ -22566,6 +22783,7 @@
         <w:rPr>
           <w:rFonts w:ascii="Calibri" w:cs="Calibri" w:eastAsia="Calibri" w:hAnsi="Calibri"/>
           <w:b w:val="1"/>
+          <w:bCs w:val="1"/>
           <w:sz w:val="20"/>
           <w:szCs w:val="20"/>
           <w:rtl w:val="0"/>
@@ -23413,6 +23631,7 @@
         <w:rPr>
           <w:rFonts w:ascii="Calibri" w:cs="Calibri" w:eastAsia="Calibri" w:hAnsi="Calibri"/>
           <w:b w:val="1"/>
+          <w:bCs w:val="1"/>
           <w:sz w:val="20"/>
           <w:szCs w:val="20"/>
         </w:rPr>
@@ -23436,6 +23655,7 @@
         <w:rPr>
           <w:rFonts w:ascii="Calibri" w:cs="Calibri" w:eastAsia="Calibri" w:hAnsi="Calibri"/>
           <w:b w:val="1"/>
+          <w:bCs w:val="1"/>
           <w:sz w:val="20"/>
           <w:szCs w:val="20"/>
           <w:rtl w:val="0"/>
@@ -24215,6 +24435,7 @@
         <w:rPr>
           <w:rFonts w:ascii="Calibri" w:cs="Calibri" w:eastAsia="Calibri" w:hAnsi="Calibri"/>
           <w:b w:val="1"/>
+          <w:bCs w:val="1"/>
           <w:sz w:val="20"/>
           <w:szCs w:val="20"/>
           <w:rtl w:val="0"/>
@@ -25052,6 +25273,7 @@
         <w:rPr>
           <w:rFonts w:ascii="Calibri" w:cs="Calibri" w:eastAsia="Calibri" w:hAnsi="Calibri"/>
           <w:b w:val="1"/>
+          <w:bCs w:val="1"/>
           <w:sz w:val="20"/>
           <w:szCs w:val="20"/>
           <w:rtl w:val="0"/>
@@ -25838,6 +26060,7 @@
         <w:rPr>
           <w:rFonts w:ascii="Calibri" w:cs="Calibri" w:eastAsia="Calibri" w:hAnsi="Calibri"/>
           <w:b w:val="1"/>
+          <w:bCs w:val="1"/>
           <w:sz w:val="20"/>
           <w:szCs w:val="20"/>
           <w:rtl w:val="0"/>
@@ -25908,6 +26131,7 @@
         <w:rPr>
           <w:rFonts w:ascii="Calibri" w:cs="Calibri" w:eastAsia="Calibri" w:hAnsi="Calibri"/>
           <w:i w:val="1"/>
+          <w:iCs w:val="1"/>
           <w:color w:val="000000"/>
           <w:sz w:val="20"/>
           <w:szCs w:val="20"/>
@@ -25929,6 +26153,7 @@
         <w:rPr>
           <w:rFonts w:ascii="Calibri" w:cs="Calibri" w:eastAsia="Calibri" w:hAnsi="Calibri"/>
           <w:b w:val="1"/>
+          <w:bCs w:val="1"/>
           <w:color w:val="000000"/>
           <w:sz w:val="20"/>
           <w:szCs w:val="20"/>
@@ -26038,6 +26263,7 @@
         <w:rPr>
           <w:rFonts w:ascii="Calibri" w:cs="Calibri" w:eastAsia="Calibri" w:hAnsi="Calibri"/>
           <w:b w:val="1"/>
+          <w:bCs w:val="1"/>
           <w:sz w:val="20"/>
           <w:szCs w:val="20"/>
           <w:rtl w:val="0"/>
@@ -26173,6 +26399,7 @@
         <w:rPr>
           <w:rFonts w:ascii="Calibri" w:cs="Calibri" w:eastAsia="Calibri" w:hAnsi="Calibri"/>
           <w:i w:val="1"/>
+          <w:iCs w:val="1"/>
           <w:color w:val="000000"/>
           <w:sz w:val="20"/>
           <w:szCs w:val="20"/>
@@ -26194,6 +26421,7 @@
         <w:rPr>
           <w:rFonts w:ascii="Calibri" w:cs="Calibri" w:eastAsia="Calibri" w:hAnsi="Calibri"/>
           <w:i w:val="1"/>
+          <w:iCs w:val="1"/>
           <w:color w:val="000000"/>
           <w:sz w:val="20"/>
           <w:szCs w:val="20"/>
@@ -26225,6 +26453,7 @@
         <w:rPr>
           <w:rFonts w:ascii="Calibri" w:cs="Calibri" w:eastAsia="Calibri" w:hAnsi="Calibri"/>
           <w:b w:val="1"/>
+          <w:bCs w:val="1"/>
           <w:sz w:val="20"/>
           <w:szCs w:val="20"/>
           <w:rtl w:val="0"/>
@@ -26345,6 +26574,7 @@
         <w:rPr>
           <w:rFonts w:ascii="Calibri" w:cs="Calibri" w:eastAsia="Calibri" w:hAnsi="Calibri"/>
           <w:b w:val="1"/>
+          <w:bCs w:val="1"/>
           <w:sz w:val="20"/>
           <w:szCs w:val="20"/>
           <w:rtl w:val="0"/>
@@ -26354,6 +26584,7 @@
       <w:r>
         <w:rPr>
           <w:b w:val="1"/>
+          <w:bCs w:val="1"/>
           <w:sz w:val="20"/>
           <w:szCs w:val="20"/>
           <w:rtl w:val="0"/>
@@ -26364,6 +26595,7 @@
         <w:rPr>
           <w:rFonts w:ascii="Calibri" w:cs="Calibri" w:eastAsia="Calibri" w:hAnsi="Calibri"/>
           <w:b w:val="1"/>
+          <w:bCs w:val="1"/>
           <w:sz w:val="20"/>
           <w:szCs w:val="20"/>
           <w:rtl w:val="0"/>
@@ -26373,6 +26605,7 @@
       <w:r>
         <w:rPr>
           <w:b w:val="1"/>
+          <w:bCs w:val="1"/>
           <w:sz w:val="20"/>
           <w:szCs w:val="20"/>
           <w:rtl w:val="0"/>
@@ -26383,6 +26616,7 @@
         <w:rPr>
           <w:rFonts w:ascii="Calibri" w:cs="Calibri" w:eastAsia="Calibri" w:hAnsi="Calibri"/>
           <w:b w:val="1"/>
+          <w:bCs w:val="1"/>
           <w:sz w:val="20"/>
           <w:szCs w:val="20"/>
           <w:rtl w:val="0"/>
@@ -26453,6 +26687,7 @@
         <w:rPr>
           <w:rFonts w:ascii="Calibri" w:cs="Calibri" w:eastAsia="Calibri" w:hAnsi="Calibri"/>
           <w:b w:val="1"/>
+          <w:bCs w:val="1"/>
           <w:sz w:val="20"/>
           <w:szCs w:val="20"/>
           <w:rtl w:val="0"/>
@@ -26462,6 +26697,7 @@
       <w:r>
         <w:rPr>
           <w:b w:val="1"/>
+          <w:bCs w:val="1"/>
           <w:sz w:val="20"/>
           <w:szCs w:val="20"/>
           <w:rtl w:val="0"/>
@@ -26971,6 +27207,7 @@
         <w:rPr>
           <w:rFonts w:ascii="Calibri" w:cs="Calibri" w:eastAsia="Calibri" w:hAnsi="Calibri"/>
           <w:b w:val="1"/>
+          <w:bCs w:val="1"/>
           <w:sz w:val="20"/>
           <w:szCs w:val="20"/>
         </w:rPr>
@@ -26994,6 +27231,7 @@
         <w:rPr>
           <w:rFonts w:ascii="Calibri" w:cs="Calibri" w:eastAsia="Calibri" w:hAnsi="Calibri"/>
           <w:b w:val="1"/>
+          <w:bCs w:val="1"/>
           <w:sz w:val="20"/>
           <w:szCs w:val="20"/>
           <w:rtl w:val="0"/>
@@ -27802,6 +28040,7 @@
         <w:rPr>
           <w:rFonts w:ascii="Calibri" w:cs="Calibri" w:eastAsia="Calibri" w:hAnsi="Calibri"/>
           <w:b w:val="1"/>
+          <w:bCs w:val="1"/>
           <w:sz w:val="20"/>
           <w:szCs w:val="20"/>
           <w:rtl w:val="0"/>
@@ -28503,6 +28742,7 @@
         <w:rPr>
           <w:rFonts w:ascii="Calibri" w:cs="Calibri" w:eastAsia="Calibri" w:hAnsi="Calibri"/>
           <w:b w:val="1"/>
+          <w:bCs w:val="1"/>
           <w:sz w:val="20"/>
           <w:szCs w:val="20"/>
           <w:rtl w:val="0"/>
@@ -29354,6 +29594,7 @@
         <w:rPr>
           <w:rFonts w:ascii="Calibri" w:cs="Calibri" w:eastAsia="Calibri" w:hAnsi="Calibri"/>
           <w:b w:val="1"/>
+          <w:bCs w:val="1"/>
           <w:sz w:val="20"/>
           <w:szCs w:val="20"/>
         </w:rPr>
@@ -29377,6 +29618,7 @@
         <w:rPr>
           <w:rFonts w:ascii="Calibri" w:cs="Calibri" w:eastAsia="Calibri" w:hAnsi="Calibri"/>
           <w:b w:val="1"/>
+          <w:bCs w:val="1"/>
           <w:sz w:val="20"/>
           <w:szCs w:val="20"/>
           <w:rtl w:val="0"/>
@@ -29864,6 +30106,7 @@
         <w:rPr>
           <w:rFonts w:ascii="Calibri" w:cs="Calibri" w:eastAsia="Calibri" w:hAnsi="Calibri"/>
           <w:b w:val="1"/>
+          <w:bCs w:val="1"/>
           <w:sz w:val="20"/>
           <w:szCs w:val="20"/>
           <w:rtl w:val="0"/>
@@ -30207,6 +30450,7 @@
         <w:rPr>
           <w:rFonts w:ascii="Calibri" w:cs="Calibri" w:eastAsia="Calibri" w:hAnsi="Calibri"/>
           <w:i w:val="1"/>
+          <w:iCs w:val="1"/>
           <w:sz w:val="20"/>
           <w:szCs w:val="20"/>
           <w:rtl w:val="0"/>
@@ -30423,6 +30667,7 @@
         <w:rPr>
           <w:rFonts w:ascii="Calibri" w:cs="Calibri" w:eastAsia="Calibri" w:hAnsi="Calibri"/>
           <w:b w:val="1"/>
+          <w:bCs w:val="1"/>
           <w:sz w:val="20"/>
           <w:szCs w:val="20"/>
           <w:rtl w:val="0"/>
@@ -40104,87 +40349,105 @@
       <w:pPr>
         <w:ind w:left="720" w:hanging="360"/>
       </w:pPr>
-      <w:rPr/>
+      <w:rPr>
+        <w:u w:val="none"/>
+      </w:rPr>
     </w:lvl>
     <w:lvl w:ilvl="1">
       <w:start w:val="1"/>
+      <w:numFmt w:val="upperLetter"/>
+      <w:lvlText w:val="%2."/>
+      <w:lvlJc w:val="left"/>
+      <w:pPr>
+        <w:ind w:left="1440" w:hanging="360"/>
+      </w:pPr>
+      <w:rPr>
+        <w:u w:val="none"/>
+      </w:rPr>
+    </w:lvl>
+    <w:lvl w:ilvl="2">
+      <w:start w:val="1"/>
+      <w:numFmt w:val="decimal"/>
+      <w:lvlText w:val="%3."/>
+      <w:lvlJc w:val="left"/>
+      <w:pPr>
+        <w:ind w:left="2160" w:hanging="360"/>
+      </w:pPr>
+      <w:rPr>
+        <w:u w:val="none"/>
+      </w:rPr>
+    </w:lvl>
+    <w:lvl w:ilvl="3">
+      <w:start w:val="1"/>
       <w:numFmt w:val="lowerLetter"/>
-      <w:lvlText w:val="%2."/>
-      <w:lvlJc w:val="left"/>
-      <w:pPr>
-        <w:ind w:left="1440" w:hanging="360"/>
-      </w:pPr>
-      <w:rPr/>
-    </w:lvl>
-    <w:lvl w:ilvl="2">
+      <w:lvlText w:val="%4)"/>
+      <w:lvlJc w:val="left"/>
+      <w:pPr>
+        <w:ind w:left="2880" w:hanging="360"/>
+      </w:pPr>
+      <w:rPr>
+        <w:u w:val="none"/>
+      </w:rPr>
+    </w:lvl>
+    <w:lvl w:ilvl="4">
+      <w:start w:val="1"/>
+      <w:numFmt w:val="decimal"/>
+      <w:lvlText w:val="(%5)"/>
+      <w:lvlJc w:val="left"/>
+      <w:pPr>
+        <w:ind w:left="3600" w:hanging="360"/>
+      </w:pPr>
+      <w:rPr>
+        <w:u w:val="none"/>
+      </w:rPr>
+    </w:lvl>
+    <w:lvl w:ilvl="5">
+      <w:start w:val="1"/>
+      <w:numFmt w:val="lowerLetter"/>
+      <w:lvlText w:val="(%6)"/>
+      <w:lvlJc w:val="left"/>
+      <w:pPr>
+        <w:ind w:left="4320" w:hanging="360"/>
+      </w:pPr>
+      <w:rPr>
+        <w:u w:val="none"/>
+      </w:rPr>
+    </w:lvl>
+    <w:lvl w:ilvl="6">
       <w:start w:val="1"/>
       <w:numFmt w:val="lowerRoman"/>
-      <w:lvlText w:val="%3."/>
+      <w:lvlText w:val="(%7)"/>
       <w:lvlJc w:val="right"/>
       <w:pPr>
-        <w:ind w:left="2160" w:hanging="180"/>
-      </w:pPr>
-      <w:rPr/>
-    </w:lvl>
-    <w:lvl w:ilvl="3">
-      <w:start w:val="1"/>
-      <w:numFmt w:val="decimal"/>
-      <w:lvlText w:val="%4."/>
-      <w:lvlJc w:val="left"/>
-      <w:pPr>
-        <w:ind w:left="2880" w:hanging="360"/>
-      </w:pPr>
-      <w:rPr/>
-    </w:lvl>
-    <w:lvl w:ilvl="4">
+        <w:ind w:left="5040" w:hanging="360"/>
+      </w:pPr>
+      <w:rPr>
+        <w:u w:val="none"/>
+      </w:rPr>
+    </w:lvl>
+    <w:lvl w:ilvl="7">
       <w:start w:val="1"/>
       <w:numFmt w:val="lowerLetter"/>
-      <w:lvlText w:val="%5."/>
-      <w:lvlJc w:val="left"/>
-      <w:pPr>
-        <w:ind w:left="3600" w:hanging="360"/>
-      </w:pPr>
-      <w:rPr/>
-    </w:lvl>
-    <w:lvl w:ilvl="5">
+      <w:lvlText w:val="(%8)"/>
+      <w:lvlJc w:val="left"/>
+      <w:pPr>
+        <w:ind w:left="5760" w:hanging="360"/>
+      </w:pPr>
+      <w:rPr>
+        <w:u w:val="none"/>
+      </w:rPr>
+    </w:lvl>
+    <w:lvl w:ilvl="8">
       <w:start w:val="1"/>
       <w:numFmt w:val="lowerRoman"/>
-      <w:lvlText w:val="%6."/>
+      <w:lvlText w:val="(%9)"/>
       <w:lvlJc w:val="right"/>
       <w:pPr>
-        <w:ind w:left="4320" w:hanging="180"/>
-      </w:pPr>
-      <w:rPr/>
-    </w:lvl>
-    <w:lvl w:ilvl="6">
-      <w:start w:val="1"/>
-      <w:numFmt w:val="decimal"/>
-      <w:lvlText w:val="%7."/>
-      <w:lvlJc w:val="left"/>
-      <w:pPr>
-        <w:ind w:left="5040" w:hanging="360"/>
-      </w:pPr>
-      <w:rPr/>
-    </w:lvl>
-    <w:lvl w:ilvl="7">
-      <w:start w:val="1"/>
-      <w:numFmt w:val="lowerLetter"/>
-      <w:lvlText w:val="%8."/>
-      <w:lvlJc w:val="left"/>
-      <w:pPr>
-        <w:ind w:left="5760" w:hanging="360"/>
-      </w:pPr>
-      <w:rPr/>
-    </w:lvl>
-    <w:lvl w:ilvl="8">
-      <w:start w:val="1"/>
-      <w:numFmt w:val="lowerRoman"/>
-      <w:lvlText w:val="%9."/>
-      <w:lvlJc w:val="right"/>
-      <w:pPr>
-        <w:ind w:left="6480" w:hanging="180"/>
-      </w:pPr>
-      <w:rPr/>
+        <w:ind w:left="6480" w:hanging="360"/>
+      </w:pPr>
+      <w:rPr>
+        <w:u w:val="none"/>
+      </w:rPr>
     </w:lvl>
   </w:abstractNum>
   <w:num w:numId="1">
@@ -40527,6 +40790,7 @@
     </w:pPr>
     <w:rPr>
       <w:b w:val="1"/>
+      <w:bCs w:val="1"/>
       <w:sz w:val="36"/>
       <w:szCs w:val="36"/>
     </w:rPr>
@@ -40542,6 +40806,7 @@
     </w:pPr>
     <w:rPr>
       <w:b w:val="1"/>
+      <w:bCs w:val="1"/>
       <w:sz w:val="28"/>
       <w:szCs w:val="28"/>
     </w:rPr>
@@ -40557,6 +40822,7 @@
     </w:pPr>
     <w:rPr>
       <w:b w:val="1"/>
+      <w:bCs w:val="1"/>
       <w:sz w:val="24"/>
       <w:szCs w:val="24"/>
     </w:rPr>
@@ -40572,6 +40838,7 @@
     </w:pPr>
     <w:rPr>
       <w:b w:val="1"/>
+      <w:bCs w:val="1"/>
     </w:rPr>
   </w:style>
   <w:style w:type="paragraph" w:styleId="Heading6">
@@ -40585,6 +40852,7 @@
     </w:pPr>
     <w:rPr>
       <w:b w:val="1"/>
+      <w:bCs w:val="1"/>
       <w:sz w:val="20"/>
       <w:szCs w:val="20"/>
     </w:rPr>
@@ -40881,6 +41149,7 @@
     <w:rPr>
       <w:rFonts w:ascii="Georgia" w:cs="Georgia" w:eastAsia="Georgia" w:hAnsi="Georgia"/>
       <w:i w:val="1"/>
+      <w:iCs w:val="1"/>
       <w:color w:val="666666"/>
       <w:sz w:val="48"/>
       <w:szCs w:val="48"/>
@@ -41186,7 +41455,7 @@
 
 <file path=customXML/item1.xml><?xml version="1.0" encoding="utf-8"?>
 <go:gDocsCustomXmlDataStorage xmlns:go="http://customooxmlschemas.google.com/" xmlns:r="http://schemas.openxmlformats.org/officeDocument/2006/relationships" uri="GoogleDocsCustomDataVersion2">
-  <go:docsCustomData xmlns:go="http://customooxmlschemas.google.com/" roundtripDataSignature="AMtx7miRZzmj8OxZnjon0XTrb5gxCWxUTQ==">CgMxLjAyDmguYTY1amd6Zm4wcnpkOABqIwoUc3VnZ2VzdC5keDh4anphY2k1ODMSC0xpemFyZCBLaW5naiMKFHN1Z2dlc3QucmhpcWE0M3RpaDhnEgtMaXphcmQgS2luZ3IhMUV4ZVVLZk5IZXNEM3AyWGFmZkhDNmd4eEJOUjAzcHhj</go:docsCustomData>
+  <go:docsCustomData xmlns:go="http://customooxmlschemas.google.com/" roundtripDataSignature="AMtx7mje7toQ7TcWOMGeIhZNy+C73maEng==">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</go:docsCustomData>
 </go:gDocsCustomXmlDataStorage>
 </file>
 

</xml_diff>